<commit_message>
fix: consistent Arial font on all runs
</commit_message>
<xml_diff>
--- a/cleaning_report.docx
+++ b/cleaning_report.docx
@@ -4,35 +4,57 @@
   <w:body>
     <w:p>
       <w:pPr>
-        <w:spacing w:before="320" w:after="120"/>
+        <w:spacing w:before="400" w:after="120"/>
       </w:pPr>
       <w:r>
         <w:rPr>
+          <w:rFonts w:ascii="Arial" w:hAnsi="Arial" w:cs="Arial" w:eastAsia="Arial"/>
           <w:b/>
-          <w:sz w:val="36"/>
+          <w:i w:val="0"/>
+          <w:sz w:val="40"/>
         </w:rPr>
         <w:t>Description 前置清洗方案</w:t>
       </w:r>
     </w:p>
     <w:p>
+      <w:pPr>
+        <w:spacing w:before="0" w:after="120"/>
+      </w:pPr>
       <w:r>
+        <w:rPr>
+          <w:rFonts w:ascii="Arial" w:hAnsi="Arial" w:cs="Arial" w:eastAsia="Arial"/>
+          <w:b w:val="0"/>
+          <w:i w:val="0"/>
+          <w:sz w:val="21"/>
+        </w:rPr>
         <w:t>项目报告 · 2026-03-31 · Reranker / Title Optimization 团队</w:t>
       </w:r>
     </w:p>
     <w:p>
       <w:pPr>
-        <w:spacing w:before="320" w:after="120"/>
+        <w:spacing w:before="360" w:after="120"/>
       </w:pPr>
       <w:r>
         <w:rPr>
+          <w:rFonts w:ascii="Arial" w:hAnsi="Arial" w:cs="Arial" w:eastAsia="Arial"/>
           <w:b/>
-          <w:sz w:val="28"/>
+          <w:i w:val="0"/>
+          <w:sz w:val="30"/>
         </w:rPr>
         <w:t>1. 动机</w:t>
       </w:r>
     </w:p>
     <w:p>
+      <w:pPr>
+        <w:spacing w:before="0" w:after="120"/>
+      </w:pPr>
       <w:r>
+        <w:rPr>
+          <w:rFonts w:ascii="Arial" w:hAnsi="Arial" w:cs="Arial" w:eastAsia="Arial"/>
+          <w:b w:val="0"/>
+          <w:i w:val="0"/>
+          <w:sz w:val="21"/>
+        </w:rPr>
         <w:t>Shopee 电商商品的description字段是 KSP 卖点生成（P0）和标题优化（P4）的核心输入。但该字段普遍混杂大量运营性噪音：</w:t>
       </w:r>
     </w:p>
@@ -53,9 +75,15 @@
             <w:tcW w:type="dxa" w:w="2880"/>
           </w:tcPr>
           <w:p>
+            <w:pPr>
+              <w:spacing w:after="40"/>
+            </w:pPr>
             <w:r>
               <w:rPr>
+                <w:rFonts w:ascii="Arial" w:hAnsi="Arial" w:cs="Arial" w:eastAsia="Arial"/>
                 <w:b/>
+                <w:i w:val="0"/>
+                <w:sz w:val="20"/>
               </w:rPr>
               <w:t>噪音类型</w:t>
             </w:r>
@@ -66,9 +94,15 @@
             <w:tcW w:type="dxa" w:w="2880"/>
           </w:tcPr>
           <w:p>
+            <w:pPr>
+              <w:spacing w:after="40"/>
+            </w:pPr>
             <w:r>
               <w:rPr>
+                <w:rFonts w:ascii="Arial" w:hAnsi="Arial" w:cs="Arial" w:eastAsia="Arial"/>
                 <w:b/>
+                <w:i w:val="0"/>
+                <w:sz w:val="20"/>
               </w:rPr>
               <w:t>典型内容</w:t>
             </w:r>
@@ -79,9 +113,15 @@
             <w:tcW w:type="dxa" w:w="2880"/>
           </w:tcPr>
           <w:p>
+            <w:pPr>
+              <w:spacing w:after="40"/>
+            </w:pPr>
             <w:r>
               <w:rPr>
+                <w:rFonts w:ascii="Arial" w:hAnsi="Arial" w:cs="Arial" w:eastAsia="Arial"/>
                 <w:b/>
+                <w:i w:val="0"/>
+                <w:sz w:val="20"/>
               </w:rPr>
               <w:t>对下游的影响</w:t>
             </w:r>
@@ -94,7 +134,16 @@
             <w:tcW w:type="dxa" w:w="2880"/>
           </w:tcPr>
           <w:p>
+            <w:pPr>
+              <w:spacing w:after="40"/>
+            </w:pPr>
             <w:r>
+              <w:rPr>
+                <w:rFonts w:ascii="Arial" w:hAnsi="Arial" w:cs="Arial" w:eastAsia="Arial"/>
+                <w:b w:val="0"/>
+                <w:i w:val="0"/>
+                <w:sz w:val="20"/>
+              </w:rPr>
               <w:t>物流发货</w:t>
             </w:r>
           </w:p>
@@ -104,7 +153,16 @@
             <w:tcW w:type="dxa" w:w="2880"/>
           </w:tcPr>
           <w:p>
+            <w:pPr>
+              <w:spacing w:after="40"/>
+            </w:pPr>
             <w:r>
+              <w:rPr>
+                <w:rFonts w:ascii="Arial" w:hAnsi="Arial" w:cs="Arial" w:eastAsia="Arial"/>
+                <w:b w:val="0"/>
+                <w:i w:val="0"/>
+                <w:sz w:val="20"/>
+              </w:rPr>
               <w:t>Gratis ongkir · 出貨時間 5-7 天 · COD</w:t>
             </w:r>
           </w:p>
@@ -114,7 +172,16 @@
             <w:tcW w:type="dxa" w:w="2880"/>
           </w:tcPr>
           <w:p>
+            <w:pPr>
+              <w:spacing w:after="40"/>
+            </w:pPr>
             <w:r>
+              <w:rPr>
+                <w:rFonts w:ascii="Arial" w:hAnsi="Arial" w:cs="Arial" w:eastAsia="Arial"/>
+                <w:b w:val="0"/>
+                <w:i w:val="0"/>
+                <w:sz w:val="20"/>
+              </w:rPr>
               <w:t>KSP 提取出"运费""发货"等词</w:t>
             </w:r>
           </w:p>
@@ -126,7 +193,16 @@
             <w:tcW w:type="dxa" w:w="2880"/>
           </w:tcPr>
           <w:p>
+            <w:pPr>
+              <w:spacing w:after="40"/>
+            </w:pPr>
             <w:r>
+              <w:rPr>
+                <w:rFonts w:ascii="Arial" w:hAnsi="Arial" w:cs="Arial" w:eastAsia="Arial"/>
+                <w:b w:val="0"/>
+                <w:i w:val="0"/>
+                <w:sz w:val="20"/>
+              </w:rPr>
               <w:t>退换货政策</w:t>
             </w:r>
           </w:p>
@@ -136,7 +212,16 @@
             <w:tcW w:type="dxa" w:w="2880"/>
           </w:tcPr>
           <w:p>
+            <w:pPr>
+              <w:spacing w:after="40"/>
+            </w:pPr>
             <w:r>
+              <w:rPr>
+                <w:rFonts w:ascii="Arial" w:hAnsi="Arial" w:cs="Arial" w:eastAsia="Arial"/>
+                <w:b w:val="0"/>
+                <w:i w:val="0"/>
+                <w:sz w:val="20"/>
+              </w:rPr>
               <w:t>退貨須知 · 鑑賞期非試用期 · video unboxing</w:t>
             </w:r>
           </w:p>
@@ -146,7 +231,16 @@
             <w:tcW w:type="dxa" w:w="2880"/>
           </w:tcPr>
           <w:p>
+            <w:pPr>
+              <w:spacing w:after="40"/>
+            </w:pPr>
             <w:r>
+              <w:rPr>
+                <w:rFonts w:ascii="Arial" w:hAnsi="Arial" w:cs="Arial" w:eastAsia="Arial"/>
+                <w:b w:val="0"/>
+                <w:i w:val="0"/>
+                <w:sz w:val="20"/>
+              </w:rPr>
               <w:t>标题中出现退货条款</w:t>
             </w:r>
           </w:p>
@@ -158,7 +252,16 @@
             <w:tcW w:type="dxa" w:w="2880"/>
           </w:tcPr>
           <w:p>
+            <w:pPr>
+              <w:spacing w:after="40"/>
+            </w:pPr>
             <w:r>
+              <w:rPr>
+                <w:rFonts w:ascii="Arial" w:hAnsi="Arial" w:cs="Arial" w:eastAsia="Arial"/>
+                <w:b w:val="0"/>
+                <w:i w:val="0"/>
+                <w:sz w:val="20"/>
+              </w:rPr>
               <w:t>客服联系</w:t>
             </w:r>
           </w:p>
@@ -168,7 +271,16 @@
             <w:tcW w:type="dxa" w:w="2880"/>
           </w:tcPr>
           <w:p>
+            <w:pPr>
+              <w:spacing w:after="40"/>
+            </w:pPr>
             <w:r>
+              <w:rPr>
+                <w:rFonts w:ascii="Arial" w:hAnsi="Arial" w:cs="Arial" w:eastAsia="Arial"/>
+                <w:b w:val="0"/>
+                <w:i w:val="0"/>
+                <w:sz w:val="20"/>
+              </w:rPr>
               <w:t>whatsapp · 聊聊 · hubungi kami</w:t>
             </w:r>
           </w:p>
@@ -178,7 +290,16 @@
             <w:tcW w:type="dxa" w:w="2880"/>
           </w:tcPr>
           <w:p>
+            <w:pPr>
+              <w:spacing w:after="40"/>
+            </w:pPr>
             <w:r>
+              <w:rPr>
+                <w:rFonts w:ascii="Arial" w:hAnsi="Arial" w:cs="Arial" w:eastAsia="Arial"/>
+                <w:b w:val="0"/>
+                <w:i w:val="0"/>
+                <w:sz w:val="20"/>
+              </w:rPr>
               <w:t>KSP 含电话/聊天信息</w:t>
             </w:r>
           </w:p>
@@ -190,7 +311,16 @@
             <w:tcW w:type="dxa" w:w="2880"/>
           </w:tcPr>
           <w:p>
+            <w:pPr>
+              <w:spacing w:after="40"/>
+            </w:pPr>
             <w:r>
+              <w:rPr>
+                <w:rFonts w:ascii="Arial" w:hAnsi="Arial" w:cs="Arial" w:eastAsia="Arial"/>
+                <w:b w:val="0"/>
+                <w:i w:val="0"/>
+                <w:sz w:val="20"/>
+              </w:rPr>
               <w:t>店铺介绍</w:t>
             </w:r>
           </w:p>
@@ -200,7 +330,16 @@
             <w:tcW w:type="dxa" w:w="2880"/>
           </w:tcPr>
           <w:p>
+            <w:pPr>
+              <w:spacing w:after="40"/>
+            </w:pPr>
             <w:r>
+              <w:rPr>
+                <w:rFonts w:ascii="Arial" w:hAnsi="Arial" w:cs="Arial" w:eastAsia="Arial"/>
+                <w:b w:val="0"/>
+                <w:i w:val="0"/>
+                <w:sz w:val="20"/>
+              </w:rPr>
               <w:t>歡迎光臨 · tentang toko · welcome</w:t>
             </w:r>
           </w:p>
@@ -210,7 +349,16 @@
             <w:tcW w:type="dxa" w:w="2880"/>
           </w:tcPr>
           <w:p>
+            <w:pPr>
+              <w:spacing w:after="40"/>
+            </w:pPr>
             <w:r>
+              <w:rPr>
+                <w:rFonts w:ascii="Arial" w:hAnsi="Arial" w:cs="Arial" w:eastAsia="Arial"/>
+                <w:b w:val="0"/>
+                <w:i w:val="0"/>
+                <w:sz w:val="20"/>
+              </w:rPr>
               <w:t>卖点被店铺宣传稀释</w:t>
             </w:r>
           </w:p>
@@ -222,7 +370,16 @@
             <w:tcW w:type="dxa" w:w="2880"/>
           </w:tcPr>
           <w:p>
+            <w:pPr>
+              <w:spacing w:after="40"/>
+            </w:pPr>
             <w:r>
+              <w:rPr>
+                <w:rFonts w:ascii="Arial" w:hAnsi="Arial" w:cs="Arial" w:eastAsia="Arial"/>
+                <w:b w:val="0"/>
+                <w:i w:val="0"/>
+                <w:sz w:val="20"/>
+              </w:rPr>
               <w:t>Emoji / URL / 电话</w:t>
             </w:r>
           </w:p>
@@ -232,7 +389,16 @@
             <w:tcW w:type="dxa" w:w="2880"/>
           </w:tcPr>
           <w:p>
+            <w:pPr>
+              <w:spacing w:after="40"/>
+            </w:pPr>
             <w:r>
+              <w:rPr>
+                <w:rFonts w:ascii="Arial" w:hAnsi="Arial" w:cs="Arial" w:eastAsia="Arial"/>
+                <w:b w:val="0"/>
+                <w:i w:val="0"/>
+                <w:sz w:val="20"/>
+              </w:rPr>
               <w:t>💎📦⚠️ · shopee.tw/... · +6016-661-6081</w:t>
             </w:r>
           </w:p>
@@ -242,7 +408,16 @@
             <w:tcW w:type="dxa" w:w="2880"/>
           </w:tcPr>
           <w:p>
+            <w:pPr>
+              <w:spacing w:after="40"/>
+            </w:pPr>
             <w:r>
+              <w:rPr>
+                <w:rFonts w:ascii="Arial" w:hAnsi="Arial" w:cs="Arial" w:eastAsia="Arial"/>
+                <w:b w:val="0"/>
+                <w:i w:val="0"/>
+                <w:sz w:val="20"/>
+              </w:rPr>
               <w:t>噪音符号进入卖点</w:t>
             </w:r>
           </w:p>
@@ -251,38 +426,59 @@
     </w:tbl>
     <w:p/>
     <w:p>
+      <w:pPr>
+        <w:spacing w:before="0" w:after="120"/>
+      </w:pPr>
       <w:r>
+        <w:rPr>
+          <w:rFonts w:ascii="Arial" w:hAnsi="Arial" w:cs="Arial" w:eastAsia="Arial"/>
+          <w:b w:val="0"/>
+          <w:i w:val="0"/>
+          <w:sz w:val="21"/>
+        </w:rPr>
         <w:t>对 29 万条已有 KSP 输出的静态分析显示：</w:t>
       </w:r>
     </w:p>
     <w:p>
       <w:pPr>
+        <w:spacing w:before="80" w:after="160"/>
         <w:ind w:left="576"/>
       </w:pPr>
       <w:r>
         <w:rPr>
+          <w:rFonts w:ascii="Arial" w:hAnsi="Arial" w:cs="Arial" w:eastAsia="Arial"/>
+          <w:b w:val="0"/>
+          <w:i w:val="0"/>
           <w:color w:val="374151"/>
+          <w:sz w:val="21"/>
         </w:rPr>
         <w:t>15.6%含噪音的商品中，KSP 的卖点词来自被清洗掉的噪音文本——即物流/客服/促销内容直接"泄漏"进了 KSP 卖点。</w:t>
       </w:r>
     </w:p>
     <w:p>
       <w:pPr>
-        <w:spacing w:before="320" w:after="120"/>
+        <w:spacing w:before="360" w:after="120"/>
       </w:pPr>
       <w:r>
         <w:rPr>
+          <w:rFonts w:ascii="Arial" w:hAnsi="Arial" w:cs="Arial" w:eastAsia="Arial"/>
           <w:b/>
-          <w:sz w:val="28"/>
+          <w:i w:val="0"/>
+          <w:sz w:val="30"/>
         </w:rPr>
         <w:t>2. 方案设计</w:t>
       </w:r>
     </w:p>
     <w:p>
+      <w:pPr>
+        <w:spacing w:before="240" w:after="120"/>
+      </w:pPr>
       <w:r>
         <w:rPr>
+          <w:rFonts w:ascii="Arial" w:hAnsi="Arial" w:cs="Arial" w:eastAsia="Arial"/>
           <w:b/>
-          <w:sz w:val="24"/>
+          <w:i w:val="0"/>
+          <w:sz w:val="25"/>
         </w:rPr>
         <w:t>2.1 设计原则</w:t>
       </w:r>
@@ -290,35 +486,57 @@
     <w:p>
       <w:pPr>
         <w:pStyle w:val="ListBullet"/>
+        <w:spacing w:after="60"/>
       </w:pPr>
       <w:r>
+        <w:rPr>
+          <w:rFonts w:ascii="Arial" w:hAnsi="Arial" w:cs="Arial" w:eastAsia="Arial"/>
+          <w:b w:val="0"/>
+          <w:i w:val="0"/>
+          <w:sz w:val="21"/>
+        </w:rPr>
         <w:t>保守优先——只删除高置信度噪音，不确定内容一律保留，避免误删产品事实</w:t>
       </w:r>
     </w:p>
     <w:p>
       <w:pPr>
         <w:pStyle w:val="ListBullet"/>
+        <w:spacing w:after="60"/>
       </w:pPr>
       <w:r>
+        <w:rPr>
+          <w:rFonts w:ascii="Arial" w:hAnsi="Arial" w:cs="Arial" w:eastAsia="Arial"/>
+          <w:b w:val="0"/>
+          <w:i w:val="0"/>
+          <w:sz w:val="21"/>
+        </w:rPr>
         <w:t>保护规则优先于删除规则——含规格单位、型号、认证词、产地词的行，无论是否同时命中噪音关键词，强制保留</w:t>
       </w:r>
     </w:p>
     <w:p>
+      <w:pPr>
+        <w:spacing w:before="240" w:after="120"/>
+      </w:pPr>
       <w:r>
         <w:rPr>
+          <w:rFonts w:ascii="Arial" w:hAnsi="Arial" w:cs="Arial" w:eastAsia="Arial"/>
           <w:b/>
-          <w:sz w:val="24"/>
+          <w:i w:val="0"/>
+          <w:sz w:val="25"/>
         </w:rPr>
         <w:t>2.2 两阶段管线</w:t>
       </w:r>
     </w:p>
     <w:p>
       <w:pPr>
+        <w:spacing w:before="80" w:after="160"/>
         <w:ind w:left="432"/>
       </w:pPr>
       <w:r>
         <w:rPr>
-          <w:rFonts w:ascii="Courier New" w:hAnsi="Courier New"/>
+          <w:rFonts w:ascii="Courier New" w:hAnsi="Courier New" w:cs="Courier New" w:eastAsia="Courier New"/>
+          <w:b w:val="0"/>
+          <w:i w:val="0"/>
           <w:sz w:val="18"/>
         </w:rPr>
         <w:br/>
@@ -333,21 +551,29 @@
       </w:r>
     </w:p>
     <w:p>
+      <w:pPr>
+        <w:spacing w:before="240" w:after="120"/>
+      </w:pPr>
       <w:r>
         <w:rPr>
+          <w:rFonts w:ascii="Arial" w:hAnsi="Arial" w:cs="Arial" w:eastAsia="Arial"/>
           <w:b/>
-          <w:sz w:val="24"/>
+          <w:i w:val="0"/>
+          <w:sz w:val="25"/>
         </w:rPr>
         <w:t>2.3 行级过滤逻辑</w:t>
       </w:r>
     </w:p>
     <w:p>
       <w:pPr>
+        <w:spacing w:before="80" w:after="160"/>
         <w:ind w:left="432"/>
       </w:pPr>
       <w:r>
         <w:rPr>
-          <w:rFonts w:ascii="Courier New" w:hAnsi="Courier New"/>
+          <w:rFonts w:ascii="Courier New" w:hAnsi="Courier New" w:cs="Courier New" w:eastAsia="Courier New"/>
+          <w:b w:val="0"/>
+          <w:i w:val="0"/>
           <w:sz w:val="18"/>
         </w:rPr>
         <w:br/>
@@ -364,21 +590,44 @@
       </w:r>
     </w:p>
     <w:p>
+      <w:pPr>
+        <w:spacing w:before="0" w:after="120"/>
+      </w:pPr>
       <w:r>
+        <w:rPr>
+          <w:rFonts w:ascii="Arial" w:hAnsi="Arial" w:cs="Arial" w:eastAsia="Arial"/>
+          <w:b w:val="0"/>
+          <w:i w:val="0"/>
+          <w:sz w:val="21"/>
+        </w:rPr>
         <w:t>长度阈值（100字符）的作用：原始 description 中有 22% 只有单换行，整段内容被视为一行。当产品信息和物流信息混在一行时，超过 100 字符的行不删，防止误删产品事实。</w:t>
       </w:r>
     </w:p>
     <w:p>
+      <w:pPr>
+        <w:spacing w:before="240" w:after="120"/>
+      </w:pPr>
       <w:r>
         <w:rPr>
+          <w:rFonts w:ascii="Arial" w:hAnsi="Arial" w:cs="Arial" w:eastAsia="Arial"/>
           <w:b/>
-          <w:sz w:val="24"/>
+          <w:i w:val="0"/>
+          <w:sz w:val="25"/>
         </w:rPr>
         <w:t>2.4 词库结构（cleaning_keywords.json）</w:t>
       </w:r>
     </w:p>
     <w:p>
+      <w:pPr>
+        <w:spacing w:before="0" w:after="120"/>
+      </w:pPr>
       <w:r>
+        <w:rPr>
+          <w:rFonts w:ascii="Arial" w:hAnsi="Arial" w:cs="Arial" w:eastAsia="Arial"/>
+          <w:b w:val="0"/>
+          <w:i w:val="0"/>
+          <w:sz w:val="21"/>
+        </w:rPr>
         <w:t>所有关键词独立于代码之外，修改词库只改 JSON 文件，无需改代码：</w:t>
       </w:r>
     </w:p>
@@ -399,9 +648,15 @@
             <w:tcW w:type="dxa" w:w="2880"/>
           </w:tcPr>
           <w:p>
+            <w:pPr>
+              <w:spacing w:after="40"/>
+            </w:pPr>
             <w:r>
               <w:rPr>
+                <w:rFonts w:ascii="Arial" w:hAnsi="Arial" w:cs="Arial" w:eastAsia="Arial"/>
                 <w:b/>
+                <w:i w:val="0"/>
+                <w:sz w:val="20"/>
               </w:rPr>
               <w:t>词库</w:t>
             </w:r>
@@ -412,9 +667,15 @@
             <w:tcW w:type="dxa" w:w="2880"/>
           </w:tcPr>
           <w:p>
+            <w:pPr>
+              <w:spacing w:after="40"/>
+            </w:pPr>
             <w:r>
               <w:rPr>
+                <w:rFonts w:ascii="Arial" w:hAnsi="Arial" w:cs="Arial" w:eastAsia="Arial"/>
                 <w:b/>
+                <w:i w:val="0"/>
+                <w:sz w:val="20"/>
               </w:rPr>
               <w:t>规模</w:t>
             </w:r>
@@ -425,9 +686,15 @@
             <w:tcW w:type="dxa" w:w="2880"/>
           </w:tcPr>
           <w:p>
+            <w:pPr>
+              <w:spacing w:after="40"/>
+            </w:pPr>
             <w:r>
               <w:rPr>
+                <w:rFonts w:ascii="Arial" w:hAnsi="Arial" w:cs="Arial" w:eastAsia="Arial"/>
                 <w:b/>
+                <w:i w:val="0"/>
+                <w:sz w:val="20"/>
               </w:rPr>
               <w:t>作用</w:t>
             </w:r>
@@ -440,7 +707,16 @@
             <w:tcW w:type="dxa" w:w="2880"/>
           </w:tcPr>
           <w:p>
+            <w:pPr>
+              <w:spacing w:after="40"/>
+            </w:pPr>
             <w:r>
+              <w:rPr>
+                <w:rFonts w:ascii="Arial" w:hAnsi="Arial" w:cs="Arial" w:eastAsia="Arial"/>
+                <w:b w:val="0"/>
+                <w:i w:val="0"/>
+                <w:sz w:val="20"/>
+              </w:rPr>
               <w:t>噪音关键词（noise）</w:t>
             </w:r>
           </w:p>
@@ -450,7 +726,16 @@
             <w:tcW w:type="dxa" w:w="2880"/>
           </w:tcPr>
           <w:p>
+            <w:pPr>
+              <w:spacing w:after="40"/>
+            </w:pPr>
             <w:r>
+              <w:rPr>
+                <w:rFonts w:ascii="Arial" w:hAnsi="Arial" w:cs="Arial" w:eastAsia="Arial"/>
+                <w:b w:val="0"/>
+                <w:i w:val="0"/>
+                <w:sz w:val="20"/>
+              </w:rPr>
               <w:t>6 类 × 6 语言 = 228 个短语</w:t>
             </w:r>
           </w:p>
@@ -460,7 +745,16 @@
             <w:tcW w:type="dxa" w:w="2880"/>
           </w:tcPr>
           <w:p>
+            <w:pPr>
+              <w:spacing w:after="40"/>
+            </w:pPr>
             <w:r>
+              <w:rPr>
+                <w:rFonts w:ascii="Arial" w:hAnsi="Arial" w:cs="Arial" w:eastAsia="Arial"/>
+                <w:b w:val="0"/>
+                <w:i w:val="0"/>
+                <w:sz w:val="20"/>
+              </w:rPr>
               <w:t>命中 → 删除</w:t>
             </w:r>
           </w:p>
@@ -472,7 +766,16 @@
             <w:tcW w:type="dxa" w:w="2880"/>
           </w:tcPr>
           <w:p>
+            <w:pPr>
+              <w:spacing w:after="40"/>
+            </w:pPr>
             <w:r>
+              <w:rPr>
+                <w:rFonts w:ascii="Arial" w:hAnsi="Arial" w:cs="Arial" w:eastAsia="Arial"/>
+                <w:b w:val="0"/>
+                <w:i w:val="0"/>
+                <w:sz w:val="20"/>
+              </w:rPr>
               <w:t>规格单位（spec_units）</w:t>
             </w:r>
           </w:p>
@@ -482,7 +785,16 @@
             <w:tcW w:type="dxa" w:w="2880"/>
           </w:tcPr>
           <w:p>
+            <w:pPr>
+              <w:spacing w:after="40"/>
+            </w:pPr>
             <w:r>
+              <w:rPr>
+                <w:rFonts w:ascii="Arial" w:hAnsi="Arial" w:cs="Arial" w:eastAsia="Arial"/>
+                <w:b w:val="0"/>
+                <w:i w:val="0"/>
+                <w:sz w:val="20"/>
+              </w:rPr>
               <w:t>65 个单位词</w:t>
             </w:r>
           </w:p>
@@ -492,7 +804,16 @@
             <w:tcW w:type="dxa" w:w="2880"/>
           </w:tcPr>
           <w:p>
+            <w:pPr>
+              <w:spacing w:after="40"/>
+            </w:pPr>
             <w:r>
+              <w:rPr>
+                <w:rFonts w:ascii="Arial" w:hAnsi="Arial" w:cs="Arial" w:eastAsia="Arial"/>
+                <w:b w:val="0"/>
+                <w:i w:val="0"/>
+                <w:sz w:val="20"/>
+              </w:rPr>
               <w:t>含数字+单位 → 强制保留</w:t>
             </w:r>
           </w:p>
@@ -504,7 +825,16 @@
             <w:tcW w:type="dxa" w:w="2880"/>
           </w:tcPr>
           <w:p>
+            <w:pPr>
+              <w:spacing w:after="40"/>
+            </w:pPr>
             <w:r>
+              <w:rPr>
+                <w:rFonts w:ascii="Arial" w:hAnsi="Arial" w:cs="Arial" w:eastAsia="Arial"/>
+                <w:b w:val="0"/>
+                <w:i w:val="0"/>
+                <w:sz w:val="20"/>
+              </w:rPr>
               <w:t>认证词（certifications）</w:t>
             </w:r>
           </w:p>
@@ -514,7 +844,16 @@
             <w:tcW w:type="dxa" w:w="2880"/>
           </w:tcPr>
           <w:p>
+            <w:pPr>
+              <w:spacing w:after="40"/>
+            </w:pPr>
             <w:r>
+              <w:rPr>
+                <w:rFonts w:ascii="Arial" w:hAnsi="Arial" w:cs="Arial" w:eastAsia="Arial"/>
+                <w:b w:val="0"/>
+                <w:i w:val="0"/>
+                <w:sz w:val="20"/>
+              </w:rPr>
               <w:t>8 个</w:t>
             </w:r>
           </w:p>
@@ -524,7 +863,16 @@
             <w:tcW w:type="dxa" w:w="2880"/>
           </w:tcPr>
           <w:p>
+            <w:pPr>
+              <w:spacing w:after="40"/>
+            </w:pPr>
             <w:r>
+              <w:rPr>
+                <w:rFonts w:ascii="Arial" w:hAnsi="Arial" w:cs="Arial" w:eastAsia="Arial"/>
+                <w:b w:val="0"/>
+                <w:i w:val="0"/>
+                <w:sz w:val="20"/>
+              </w:rPr>
               <w:t>Halal / BPOM / FDA… → 保留</w:t>
             </w:r>
           </w:p>
@@ -536,7 +884,16 @@
             <w:tcW w:type="dxa" w:w="2880"/>
           </w:tcPr>
           <w:p>
+            <w:pPr>
+              <w:spacing w:after="40"/>
+            </w:pPr>
             <w:r>
+              <w:rPr>
+                <w:rFonts w:ascii="Arial" w:hAnsi="Arial" w:cs="Arial" w:eastAsia="Arial"/>
+                <w:b w:val="0"/>
+                <w:i w:val="0"/>
+                <w:sz w:val="20"/>
+              </w:rPr>
               <w:t>产地词·拉丁（origin_latin）</w:t>
             </w:r>
           </w:p>
@@ -546,7 +903,16 @@
             <w:tcW w:type="dxa" w:w="2880"/>
           </w:tcPr>
           <w:p>
+            <w:pPr>
+              <w:spacing w:after="40"/>
+            </w:pPr>
             <w:r>
+              <w:rPr>
+                <w:rFonts w:ascii="Arial" w:hAnsi="Arial" w:cs="Arial" w:eastAsia="Arial"/>
+                <w:b w:val="0"/>
+                <w:i w:val="0"/>
+                <w:sz w:val="20"/>
+              </w:rPr>
               <w:t>68 个</w:t>
             </w:r>
           </w:p>
@@ -556,7 +922,16 @@
             <w:tcW w:type="dxa" w:w="2880"/>
           </w:tcPr>
           <w:p>
+            <w:pPr>
+              <w:spacing w:after="40"/>
+            </w:pPr>
             <w:r>
+              <w:rPr>
+                <w:rFonts w:ascii="Arial" w:hAnsi="Arial" w:cs="Arial" w:eastAsia="Arial"/>
+                <w:b w:val="0"/>
+                <w:i w:val="0"/>
+                <w:sz w:val="20"/>
+              </w:rPr>
               <w:t>Kerinci / Sumatera… → 保留</w:t>
             </w:r>
           </w:p>
@@ -568,7 +943,16 @@
             <w:tcW w:type="dxa" w:w="2880"/>
           </w:tcPr>
           <w:p>
+            <w:pPr>
+              <w:spacing w:after="40"/>
+            </w:pPr>
             <w:r>
+              <w:rPr>
+                <w:rFonts w:ascii="Arial" w:hAnsi="Arial" w:cs="Arial" w:eastAsia="Arial"/>
+                <w:b w:val="0"/>
+                <w:i w:val="0"/>
+                <w:sz w:val="20"/>
+              </w:rPr>
               <w:t>产地词·CJK（origin_cjk）</w:t>
             </w:r>
           </w:p>
@@ -578,7 +962,16 @@
             <w:tcW w:type="dxa" w:w="2880"/>
           </w:tcPr>
           <w:p>
+            <w:pPr>
+              <w:spacing w:after="40"/>
+            </w:pPr>
             <w:r>
+              <w:rPr>
+                <w:rFonts w:ascii="Arial" w:hAnsi="Arial" w:cs="Arial" w:eastAsia="Arial"/>
+                <w:b w:val="0"/>
+                <w:i w:val="0"/>
+                <w:sz w:val="20"/>
+              </w:rPr>
               <w:t>25 个</w:t>
             </w:r>
           </w:p>
@@ -588,7 +981,16 @@
             <w:tcW w:type="dxa" w:w="2880"/>
           </w:tcPr>
           <w:p>
+            <w:pPr>
+              <w:spacing w:after="40"/>
+            </w:pPr>
             <w:r>
+              <w:rPr>
+                <w:rFonts w:ascii="Arial" w:hAnsi="Arial" w:cs="Arial" w:eastAsia="Arial"/>
+                <w:b w:val="0"/>
+                <w:i w:val="0"/>
+                <w:sz w:val="20"/>
+              </w:rPr>
               <w:t>阿里山 / เชียงราย… → 保留</w:t>
             </w:r>
           </w:p>
@@ -597,7 +999,16 @@
     </w:tbl>
     <w:p/>
     <w:p>
+      <w:pPr>
+        <w:spacing w:before="0" w:after="120"/>
+      </w:pPr>
       <w:r>
+        <w:rPr>
+          <w:rFonts w:ascii="Arial" w:hAnsi="Arial" w:cs="Arial" w:eastAsia="Arial"/>
+          <w:b w:val="0"/>
+          <w:i w:val="0"/>
+          <w:sz w:val="21"/>
+        </w:rPr>
         <w:t>6 类噪音关键词覆盖 8 个地区（MY 同时使用 EN + ID 两套）：</w:t>
       </w:r>
     </w:p>
@@ -622,9 +1033,15 @@
             <w:tcW w:type="dxa" w:w="1234"/>
           </w:tcPr>
           <w:p>
+            <w:pPr>
+              <w:spacing w:after="40"/>
+            </w:pPr>
             <w:r>
               <w:rPr>
+                <w:rFonts w:ascii="Arial" w:hAnsi="Arial" w:cs="Arial" w:eastAsia="Arial"/>
                 <w:b/>
+                <w:i w:val="0"/>
+                <w:sz w:val="20"/>
               </w:rPr>
               <w:t>类别</w:t>
             </w:r>
@@ -635,9 +1052,15 @@
             <w:tcW w:type="dxa" w:w="1234"/>
           </w:tcPr>
           <w:p>
+            <w:pPr>
+              <w:spacing w:after="40"/>
+            </w:pPr>
             <w:r>
               <w:rPr>
+                <w:rFonts w:ascii="Arial" w:hAnsi="Arial" w:cs="Arial" w:eastAsia="Arial"/>
                 <w:b/>
+                <w:i w:val="0"/>
+                <w:sz w:val="20"/>
               </w:rPr>
               <w:t>EN</w:t>
             </w:r>
@@ -648,9 +1071,15 @@
             <w:tcW w:type="dxa" w:w="1234"/>
           </w:tcPr>
           <w:p>
+            <w:pPr>
+              <w:spacing w:after="40"/>
+            </w:pPr>
             <w:r>
               <w:rPr>
+                <w:rFonts w:ascii="Arial" w:hAnsi="Arial" w:cs="Arial" w:eastAsia="Arial"/>
                 <w:b/>
+                <w:i w:val="0"/>
+                <w:sz w:val="20"/>
               </w:rPr>
               <w:t>ID</w:t>
             </w:r>
@@ -661,9 +1090,15 @@
             <w:tcW w:type="dxa" w:w="1234"/>
           </w:tcPr>
           <w:p>
+            <w:pPr>
+              <w:spacing w:after="40"/>
+            </w:pPr>
             <w:r>
               <w:rPr>
+                <w:rFonts w:ascii="Arial" w:hAnsi="Arial" w:cs="Arial" w:eastAsia="Arial"/>
                 <w:b/>
+                <w:i w:val="0"/>
+                <w:sz w:val="20"/>
               </w:rPr>
               <w:t>BR</w:t>
             </w:r>
@@ -674,9 +1109,15 @@
             <w:tcW w:type="dxa" w:w="1234"/>
           </w:tcPr>
           <w:p>
+            <w:pPr>
+              <w:spacing w:after="40"/>
+            </w:pPr>
             <w:r>
               <w:rPr>
+                <w:rFonts w:ascii="Arial" w:hAnsi="Arial" w:cs="Arial" w:eastAsia="Arial"/>
                 <w:b/>
+                <w:i w:val="0"/>
+                <w:sz w:val="20"/>
               </w:rPr>
               <w:t>TW</w:t>
             </w:r>
@@ -687,9 +1128,15 @@
             <w:tcW w:type="dxa" w:w="1234"/>
           </w:tcPr>
           <w:p>
+            <w:pPr>
+              <w:spacing w:after="40"/>
+            </w:pPr>
             <w:r>
               <w:rPr>
+                <w:rFonts w:ascii="Arial" w:hAnsi="Arial" w:cs="Arial" w:eastAsia="Arial"/>
                 <w:b/>
+                <w:i w:val="0"/>
+                <w:sz w:val="20"/>
               </w:rPr>
               <w:t>TH</w:t>
             </w:r>
@@ -700,9 +1147,15 @@
             <w:tcW w:type="dxa" w:w="1234"/>
           </w:tcPr>
           <w:p>
+            <w:pPr>
+              <w:spacing w:after="40"/>
+            </w:pPr>
             <w:r>
               <w:rPr>
+                <w:rFonts w:ascii="Arial" w:hAnsi="Arial" w:cs="Arial" w:eastAsia="Arial"/>
                 <w:b/>
+                <w:i w:val="0"/>
+                <w:sz w:val="20"/>
               </w:rPr>
               <w:t>VN</w:t>
             </w:r>
@@ -715,7 +1168,16 @@
             <w:tcW w:type="dxa" w:w="1234"/>
           </w:tcPr>
           <w:p>
+            <w:pPr>
+              <w:spacing w:after="40"/>
+            </w:pPr>
             <w:r>
+              <w:rPr>
+                <w:rFonts w:ascii="Arial" w:hAnsi="Arial" w:cs="Arial" w:eastAsia="Arial"/>
+                <w:b w:val="0"/>
+                <w:i w:val="0"/>
+                <w:sz w:val="20"/>
+              </w:rPr>
               <w:t>📦 物流</w:t>
             </w:r>
           </w:p>
@@ -725,7 +1187,16 @@
             <w:tcW w:type="dxa" w:w="1234"/>
           </w:tcPr>
           <w:p>
+            <w:pPr>
+              <w:spacing w:after="40"/>
+            </w:pPr>
             <w:r>
+              <w:rPr>
+                <w:rFonts w:ascii="Arial" w:hAnsi="Arial" w:cs="Arial" w:eastAsia="Arial"/>
+                <w:b w:val="0"/>
+                <w:i w:val="0"/>
+                <w:sz w:val="20"/>
+              </w:rPr>
               <w:t>free shipping</w:t>
             </w:r>
           </w:p>
@@ -735,7 +1206,16 @@
             <w:tcW w:type="dxa" w:w="1234"/>
           </w:tcPr>
           <w:p>
+            <w:pPr>
+              <w:spacing w:after="40"/>
+            </w:pPr>
             <w:r>
+              <w:rPr>
+                <w:rFonts w:ascii="Arial" w:hAnsi="Arial" w:cs="Arial" w:eastAsia="Arial"/>
+                <w:b w:val="0"/>
+                <w:i w:val="0"/>
+                <w:sz w:val="20"/>
+              </w:rPr>
               <w:t>ongkir</w:t>
             </w:r>
           </w:p>
@@ -745,7 +1225,16 @@
             <w:tcW w:type="dxa" w:w="1234"/>
           </w:tcPr>
           <w:p>
+            <w:pPr>
+              <w:spacing w:after="40"/>
+            </w:pPr>
             <w:r>
+              <w:rPr>
+                <w:rFonts w:ascii="Arial" w:hAnsi="Arial" w:cs="Arial" w:eastAsia="Arial"/>
+                <w:b w:val="0"/>
+                <w:i w:val="0"/>
+                <w:sz w:val="20"/>
+              </w:rPr>
               <w:t>frete</w:t>
             </w:r>
           </w:p>
@@ -755,7 +1244,16 @@
             <w:tcW w:type="dxa" w:w="1234"/>
           </w:tcPr>
           <w:p>
+            <w:pPr>
+              <w:spacing w:after="40"/>
+            </w:pPr>
             <w:r>
+              <w:rPr>
+                <w:rFonts w:ascii="Arial" w:hAnsi="Arial" w:cs="Arial" w:eastAsia="Arial"/>
+                <w:b w:val="0"/>
+                <w:i w:val="0"/>
+                <w:sz w:val="20"/>
+              </w:rPr>
               <w:t>出貨 · 宅配</w:t>
             </w:r>
           </w:p>
@@ -765,7 +1263,16 @@
             <w:tcW w:type="dxa" w:w="1234"/>
           </w:tcPr>
           <w:p>
+            <w:pPr>
+              <w:spacing w:after="40"/>
+            </w:pPr>
             <w:r>
+              <w:rPr>
+                <w:rFonts w:ascii="Arial" w:hAnsi="Arial" w:cs="Arial" w:eastAsia="Arial"/>
+                <w:b w:val="0"/>
+                <w:i w:val="0"/>
+                <w:sz w:val="20"/>
+              </w:rPr>
               <w:t>จัดส่ง</w:t>
             </w:r>
           </w:p>
@@ -775,7 +1282,16 @@
             <w:tcW w:type="dxa" w:w="1234"/>
           </w:tcPr>
           <w:p>
+            <w:pPr>
+              <w:spacing w:after="40"/>
+            </w:pPr>
             <w:r>
+              <w:rPr>
+                <w:rFonts w:ascii="Arial" w:hAnsi="Arial" w:cs="Arial" w:eastAsia="Arial"/>
+                <w:b w:val="0"/>
+                <w:i w:val="0"/>
+                <w:sz w:val="20"/>
+              </w:rPr>
               <w:t>giao hàng</w:t>
             </w:r>
           </w:p>
@@ -787,7 +1303,16 @@
             <w:tcW w:type="dxa" w:w="1234"/>
           </w:tcPr>
           <w:p>
+            <w:pPr>
+              <w:spacing w:after="40"/>
+            </w:pPr>
             <w:r>
+              <w:rPr>
+                <w:rFonts w:ascii="Arial" w:hAnsi="Arial" w:cs="Arial" w:eastAsia="Arial"/>
+                <w:b w:val="0"/>
+                <w:i w:val="0"/>
+                <w:sz w:val="20"/>
+              </w:rPr>
               <w:t>↩ 退换</w:t>
             </w:r>
           </w:p>
@@ -797,7 +1322,16 @@
             <w:tcW w:type="dxa" w:w="1234"/>
           </w:tcPr>
           <w:p>
+            <w:pPr>
+              <w:spacing w:after="40"/>
+            </w:pPr>
             <w:r>
+              <w:rPr>
+                <w:rFonts w:ascii="Arial" w:hAnsi="Arial" w:cs="Arial" w:eastAsia="Arial"/>
+                <w:b w:val="0"/>
+                <w:i w:val="0"/>
+                <w:sz w:val="20"/>
+              </w:rPr>
               <w:t>return policy</w:t>
             </w:r>
           </w:p>
@@ -807,7 +1341,16 @@
             <w:tcW w:type="dxa" w:w="1234"/>
           </w:tcPr>
           <w:p>
+            <w:pPr>
+              <w:spacing w:after="40"/>
+            </w:pPr>
             <w:r>
+              <w:rPr>
+                <w:rFonts w:ascii="Arial" w:hAnsi="Arial" w:cs="Arial" w:eastAsia="Arial"/>
+                <w:b w:val="0"/>
+                <w:i w:val="0"/>
+                <w:sz w:val="20"/>
+              </w:rPr>
               <w:t>retur</w:t>
             </w:r>
           </w:p>
@@ -817,7 +1360,16 @@
             <w:tcW w:type="dxa" w:w="1234"/>
           </w:tcPr>
           <w:p>
+            <w:pPr>
+              <w:spacing w:after="40"/>
+            </w:pPr>
             <w:r>
+              <w:rPr>
+                <w:rFonts w:ascii="Arial" w:hAnsi="Arial" w:cs="Arial" w:eastAsia="Arial"/>
+                <w:b w:val="0"/>
+                <w:i w:val="0"/>
+                <w:sz w:val="20"/>
+              </w:rPr>
               <w:t>devolução</w:t>
             </w:r>
           </w:p>
@@ -827,7 +1379,16 @@
             <w:tcW w:type="dxa" w:w="1234"/>
           </w:tcPr>
           <w:p>
+            <w:pPr>
+              <w:spacing w:after="40"/>
+            </w:pPr>
             <w:r>
+              <w:rPr>
+                <w:rFonts w:ascii="Arial" w:hAnsi="Arial" w:cs="Arial" w:eastAsia="Arial"/>
+                <w:b w:val="0"/>
+                <w:i w:val="0"/>
+                <w:sz w:val="20"/>
+              </w:rPr>
               <w:t>退貨 · 鑑賞期</w:t>
             </w:r>
           </w:p>
@@ -837,7 +1398,16 @@
             <w:tcW w:type="dxa" w:w="1234"/>
           </w:tcPr>
           <w:p>
+            <w:pPr>
+              <w:spacing w:after="40"/>
+            </w:pPr>
             <w:r>
+              <w:rPr>
+                <w:rFonts w:ascii="Arial" w:hAnsi="Arial" w:cs="Arial" w:eastAsia="Arial"/>
+                <w:b w:val="0"/>
+                <w:i w:val="0"/>
+                <w:sz w:val="20"/>
+              </w:rPr>
               <w:t>คืนสินค้า</w:t>
             </w:r>
           </w:p>
@@ -847,7 +1417,16 @@
             <w:tcW w:type="dxa" w:w="1234"/>
           </w:tcPr>
           <w:p>
+            <w:pPr>
+              <w:spacing w:after="40"/>
+            </w:pPr>
             <w:r>
+              <w:rPr>
+                <w:rFonts w:ascii="Arial" w:hAnsi="Arial" w:cs="Arial" w:eastAsia="Arial"/>
+                <w:b w:val="0"/>
+                <w:i w:val="0"/>
+                <w:sz w:val="20"/>
+              </w:rPr>
               <w:t>đổi trả</w:t>
             </w:r>
           </w:p>
@@ -859,7 +1438,16 @@
             <w:tcW w:type="dxa" w:w="1234"/>
           </w:tcPr>
           <w:p>
+            <w:pPr>
+              <w:spacing w:after="40"/>
+            </w:pPr>
             <w:r>
+              <w:rPr>
+                <w:rFonts w:ascii="Arial" w:hAnsi="Arial" w:cs="Arial" w:eastAsia="Arial"/>
+                <w:b w:val="0"/>
+                <w:i w:val="0"/>
+                <w:sz w:val="20"/>
+              </w:rPr>
               <w:t>💬 客服</w:t>
             </w:r>
           </w:p>
@@ -869,7 +1457,16 @@
             <w:tcW w:type="dxa" w:w="1234"/>
           </w:tcPr>
           <w:p>
+            <w:pPr>
+              <w:spacing w:after="40"/>
+            </w:pPr>
             <w:r>
+              <w:rPr>
+                <w:rFonts w:ascii="Arial" w:hAnsi="Arial" w:cs="Arial" w:eastAsia="Arial"/>
+                <w:b w:val="0"/>
+                <w:i w:val="0"/>
+                <w:sz w:val="20"/>
+              </w:rPr>
               <w:t>contact us</w:t>
             </w:r>
           </w:p>
@@ -879,7 +1476,16 @@
             <w:tcW w:type="dxa" w:w="1234"/>
           </w:tcPr>
           <w:p>
+            <w:pPr>
+              <w:spacing w:after="40"/>
+            </w:pPr>
             <w:r>
+              <w:rPr>
+                <w:rFonts w:ascii="Arial" w:hAnsi="Arial" w:cs="Arial" w:eastAsia="Arial"/>
+                <w:b w:val="0"/>
+                <w:i w:val="0"/>
+                <w:sz w:val="20"/>
+              </w:rPr>
               <w:t>hubungi kami</w:t>
             </w:r>
           </w:p>
@@ -889,7 +1495,16 @@
             <w:tcW w:type="dxa" w:w="1234"/>
           </w:tcPr>
           <w:p>
+            <w:pPr>
+              <w:spacing w:after="40"/>
+            </w:pPr>
             <w:r>
+              <w:rPr>
+                <w:rFonts w:ascii="Arial" w:hAnsi="Arial" w:cs="Arial" w:eastAsia="Arial"/>
+                <w:b w:val="0"/>
+                <w:i w:val="0"/>
+                <w:sz w:val="20"/>
+              </w:rPr>
               <w:t>fale conosco</w:t>
             </w:r>
           </w:p>
@@ -899,7 +1514,16 @@
             <w:tcW w:type="dxa" w:w="1234"/>
           </w:tcPr>
           <w:p>
+            <w:pPr>
+              <w:spacing w:after="40"/>
+            </w:pPr>
             <w:r>
+              <w:rPr>
+                <w:rFonts w:ascii="Arial" w:hAnsi="Arial" w:cs="Arial" w:eastAsia="Arial"/>
+                <w:b w:val="0"/>
+                <w:i w:val="0"/>
+                <w:sz w:val="20"/>
+              </w:rPr>
               <w:t>客服 · 聊聊</w:t>
             </w:r>
           </w:p>
@@ -909,7 +1533,16 @@
             <w:tcW w:type="dxa" w:w="1234"/>
           </w:tcPr>
           <w:p>
+            <w:pPr>
+              <w:spacing w:after="40"/>
+            </w:pPr>
             <w:r>
+              <w:rPr>
+                <w:rFonts w:ascii="Arial" w:hAnsi="Arial" w:cs="Arial" w:eastAsia="Arial"/>
+                <w:b w:val="0"/>
+                <w:i w:val="0"/>
+                <w:sz w:val="20"/>
+              </w:rPr>
               <w:t>ติดต่อเรา</w:t>
             </w:r>
           </w:p>
@@ -919,7 +1552,16 @@
             <w:tcW w:type="dxa" w:w="1234"/>
           </w:tcPr>
           <w:p>
+            <w:pPr>
+              <w:spacing w:after="40"/>
+            </w:pPr>
             <w:r>
+              <w:rPr>
+                <w:rFonts w:ascii="Arial" w:hAnsi="Arial" w:cs="Arial" w:eastAsia="Arial"/>
+                <w:b w:val="0"/>
+                <w:i w:val="0"/>
+                <w:sz w:val="20"/>
+              </w:rPr>
               <w:t>liên hệ</w:t>
             </w:r>
           </w:p>
@@ -931,7 +1573,16 @@
             <w:tcW w:type="dxa" w:w="1234"/>
           </w:tcPr>
           <w:p>
+            <w:pPr>
+              <w:spacing w:after="40"/>
+            </w:pPr>
             <w:r>
+              <w:rPr>
+                <w:rFonts w:ascii="Arial" w:hAnsi="Arial" w:cs="Arial" w:eastAsia="Arial"/>
+                <w:b w:val="0"/>
+                <w:i w:val="0"/>
+                <w:sz w:val="20"/>
+              </w:rPr>
               <w:t>🏪 店铺</w:t>
             </w:r>
           </w:p>
@@ -941,7 +1592,16 @@
             <w:tcW w:type="dxa" w:w="1234"/>
           </w:tcPr>
           <w:p>
+            <w:pPr>
+              <w:spacing w:after="40"/>
+            </w:pPr>
             <w:r>
+              <w:rPr>
+                <w:rFonts w:ascii="Arial" w:hAnsi="Arial" w:cs="Arial" w:eastAsia="Arial"/>
+                <w:b w:val="0"/>
+                <w:i w:val="0"/>
+                <w:sz w:val="20"/>
+              </w:rPr>
               <w:t>welcome</w:t>
             </w:r>
           </w:p>
@@ -951,7 +1611,16 @@
             <w:tcW w:type="dxa" w:w="1234"/>
           </w:tcPr>
           <w:p>
+            <w:pPr>
+              <w:spacing w:after="40"/>
+            </w:pPr>
             <w:r>
+              <w:rPr>
+                <w:rFonts w:ascii="Arial" w:hAnsi="Arial" w:cs="Arial" w:eastAsia="Arial"/>
+                <w:b w:val="0"/>
+                <w:i w:val="0"/>
+                <w:sz w:val="20"/>
+              </w:rPr>
               <w:t>tentang toko</w:t>
             </w:r>
           </w:p>
@@ -961,7 +1630,16 @@
             <w:tcW w:type="dxa" w:w="1234"/>
           </w:tcPr>
           <w:p>
+            <w:pPr>
+              <w:spacing w:after="40"/>
+            </w:pPr>
             <w:r>
+              <w:rPr>
+                <w:rFonts w:ascii="Arial" w:hAnsi="Arial" w:cs="Arial" w:eastAsia="Arial"/>
+                <w:b w:val="0"/>
+                <w:i w:val="0"/>
+                <w:sz w:val="20"/>
+              </w:rPr>
               <w:t>nossa loja</w:t>
             </w:r>
           </w:p>
@@ -971,7 +1649,16 @@
             <w:tcW w:type="dxa" w:w="1234"/>
           </w:tcPr>
           <w:p>
+            <w:pPr>
+              <w:spacing w:after="40"/>
+            </w:pPr>
             <w:r>
+              <w:rPr>
+                <w:rFonts w:ascii="Arial" w:hAnsi="Arial" w:cs="Arial" w:eastAsia="Arial"/>
+                <w:b w:val="0"/>
+                <w:i w:val="0"/>
+                <w:sz w:val="20"/>
+              </w:rPr>
               <w:t>歡迎光臨</w:t>
             </w:r>
           </w:p>
@@ -981,7 +1668,16 @@
             <w:tcW w:type="dxa" w:w="1234"/>
           </w:tcPr>
           <w:p>
+            <w:pPr>
+              <w:spacing w:after="40"/>
+            </w:pPr>
             <w:r>
+              <w:rPr>
+                <w:rFonts w:ascii="Arial" w:hAnsi="Arial" w:cs="Arial" w:eastAsia="Arial"/>
+                <w:b w:val="0"/>
+                <w:i w:val="0"/>
+                <w:sz w:val="20"/>
+              </w:rPr>
               <w:t>ทางร้าน</w:t>
             </w:r>
           </w:p>
@@ -991,7 +1687,16 @@
             <w:tcW w:type="dxa" w:w="1234"/>
           </w:tcPr>
           <w:p>
+            <w:pPr>
+              <w:spacing w:after="40"/>
+            </w:pPr>
             <w:r>
+              <w:rPr>
+                <w:rFonts w:ascii="Arial" w:hAnsi="Arial" w:cs="Arial" w:eastAsia="Arial"/>
+                <w:b w:val="0"/>
+                <w:i w:val="0"/>
+                <w:sz w:val="20"/>
+              </w:rPr>
               <w:t>về chúng tôi</w:t>
             </w:r>
           </w:p>
@@ -1003,7 +1708,16 @@
             <w:tcW w:type="dxa" w:w="1234"/>
           </w:tcPr>
           <w:p>
+            <w:pPr>
+              <w:spacing w:after="40"/>
+            </w:pPr>
             <w:r>
+              <w:rPr>
+                <w:rFonts w:ascii="Arial" w:hAnsi="Arial" w:cs="Arial" w:eastAsia="Arial"/>
+                <w:b w:val="0"/>
+                <w:i w:val="0"/>
+                <w:sz w:val="20"/>
+              </w:rPr>
               <w:t>⚠ 免责</w:t>
             </w:r>
           </w:p>
@@ -1013,7 +1727,16 @@
             <w:tcW w:type="dxa" w:w="1234"/>
           </w:tcPr>
           <w:p>
+            <w:pPr>
+              <w:spacing w:after="40"/>
+            </w:pPr>
             <w:r>
+              <w:rPr>
+                <w:rFonts w:ascii="Arial" w:hAnsi="Arial" w:cs="Arial" w:eastAsia="Arial"/>
+                <w:b w:val="0"/>
+                <w:i w:val="0"/>
+                <w:sz w:val="20"/>
+              </w:rPr>
               <w:t>image for ref.</w:t>
             </w:r>
           </w:p>
@@ -1023,7 +1746,16 @@
             <w:tcW w:type="dxa" w:w="1234"/>
           </w:tcPr>
           <w:p>
+            <w:pPr>
+              <w:spacing w:after="40"/>
+            </w:pPr>
             <w:r>
+              <w:rPr>
+                <w:rFonts w:ascii="Arial" w:hAnsi="Arial" w:cs="Arial" w:eastAsia="Arial"/>
+                <w:b w:val="0"/>
+                <w:i w:val="0"/>
+                <w:sz w:val="20"/>
+              </w:rPr>
               <w:t>ilustrasi</w:t>
             </w:r>
           </w:p>
@@ -1033,7 +1765,16 @@
             <w:tcW w:type="dxa" w:w="1234"/>
           </w:tcPr>
           <w:p>
+            <w:pPr>
+              <w:spacing w:after="40"/>
+            </w:pPr>
             <w:r>
+              <w:rPr>
+                <w:rFonts w:ascii="Arial" w:hAnsi="Arial" w:cs="Arial" w:eastAsia="Arial"/>
+                <w:b w:val="0"/>
+                <w:i w:val="0"/>
+                <w:sz w:val="20"/>
+              </w:rPr>
               <w:t>ilustrativa</w:t>
             </w:r>
           </w:p>
@@ -1043,7 +1784,16 @@
             <w:tcW w:type="dxa" w:w="1234"/>
           </w:tcPr>
           <w:p>
+            <w:pPr>
+              <w:spacing w:after="40"/>
+            </w:pPr>
             <w:r>
+              <w:rPr>
+                <w:rFonts w:ascii="Arial" w:hAnsi="Arial" w:cs="Arial" w:eastAsia="Arial"/>
+                <w:b w:val="0"/>
+                <w:i w:val="0"/>
+                <w:sz w:val="20"/>
+              </w:rPr>
               <w:t>僅供參考</w:t>
             </w:r>
           </w:p>
@@ -1053,7 +1803,16 @@
             <w:tcW w:type="dxa" w:w="1234"/>
           </w:tcPr>
           <w:p>
+            <w:pPr>
+              <w:spacing w:after="40"/>
+            </w:pPr>
             <w:r>
+              <w:rPr>
+                <w:rFonts w:ascii="Arial" w:hAnsi="Arial" w:cs="Arial" w:eastAsia="Arial"/>
+                <w:b w:val="0"/>
+                <w:i w:val="0"/>
+                <w:sz w:val="20"/>
+              </w:rPr>
               <w:t>สีอาจแตกต่าง</w:t>
             </w:r>
           </w:p>
@@ -1063,7 +1822,16 @@
             <w:tcW w:type="dxa" w:w="1234"/>
           </w:tcPr>
           <w:p>
+            <w:pPr>
+              <w:spacing w:after="40"/>
+            </w:pPr>
             <w:r>
+              <w:rPr>
+                <w:rFonts w:ascii="Arial" w:hAnsi="Arial" w:cs="Arial" w:eastAsia="Arial"/>
+                <w:b w:val="0"/>
+                <w:i w:val="0"/>
+                <w:sz w:val="20"/>
+              </w:rPr>
               <w:t>minh họa</w:t>
             </w:r>
           </w:p>
@@ -1075,7 +1843,16 @@
             <w:tcW w:type="dxa" w:w="1234"/>
           </w:tcPr>
           <w:p>
+            <w:pPr>
+              <w:spacing w:after="40"/>
+            </w:pPr>
             <w:r>
+              <w:rPr>
+                <w:rFonts w:ascii="Arial" w:hAnsi="Arial" w:cs="Arial" w:eastAsia="Arial"/>
+                <w:b w:val="0"/>
+                <w:i w:val="0"/>
+                <w:sz w:val="20"/>
+              </w:rPr>
               <w:t>⛔ 警告</w:t>
             </w:r>
           </w:p>
@@ -1085,7 +1862,16 @@
             <w:tcW w:type="dxa" w:w="1234"/>
           </w:tcPr>
           <w:p>
+            <w:pPr>
+              <w:spacing w:after="40"/>
+            </w:pPr>
             <w:r>
+              <w:rPr>
+                <w:rFonts w:ascii="Arial" w:hAnsi="Arial" w:cs="Arial" w:eastAsia="Arial"/>
+                <w:b w:val="0"/>
+                <w:i w:val="0"/>
+                <w:sz w:val="20"/>
+              </w:rPr>
               <w:t>safety warning</w:t>
             </w:r>
           </w:p>
@@ -1095,7 +1881,16 @@
             <w:tcW w:type="dxa" w:w="1234"/>
           </w:tcPr>
           <w:p>
+            <w:pPr>
+              <w:spacing w:after="40"/>
+            </w:pPr>
             <w:r>
+              <w:rPr>
+                <w:rFonts w:ascii="Arial" w:hAnsi="Arial" w:cs="Arial" w:eastAsia="Arial"/>
+                <w:b w:val="0"/>
+                <w:i w:val="0"/>
+                <w:sz w:val="20"/>
+              </w:rPr>
               <w:t>perhatian</w:t>
             </w:r>
           </w:p>
@@ -1105,7 +1900,16 @@
             <w:tcW w:type="dxa" w:w="1234"/>
           </w:tcPr>
           <w:p>
+            <w:pPr>
+              <w:spacing w:after="40"/>
+            </w:pPr>
             <w:r>
+              <w:rPr>
+                <w:rFonts w:ascii="Arial" w:hAnsi="Arial" w:cs="Arial" w:eastAsia="Arial"/>
+                <w:b w:val="0"/>
+                <w:i w:val="0"/>
+                <w:sz w:val="20"/>
+              </w:rPr>
               <w:t>atenção</w:t>
             </w:r>
           </w:p>
@@ -1115,7 +1919,16 @@
             <w:tcW w:type="dxa" w:w="1234"/>
           </w:tcPr>
           <w:p>
+            <w:pPr>
+              <w:spacing w:after="40"/>
+            </w:pPr>
             <w:r>
+              <w:rPr>
+                <w:rFonts w:ascii="Arial" w:hAnsi="Arial" w:cs="Arial" w:eastAsia="Arial"/>
+                <w:b w:val="0"/>
+                <w:i w:val="0"/>
+                <w:sz w:val="20"/>
+              </w:rPr>
               <w:t>注意事項</w:t>
             </w:r>
           </w:p>
@@ -1125,7 +1938,16 @@
             <w:tcW w:type="dxa" w:w="1234"/>
           </w:tcPr>
           <w:p>
+            <w:pPr>
+              <w:spacing w:after="40"/>
+            </w:pPr>
             <w:r>
+              <w:rPr>
+                <w:rFonts w:ascii="Arial" w:hAnsi="Arial" w:cs="Arial" w:eastAsia="Arial"/>
+                <w:b w:val="0"/>
+                <w:i w:val="0"/>
+                <w:sz w:val="20"/>
+              </w:rPr>
               <w:t>คำเตือน</w:t>
             </w:r>
           </w:p>
@@ -1135,7 +1957,16 @@
             <w:tcW w:type="dxa" w:w="1234"/>
           </w:tcPr>
           <w:p>
+            <w:pPr>
+              <w:spacing w:after="40"/>
+            </w:pPr>
             <w:r>
+              <w:rPr>
+                <w:rFonts w:ascii="Arial" w:hAnsi="Arial" w:cs="Arial" w:eastAsia="Arial"/>
+                <w:b w:val="0"/>
+                <w:i w:val="0"/>
+                <w:sz w:val="20"/>
+              </w:rPr>
               <w:t>lưu ý</w:t>
             </w:r>
           </w:p>
@@ -1145,87 +1976,126 @@
     <w:p/>
     <w:p>
       <w:pPr>
-        <w:spacing w:before="320" w:after="120"/>
+        <w:spacing w:before="360" w:after="120"/>
       </w:pPr>
       <w:r>
         <w:rPr>
+          <w:rFonts w:ascii="Arial" w:hAnsi="Arial" w:cs="Arial" w:eastAsia="Arial"/>
           <w:b/>
-          <w:sz w:val="28"/>
+          <w:i w:val="0"/>
+          <w:sz w:val="30"/>
         </w:rPr>
         <w:t>3. Case 示例</w:t>
       </w:r>
     </w:p>
     <w:p>
+      <w:pPr>
+        <w:spacing w:before="240" w:after="120"/>
+      </w:pPr>
       <w:r>
         <w:rPr>
+          <w:rFonts w:ascii="Arial" w:hAnsi="Arial" w:cs="Arial" w:eastAsia="Arial"/>
           <w:b/>
-          <w:sz w:val="24"/>
+          <w:i w:val="0"/>
+          <w:sz w:val="25"/>
         </w:rPr>
         <w:t>物流删除 + 规格保护 [ID]</w:t>
       </w:r>
     </w:p>
     <w:p>
+      <w:pPr>
+        <w:spacing w:before="240" w:after="120"/>
+      </w:pPr>
       <w:r>
         <w:rPr>
+          <w:rFonts w:ascii="Arial" w:hAnsi="Arial" w:cs="Arial" w:eastAsia="Arial"/>
           <w:b/>
-          <w:sz w:val="24"/>
+          <w:i w:val="0"/>
+          <w:sz w:val="25"/>
         </w:rPr>
         <w:t>客服 + 型号保护 [SG]</w:t>
       </w:r>
     </w:p>
     <w:p>
+      <w:pPr>
+        <w:spacing w:before="240" w:after="120"/>
+      </w:pPr>
       <w:r>
         <w:rPr>
+          <w:rFonts w:ascii="Arial" w:hAnsi="Arial" w:cs="Arial" w:eastAsia="Arial"/>
           <w:b/>
-          <w:sz w:val="24"/>
+          <w:i w:val="0"/>
+          <w:sz w:val="25"/>
         </w:rPr>
         <w:t>产地保护 [ID]</w:t>
       </w:r>
     </w:p>
     <w:p>
+      <w:pPr>
+        <w:spacing w:before="240" w:after="120"/>
+      </w:pPr>
       <w:r>
         <w:rPr>
+          <w:rFonts w:ascii="Arial" w:hAnsi="Arial" w:cs="Arial" w:eastAsia="Arial"/>
           <w:b/>
-          <w:sz w:val="24"/>
+          <w:i w:val="0"/>
+          <w:sz w:val="25"/>
         </w:rPr>
         <w:t>长度保护（混合内容）[ID]</w:t>
       </w:r>
     </w:p>
     <w:p>
+      <w:pPr>
+        <w:spacing w:before="240" w:after="120"/>
+      </w:pPr>
       <w:r>
         <w:rPr>
+          <w:rFonts w:ascii="Arial" w:hAnsi="Arial" w:cs="Arial" w:eastAsia="Arial"/>
           <w:b/>
-          <w:sz w:val="24"/>
+          <w:i w:val="0"/>
+          <w:sz w:val="25"/>
         </w:rPr>
         <w:t>退换货 + 规格保护 [TW]</w:t>
       </w:r>
     </w:p>
     <w:p>
       <w:pPr>
-        <w:spacing w:before="320" w:after="120"/>
+        <w:spacing w:before="360" w:after="120"/>
       </w:pPr>
       <w:r>
         <w:rPr>
+          <w:rFonts w:ascii="Arial" w:hAnsi="Arial" w:cs="Arial" w:eastAsia="Arial"/>
           <w:b/>
-          <w:sz w:val="28"/>
+          <w:i w:val="0"/>
+          <w:sz w:val="30"/>
         </w:rPr>
         <w:t>4. 验证结果</w:t>
       </w:r>
     </w:p>
     <w:p>
+      <w:pPr>
+        <w:spacing w:before="240" w:after="120"/>
+      </w:pPr>
       <w:r>
         <w:rPr>
+          <w:rFonts w:ascii="Arial" w:hAnsi="Arial" w:cs="Arial" w:eastAsia="Arial"/>
           <w:b/>
-          <w:sz w:val="24"/>
+          <w:i w:val="0"/>
+          <w:sz w:val="25"/>
         </w:rPr>
         <w:t>4.1 清洗质量（8000 条 · 每地区 1000 条）</w:t>
       </w:r>
     </w:p>
     <w:p>
+      <w:pPr>
+        <w:spacing w:before="240" w:after="120"/>
+      </w:pPr>
       <w:r>
         <w:rPr>
+          <w:rFonts w:ascii="Arial" w:hAnsi="Arial" w:cs="Arial" w:eastAsia="Arial"/>
           <w:b/>
-          <w:sz w:val="24"/>
+          <w:i w:val="0"/>
+          <w:sz w:val="25"/>
         </w:rPr>
         <w:t>4.2 各阶段删除占比</w:t>
       </w:r>
@@ -1247,9 +2117,15 @@
             <w:tcW w:type="dxa" w:w="2880"/>
           </w:tcPr>
           <w:p>
+            <w:pPr>
+              <w:spacing w:after="40"/>
+            </w:pPr>
             <w:r>
               <w:rPr>
+                <w:rFonts w:ascii="Arial" w:hAnsi="Arial" w:cs="Arial" w:eastAsia="Arial"/>
                 <w:b/>
+                <w:i w:val="0"/>
+                <w:sz w:val="20"/>
               </w:rPr>
               <w:t>阶段</w:t>
             </w:r>
@@ -1260,9 +2136,15 @@
             <w:tcW w:type="dxa" w:w="2880"/>
           </w:tcPr>
           <w:p>
+            <w:pPr>
+              <w:spacing w:after="40"/>
+            </w:pPr>
             <w:r>
               <w:rPr>
+                <w:rFonts w:ascii="Arial" w:hAnsi="Arial" w:cs="Arial" w:eastAsia="Arial"/>
                 <w:b/>
+                <w:i w:val="0"/>
+                <w:sz w:val="20"/>
               </w:rPr>
               <w:t>删除占比</w:t>
             </w:r>
@@ -1273,9 +2155,15 @@
             <w:tcW w:type="dxa" w:w="2880"/>
           </w:tcPr>
           <w:p>
+            <w:pPr>
+              <w:spacing w:after="40"/>
+            </w:pPr>
             <w:r>
               <w:rPr>
+                <w:rFonts w:ascii="Arial" w:hAnsi="Arial" w:cs="Arial" w:eastAsia="Arial"/>
                 <w:b/>
+                <w:i w:val="0"/>
+                <w:sz w:val="20"/>
               </w:rPr>
               <w:t>作用</w:t>
             </w:r>
@@ -1288,7 +2176,16 @@
             <w:tcW w:type="dxa" w:w="2880"/>
           </w:tcPr>
           <w:p>
+            <w:pPr>
+              <w:spacing w:after="40"/>
+            </w:pPr>
             <w:r>
+              <w:rPr>
+                <w:rFonts w:ascii="Arial" w:hAnsi="Arial" w:cs="Arial" w:eastAsia="Arial"/>
+                <w:b w:val="0"/>
+                <w:i w:val="0"/>
+                <w:sz w:val="20"/>
+              </w:rPr>
               <w:t>阶段一 · 预处理</w:t>
             </w:r>
           </w:p>
@@ -1298,7 +2195,16 @@
             <w:tcW w:type="dxa" w:w="2880"/>
           </w:tcPr>
           <w:p>
+            <w:pPr>
+              <w:spacing w:after="40"/>
+            </w:pPr>
             <w:r>
+              <w:rPr>
+                <w:rFonts w:ascii="Arial" w:hAnsi="Arial" w:cs="Arial" w:eastAsia="Arial"/>
+                <w:b w:val="0"/>
+                <w:i w:val="0"/>
+                <w:sz w:val="20"/>
+              </w:rPr>
               <w:t>~1.5%</w:t>
             </w:r>
           </w:p>
@@ -1308,7 +2214,16 @@
             <w:tcW w:type="dxa" w:w="2880"/>
           </w:tcPr>
           <w:p>
+            <w:pPr>
+              <w:spacing w:after="40"/>
+            </w:pPr>
             <w:r>
+              <w:rPr>
+                <w:rFonts w:ascii="Arial" w:hAnsi="Arial" w:cs="Arial" w:eastAsia="Arial"/>
+                <w:b w:val="0"/>
+                <w:i w:val="0"/>
+                <w:sz w:val="20"/>
+              </w:rPr>
               <w:t>Emoji / HTML / URL / 电话 / 重复行</w:t>
             </w:r>
           </w:p>
@@ -1320,7 +2235,16 @@
             <w:tcW w:type="dxa" w:w="2880"/>
           </w:tcPr>
           <w:p>
+            <w:pPr>
+              <w:spacing w:after="40"/>
+            </w:pPr>
             <w:r>
+              <w:rPr>
+                <w:rFonts w:ascii="Arial" w:hAnsi="Arial" w:cs="Arial" w:eastAsia="Arial"/>
+                <w:b w:val="0"/>
+                <w:i w:val="0"/>
+                <w:sz w:val="20"/>
+              </w:rPr>
               <w:t>阶段二 · 行级过滤</w:t>
             </w:r>
           </w:p>
@@ -1330,7 +2254,16 @@
             <w:tcW w:type="dxa" w:w="2880"/>
           </w:tcPr>
           <w:p>
+            <w:pPr>
+              <w:spacing w:after="40"/>
+            </w:pPr>
             <w:r>
+              <w:rPr>
+                <w:rFonts w:ascii="Arial" w:hAnsi="Arial" w:cs="Arial" w:eastAsia="Arial"/>
+                <w:b w:val="0"/>
+                <w:i w:val="0"/>
+                <w:sz w:val="20"/>
+              </w:rPr>
               <w:t>~3.2%</w:t>
             </w:r>
           </w:p>
@@ -1340,7 +2273,16 @@
             <w:tcW w:type="dxa" w:w="2880"/>
           </w:tcPr>
           <w:p>
+            <w:pPr>
+              <w:spacing w:after="40"/>
+            </w:pPr>
             <w:r>
+              <w:rPr>
+                <w:rFonts w:ascii="Arial" w:hAnsi="Arial" w:cs="Arial" w:eastAsia="Arial"/>
+                <w:b w:val="0"/>
+                <w:i w:val="0"/>
+                <w:sz w:val="20"/>
+              </w:rPr>
               <w:t>噪音关键词命中的行</w:t>
             </w:r>
           </w:p>
@@ -1349,10 +2291,15 @@
     </w:tbl>
     <w:p/>
     <w:p>
+      <w:pPr>
+        <w:spacing w:before="240" w:after="120"/>
+      </w:pPr>
       <w:r>
         <w:rPr>
+          <w:rFonts w:ascii="Arial" w:hAnsi="Arial" w:cs="Arial" w:eastAsia="Arial"/>
           <w:b/>
-          <w:sz w:val="24"/>
+          <w:i w:val="0"/>
+          <w:sz w:val="25"/>
         </w:rPr>
         <w:t>4.3 地区差异</w:t>
       </w:r>
@@ -1375,9 +2322,15 @@
             <w:tcW w:type="dxa" w:w="2160"/>
           </w:tcPr>
           <w:p>
+            <w:pPr>
+              <w:spacing w:after="40"/>
+            </w:pPr>
             <w:r>
               <w:rPr>
+                <w:rFonts w:ascii="Arial" w:hAnsi="Arial" w:cs="Arial" w:eastAsia="Arial"/>
                 <w:b/>
+                <w:i w:val="0"/>
+                <w:sz w:val="20"/>
               </w:rPr>
               <w:t>地区</w:t>
             </w:r>
@@ -1388,9 +2341,15 @@
             <w:tcW w:type="dxa" w:w="2160"/>
           </w:tcPr>
           <w:p>
+            <w:pPr>
+              <w:spacing w:after="40"/>
+            </w:pPr>
             <w:r>
               <w:rPr>
+                <w:rFonts w:ascii="Arial" w:hAnsi="Arial" w:cs="Arial" w:eastAsia="Arial"/>
                 <w:b/>
+                <w:i w:val="0"/>
+                <w:sz w:val="20"/>
               </w:rPr>
               <w:t>有变化</w:t>
             </w:r>
@@ -1401,9 +2360,15 @@
             <w:tcW w:type="dxa" w:w="2160"/>
           </w:tcPr>
           <w:p>
+            <w:pPr>
+              <w:spacing w:after="40"/>
+            </w:pPr>
             <w:r>
               <w:rPr>
+                <w:rFonts w:ascii="Arial" w:hAnsi="Arial" w:cs="Arial" w:eastAsia="Arial"/>
                 <w:b/>
+                <w:i w:val="0"/>
+                <w:sz w:val="20"/>
               </w:rPr>
               <w:t>总删除率</w:t>
             </w:r>
@@ -1414,9 +2379,15 @@
             <w:tcW w:type="dxa" w:w="2160"/>
           </w:tcPr>
           <w:p>
+            <w:pPr>
+              <w:spacing w:after="40"/>
+            </w:pPr>
             <w:r>
               <w:rPr>
+                <w:rFonts w:ascii="Arial" w:hAnsi="Arial" w:cs="Arial" w:eastAsia="Arial"/>
                 <w:b/>
+                <w:i w:val="0"/>
+                <w:sz w:val="20"/>
               </w:rPr>
               <w:t>说明</w:t>
             </w:r>
@@ -1429,7 +2400,16 @@
             <w:tcW w:type="dxa" w:w="2160"/>
           </w:tcPr>
           <w:p>
+            <w:pPr>
+              <w:spacing w:after="40"/>
+            </w:pPr>
             <w:r>
+              <w:rPr>
+                <w:rFonts w:ascii="Arial" w:hAnsi="Arial" w:cs="Arial" w:eastAsia="Arial"/>
+                <w:b w:val="0"/>
+                <w:i w:val="0"/>
+                <w:sz w:val="20"/>
+              </w:rPr>
               <w:t>TW</w:t>
             </w:r>
           </w:p>
@@ -1439,7 +2419,16 @@
             <w:tcW w:type="dxa" w:w="2160"/>
           </w:tcPr>
           <w:p>
+            <w:pPr>
+              <w:spacing w:after="40"/>
+            </w:pPr>
             <w:r>
+              <w:rPr>
+                <w:rFonts w:ascii="Arial" w:hAnsi="Arial" w:cs="Arial" w:eastAsia="Arial"/>
+                <w:b w:val="0"/>
+                <w:i w:val="0"/>
+                <w:sz w:val="20"/>
+              </w:rPr>
               <w:t>63.1%</w:t>
             </w:r>
           </w:p>
@@ -1449,7 +2438,16 @@
             <w:tcW w:type="dxa" w:w="2160"/>
           </w:tcPr>
           <w:p>
+            <w:pPr>
+              <w:spacing w:after="40"/>
+            </w:pPr>
             <w:r>
+              <w:rPr>
+                <w:rFonts w:ascii="Arial" w:hAnsi="Arial" w:cs="Arial" w:eastAsia="Arial"/>
+                <w:b w:val="0"/>
+                <w:i w:val="0"/>
+                <w:sz w:val="20"/>
+              </w:rPr>
               <w:t>25.0%</w:t>
             </w:r>
           </w:p>
@@ -1459,7 +2457,16 @@
             <w:tcW w:type="dxa" w:w="2160"/>
           </w:tcPr>
           <w:p>
+            <w:pPr>
+              <w:spacing w:after="40"/>
+            </w:pPr>
             <w:r>
+              <w:rPr>
+                <w:rFonts w:ascii="Arial" w:hAnsi="Arial" w:cs="Arial" w:eastAsia="Arial"/>
+                <w:b w:val="0"/>
+                <w:i w:val="0"/>
+                <w:sz w:val="20"/>
+              </w:rPr>
               <w:t>效果最显著，大量运营文案 + Emoji</w:t>
             </w:r>
           </w:p>
@@ -1471,7 +2478,16 @@
             <w:tcW w:type="dxa" w:w="2160"/>
           </w:tcPr>
           <w:p>
+            <w:pPr>
+              <w:spacing w:after="40"/>
+            </w:pPr>
             <w:r>
+              <w:rPr>
+                <w:rFonts w:ascii="Arial" w:hAnsi="Arial" w:cs="Arial" w:eastAsia="Arial"/>
+                <w:b w:val="0"/>
+                <w:i w:val="0"/>
+                <w:sz w:val="20"/>
+              </w:rPr>
               <w:t>BR</w:t>
             </w:r>
           </w:p>
@@ -1481,7 +2497,16 @@
             <w:tcW w:type="dxa" w:w="2160"/>
           </w:tcPr>
           <w:p>
+            <w:pPr>
+              <w:spacing w:after="40"/>
+            </w:pPr>
             <w:r>
+              <w:rPr>
+                <w:rFonts w:ascii="Arial" w:hAnsi="Arial" w:cs="Arial" w:eastAsia="Arial"/>
+                <w:b w:val="0"/>
+                <w:i w:val="0"/>
+                <w:sz w:val="20"/>
+              </w:rPr>
               <w:t>43.6%</w:t>
             </w:r>
           </w:p>
@@ -1491,7 +2516,16 @@
             <w:tcW w:type="dxa" w:w="2160"/>
           </w:tcPr>
           <w:p>
+            <w:pPr>
+              <w:spacing w:after="40"/>
+            </w:pPr>
             <w:r>
+              <w:rPr>
+                <w:rFonts w:ascii="Arial" w:hAnsi="Arial" w:cs="Arial" w:eastAsia="Arial"/>
+                <w:b w:val="0"/>
+                <w:i w:val="0"/>
+                <w:sz w:val="20"/>
+              </w:rPr>
               <w:t>3.1%</w:t>
             </w:r>
           </w:p>
@@ -1501,7 +2535,16 @@
             <w:tcW w:type="dxa" w:w="2160"/>
           </w:tcPr>
           <w:p>
+            <w:pPr>
+              <w:spacing w:after="40"/>
+            </w:pPr>
             <w:r>
+              <w:rPr>
+                <w:rFonts w:ascii="Arial" w:hAnsi="Arial" w:cs="Arial" w:eastAsia="Arial"/>
+                <w:b w:val="0"/>
+                <w:i w:val="0"/>
+                <w:sz w:val="20"/>
+              </w:rPr>
               <w:t>物流/退换文案</w:t>
             </w:r>
           </w:p>
@@ -1513,7 +2556,16 @@
             <w:tcW w:type="dxa" w:w="2160"/>
           </w:tcPr>
           <w:p>
+            <w:pPr>
+              <w:spacing w:after="40"/>
+            </w:pPr>
             <w:r>
+              <w:rPr>
+                <w:rFonts w:ascii="Arial" w:hAnsi="Arial" w:cs="Arial" w:eastAsia="Arial"/>
+                <w:b w:val="0"/>
+                <w:i w:val="0"/>
+                <w:sz w:val="20"/>
+              </w:rPr>
               <w:t>ID</w:t>
             </w:r>
           </w:p>
@@ -1523,7 +2575,16 @@
             <w:tcW w:type="dxa" w:w="2160"/>
           </w:tcPr>
           <w:p>
+            <w:pPr>
+              <w:spacing w:after="40"/>
+            </w:pPr>
             <w:r>
+              <w:rPr>
+                <w:rFonts w:ascii="Arial" w:hAnsi="Arial" w:cs="Arial" w:eastAsia="Arial"/>
+                <w:b w:val="0"/>
+                <w:i w:val="0"/>
+                <w:sz w:val="20"/>
+              </w:rPr>
               <w:t>32.2%</w:t>
             </w:r>
           </w:p>
@@ -1533,7 +2594,16 @@
             <w:tcW w:type="dxa" w:w="2160"/>
           </w:tcPr>
           <w:p>
+            <w:pPr>
+              <w:spacing w:after="40"/>
+            </w:pPr>
             <w:r>
+              <w:rPr>
+                <w:rFonts w:ascii="Arial" w:hAnsi="Arial" w:cs="Arial" w:eastAsia="Arial"/>
+                <w:b w:val="0"/>
+                <w:i w:val="0"/>
+                <w:sz w:val="20"/>
+              </w:rPr>
               <w:t>7.2%</w:t>
             </w:r>
           </w:p>
@@ -1543,7 +2613,17 @@
             <w:tcW w:type="dxa" w:w="2160"/>
           </w:tcPr>
           <w:p>
-            <w:r/>
+            <w:pPr>
+              <w:spacing w:after="40"/>
+            </w:pPr>
+            <w:r>
+              <w:rPr>
+                <w:rFonts w:ascii="Arial" w:hAnsi="Arial" w:cs="Arial" w:eastAsia="Arial"/>
+                <w:b w:val="0"/>
+                <w:i w:val="0"/>
+                <w:sz w:val="20"/>
+              </w:rPr>
+            </w:r>
           </w:p>
         </w:tc>
       </w:tr>
@@ -1553,7 +2633,16 @@
             <w:tcW w:type="dxa" w:w="2160"/>
           </w:tcPr>
           <w:p>
+            <w:pPr>
+              <w:spacing w:after="40"/>
+            </w:pPr>
             <w:r>
+              <w:rPr>
+                <w:rFonts w:ascii="Arial" w:hAnsi="Arial" w:cs="Arial" w:eastAsia="Arial"/>
+                <w:b w:val="0"/>
+                <w:i w:val="0"/>
+                <w:sz w:val="20"/>
+              </w:rPr>
               <w:t>TH</w:t>
             </w:r>
           </w:p>
@@ -1563,7 +2652,16 @@
             <w:tcW w:type="dxa" w:w="2160"/>
           </w:tcPr>
           <w:p>
+            <w:pPr>
+              <w:spacing w:after="40"/>
+            </w:pPr>
             <w:r>
+              <w:rPr>
+                <w:rFonts w:ascii="Arial" w:hAnsi="Arial" w:cs="Arial" w:eastAsia="Arial"/>
+                <w:b w:val="0"/>
+                <w:i w:val="0"/>
+                <w:sz w:val="20"/>
+              </w:rPr>
               <w:t>33.0%</w:t>
             </w:r>
           </w:p>
@@ -1573,7 +2671,16 @@
             <w:tcW w:type="dxa" w:w="2160"/>
           </w:tcPr>
           <w:p>
+            <w:pPr>
+              <w:spacing w:after="40"/>
+            </w:pPr>
             <w:r>
+              <w:rPr>
+                <w:rFonts w:ascii="Arial" w:hAnsi="Arial" w:cs="Arial" w:eastAsia="Arial"/>
+                <w:b w:val="0"/>
+                <w:i w:val="0"/>
+                <w:sz w:val="20"/>
+              </w:rPr>
               <w:t>6.1%</w:t>
             </w:r>
           </w:p>
@@ -1583,7 +2690,17 @@
             <w:tcW w:type="dxa" w:w="2160"/>
           </w:tcPr>
           <w:p>
-            <w:r/>
+            <w:pPr>
+              <w:spacing w:after="40"/>
+            </w:pPr>
+            <w:r>
+              <w:rPr>
+                <w:rFonts w:ascii="Arial" w:hAnsi="Arial" w:cs="Arial" w:eastAsia="Arial"/>
+                <w:b w:val="0"/>
+                <w:i w:val="0"/>
+                <w:sz w:val="20"/>
+              </w:rPr>
+            </w:r>
           </w:p>
         </w:tc>
       </w:tr>
@@ -1593,7 +2710,16 @@
             <w:tcW w:type="dxa" w:w="2160"/>
           </w:tcPr>
           <w:p>
+            <w:pPr>
+              <w:spacing w:after="40"/>
+            </w:pPr>
             <w:r>
+              <w:rPr>
+                <w:rFonts w:ascii="Arial" w:hAnsi="Arial" w:cs="Arial" w:eastAsia="Arial"/>
+                <w:b w:val="0"/>
+                <w:i w:val="0"/>
+                <w:sz w:val="20"/>
+              </w:rPr>
               <w:t>VN</w:t>
             </w:r>
           </w:p>
@@ -1603,7 +2729,16 @@
             <w:tcW w:type="dxa" w:w="2160"/>
           </w:tcPr>
           <w:p>
+            <w:pPr>
+              <w:spacing w:after="40"/>
+            </w:pPr>
             <w:r>
+              <w:rPr>
+                <w:rFonts w:ascii="Arial" w:hAnsi="Arial" w:cs="Arial" w:eastAsia="Arial"/>
+                <w:b w:val="0"/>
+                <w:i w:val="0"/>
+                <w:sz w:val="20"/>
+              </w:rPr>
               <w:t>35.4%</w:t>
             </w:r>
           </w:p>
@@ -1613,7 +2748,16 @@
             <w:tcW w:type="dxa" w:w="2160"/>
           </w:tcPr>
           <w:p>
+            <w:pPr>
+              <w:spacing w:after="40"/>
+            </w:pPr>
             <w:r>
+              <w:rPr>
+                <w:rFonts w:ascii="Arial" w:hAnsi="Arial" w:cs="Arial" w:eastAsia="Arial"/>
+                <w:b w:val="0"/>
+                <w:i w:val="0"/>
+                <w:sz w:val="20"/>
+              </w:rPr>
               <w:t>2.8%</w:t>
             </w:r>
           </w:p>
@@ -1623,7 +2767,17 @@
             <w:tcW w:type="dxa" w:w="2160"/>
           </w:tcPr>
           <w:p>
-            <w:r/>
+            <w:pPr>
+              <w:spacing w:after="40"/>
+            </w:pPr>
+            <w:r>
+              <w:rPr>
+                <w:rFonts w:ascii="Arial" w:hAnsi="Arial" w:cs="Arial" w:eastAsia="Arial"/>
+                <w:b w:val="0"/>
+                <w:i w:val="0"/>
+                <w:sz w:val="20"/>
+              </w:rPr>
+            </w:r>
           </w:p>
         </w:tc>
       </w:tr>
@@ -1633,7 +2787,16 @@
             <w:tcW w:type="dxa" w:w="2160"/>
           </w:tcPr>
           <w:p>
+            <w:pPr>
+              <w:spacing w:after="40"/>
+            </w:pPr>
             <w:r>
+              <w:rPr>
+                <w:rFonts w:ascii="Arial" w:hAnsi="Arial" w:cs="Arial" w:eastAsia="Arial"/>
+                <w:b w:val="0"/>
+                <w:i w:val="0"/>
+                <w:sz w:val="20"/>
+              </w:rPr>
               <w:t>MY / PH / SG</w:t>
             </w:r>
           </w:p>
@@ -1643,7 +2806,16 @@
             <w:tcW w:type="dxa" w:w="2160"/>
           </w:tcPr>
           <w:p>
+            <w:pPr>
+              <w:spacing w:after="40"/>
+            </w:pPr>
             <w:r>
+              <w:rPr>
+                <w:rFonts w:ascii="Arial" w:hAnsi="Arial" w:cs="Arial" w:eastAsia="Arial"/>
+                <w:b w:val="0"/>
+                <w:i w:val="0"/>
+                <w:sz w:val="20"/>
+              </w:rPr>
               <w:t>17~25%</w:t>
             </w:r>
           </w:p>
@@ -1653,7 +2825,16 @@
             <w:tcW w:type="dxa" w:w="2160"/>
           </w:tcPr>
           <w:p>
+            <w:pPr>
+              <w:spacing w:after="40"/>
+            </w:pPr>
             <w:r>
+              <w:rPr>
+                <w:rFonts w:ascii="Arial" w:hAnsi="Arial" w:cs="Arial" w:eastAsia="Arial"/>
+                <w:b w:val="0"/>
+                <w:i w:val="0"/>
+                <w:sz w:val="20"/>
+              </w:rPr>
               <w:t>1.6~2.1%</w:t>
             </w:r>
           </w:p>
@@ -1663,7 +2844,16 @@
             <w:tcW w:type="dxa" w:w="2160"/>
           </w:tcPr>
           <w:p>
+            <w:pPr>
+              <w:spacing w:after="40"/>
+            </w:pPr>
             <w:r>
+              <w:rPr>
+                <w:rFonts w:ascii="Arial" w:hAnsi="Arial" w:cs="Arial" w:eastAsia="Arial"/>
+                <w:b w:val="0"/>
+                <w:i w:val="0"/>
+                <w:sz w:val="20"/>
+              </w:rPr>
               <w:t>原文较干净</w:t>
             </w:r>
           </w:p>
@@ -1672,10 +2862,15 @@
     </w:tbl>
     <w:p/>
     <w:p>
+      <w:pPr>
+        <w:spacing w:before="240" w:after="120"/>
+      </w:pPr>
       <w:r>
         <w:rPr>
+          <w:rFonts w:ascii="Arial" w:hAnsi="Arial" w:cs="Arial" w:eastAsia="Arial"/>
           <w:b/>
-          <w:sz w:val="24"/>
+          <w:i w:val="0"/>
+          <w:sz w:val="25"/>
         </w:rPr>
         <w:t>4.4 Token 长度分析（Qwen Tokenizer）</w:t>
       </w:r>
@@ -1698,9 +2893,15 @@
             <w:tcW w:type="dxa" w:w="2160"/>
           </w:tcPr>
           <w:p>
+            <w:pPr>
+              <w:spacing w:after="40"/>
+            </w:pPr>
             <w:r>
               <w:rPr>
+                <w:rFonts w:ascii="Arial" w:hAnsi="Arial" w:cs="Arial" w:eastAsia="Arial"/>
                 <w:b/>
+                <w:i w:val="0"/>
+                <w:sz w:val="20"/>
               </w:rPr>
               <w:t>地区</w:t>
             </w:r>
@@ -1711,9 +2912,15 @@
             <w:tcW w:type="dxa" w:w="2160"/>
           </w:tcPr>
           <w:p>
+            <w:pPr>
+              <w:spacing w:after="40"/>
+            </w:pPr>
             <w:r>
               <w:rPr>
+                <w:rFonts w:ascii="Arial" w:hAnsi="Arial" w:cs="Arial" w:eastAsia="Arial"/>
                 <w:b/>
+                <w:i w:val="0"/>
+                <w:sz w:val="20"/>
               </w:rPr>
               <w:t>清洗前 avg</w:t>
             </w:r>
@@ -1724,9 +2931,15 @@
             <w:tcW w:type="dxa" w:w="2160"/>
           </w:tcPr>
           <w:p>
+            <w:pPr>
+              <w:spacing w:after="40"/>
+            </w:pPr>
             <w:r>
               <w:rPr>
+                <w:rFonts w:ascii="Arial" w:hAnsi="Arial" w:cs="Arial" w:eastAsia="Arial"/>
                 <w:b/>
+                <w:i w:val="0"/>
+                <w:sz w:val="20"/>
               </w:rPr>
               <w:t>清洗后 avg</w:t>
             </w:r>
@@ -1737,9 +2950,15 @@
             <w:tcW w:type="dxa" w:w="2160"/>
           </w:tcPr>
           <w:p>
+            <w:pPr>
+              <w:spacing w:after="40"/>
+            </w:pPr>
             <w:r>
               <w:rPr>
+                <w:rFonts w:ascii="Arial" w:hAnsi="Arial" w:cs="Arial" w:eastAsia="Arial"/>
                 <w:b/>
+                <w:i w:val="0"/>
+                <w:sz w:val="20"/>
               </w:rPr>
               <w:t>节省</w:t>
             </w:r>
@@ -1752,7 +2971,16 @@
             <w:tcW w:type="dxa" w:w="2160"/>
           </w:tcPr>
           <w:p>
+            <w:pPr>
+              <w:spacing w:after="40"/>
+            </w:pPr>
             <w:r>
+              <w:rPr>
+                <w:rFonts w:ascii="Arial" w:hAnsi="Arial" w:cs="Arial" w:eastAsia="Arial"/>
+                <w:b w:val="0"/>
+                <w:i w:val="0"/>
+                <w:sz w:val="20"/>
+              </w:rPr>
               <w:t>TW</w:t>
             </w:r>
           </w:p>
@@ -1762,7 +2990,16 @@
             <w:tcW w:type="dxa" w:w="2160"/>
           </w:tcPr>
           <w:p>
+            <w:pPr>
+              <w:spacing w:after="40"/>
+            </w:pPr>
             <w:r>
+              <w:rPr>
+                <w:rFonts w:ascii="Arial" w:hAnsi="Arial" w:cs="Arial" w:eastAsia="Arial"/>
+                <w:b w:val="0"/>
+                <w:i w:val="0"/>
+                <w:sz w:val="20"/>
+              </w:rPr>
               <w:t>289</w:t>
             </w:r>
           </w:p>
@@ -1772,7 +3009,16 @@
             <w:tcW w:type="dxa" w:w="2160"/>
           </w:tcPr>
           <w:p>
+            <w:pPr>
+              <w:spacing w:after="40"/>
+            </w:pPr>
             <w:r>
+              <w:rPr>
+                <w:rFonts w:ascii="Arial" w:hAnsi="Arial" w:cs="Arial" w:eastAsia="Arial"/>
+                <w:b w:val="0"/>
+                <w:i w:val="0"/>
+                <w:sz w:val="20"/>
+              </w:rPr>
               <w:t>243</w:t>
             </w:r>
           </w:p>
@@ -1782,7 +3028,16 @@
             <w:tcW w:type="dxa" w:w="2160"/>
           </w:tcPr>
           <w:p>
+            <w:pPr>
+              <w:spacing w:after="40"/>
+            </w:pPr>
             <w:r>
+              <w:rPr>
+                <w:rFonts w:ascii="Arial" w:hAnsi="Arial" w:cs="Arial" w:eastAsia="Arial"/>
+                <w:b w:val="0"/>
+                <w:i w:val="0"/>
+                <w:sz w:val="20"/>
+              </w:rPr>
               <w:t>-16.1%</w:t>
             </w:r>
           </w:p>
@@ -1794,7 +3049,16 @@
             <w:tcW w:type="dxa" w:w="2160"/>
           </w:tcPr>
           <w:p>
+            <w:pPr>
+              <w:spacing w:after="40"/>
+            </w:pPr>
             <w:r>
+              <w:rPr>
+                <w:rFonts w:ascii="Arial" w:hAnsi="Arial" w:cs="Arial" w:eastAsia="Arial"/>
+                <w:b w:val="0"/>
+                <w:i w:val="0"/>
+                <w:sz w:val="20"/>
+              </w:rPr>
               <w:t>ID</w:t>
             </w:r>
           </w:p>
@@ -1804,7 +3068,16 @@
             <w:tcW w:type="dxa" w:w="2160"/>
           </w:tcPr>
           <w:p>
+            <w:pPr>
+              <w:spacing w:after="40"/>
+            </w:pPr>
             <w:r>
+              <w:rPr>
+                <w:rFonts w:ascii="Arial" w:hAnsi="Arial" w:cs="Arial" w:eastAsia="Arial"/>
+                <w:b w:val="0"/>
+                <w:i w:val="0"/>
+                <w:sz w:val="20"/>
+              </w:rPr>
               <w:t>162</w:t>
             </w:r>
           </w:p>
@@ -1814,7 +3087,16 @@
             <w:tcW w:type="dxa" w:w="2160"/>
           </w:tcPr>
           <w:p>
+            <w:pPr>
+              <w:spacing w:after="40"/>
+            </w:pPr>
             <w:r>
+              <w:rPr>
+                <w:rFonts w:ascii="Arial" w:hAnsi="Arial" w:cs="Arial" w:eastAsia="Arial"/>
+                <w:b w:val="0"/>
+                <w:i w:val="0"/>
+                <w:sz w:val="20"/>
+              </w:rPr>
               <w:t>145</w:t>
             </w:r>
           </w:p>
@@ -1824,7 +3106,16 @@
             <w:tcW w:type="dxa" w:w="2160"/>
           </w:tcPr>
           <w:p>
+            <w:pPr>
+              <w:spacing w:after="40"/>
+            </w:pPr>
             <w:r>
+              <w:rPr>
+                <w:rFonts w:ascii="Arial" w:hAnsi="Arial" w:cs="Arial" w:eastAsia="Arial"/>
+                <w:b w:val="0"/>
+                <w:i w:val="0"/>
+                <w:sz w:val="20"/>
+              </w:rPr>
               <w:t>-10.0%</w:t>
             </w:r>
           </w:p>
@@ -1836,7 +3127,16 @@
             <w:tcW w:type="dxa" w:w="2160"/>
           </w:tcPr>
           <w:p>
+            <w:pPr>
+              <w:spacing w:after="40"/>
+            </w:pPr>
             <w:r>
+              <w:rPr>
+                <w:rFonts w:ascii="Arial" w:hAnsi="Arial" w:cs="Arial" w:eastAsia="Arial"/>
+                <w:b w:val="0"/>
+                <w:i w:val="0"/>
+                <w:sz w:val="20"/>
+              </w:rPr>
               <w:t>BR</w:t>
             </w:r>
           </w:p>
@@ -1846,7 +3146,16 @@
             <w:tcW w:type="dxa" w:w="2160"/>
           </w:tcPr>
           <w:p>
+            <w:pPr>
+              <w:spacing w:after="40"/>
+            </w:pPr>
             <w:r>
+              <w:rPr>
+                <w:rFonts w:ascii="Arial" w:hAnsi="Arial" w:cs="Arial" w:eastAsia="Arial"/>
+                <w:b w:val="0"/>
+                <w:i w:val="0"/>
+                <w:sz w:val="20"/>
+              </w:rPr>
               <w:t>237</w:t>
             </w:r>
           </w:p>
@@ -1856,7 +3165,16 @@
             <w:tcW w:type="dxa" w:w="2160"/>
           </w:tcPr>
           <w:p>
+            <w:pPr>
+              <w:spacing w:after="40"/>
+            </w:pPr>
             <w:r>
+              <w:rPr>
+                <w:rFonts w:ascii="Arial" w:hAnsi="Arial" w:cs="Arial" w:eastAsia="Arial"/>
+                <w:b w:val="0"/>
+                <w:i w:val="0"/>
+                <w:sz w:val="20"/>
+              </w:rPr>
               <w:t>228</w:t>
             </w:r>
           </w:p>
@@ -1866,7 +3184,16 @@
             <w:tcW w:type="dxa" w:w="2160"/>
           </w:tcPr>
           <w:p>
+            <w:pPr>
+              <w:spacing w:after="40"/>
+            </w:pPr>
             <w:r>
+              <w:rPr>
+                <w:rFonts w:ascii="Arial" w:hAnsi="Arial" w:cs="Arial" w:eastAsia="Arial"/>
+                <w:b w:val="0"/>
+                <w:i w:val="0"/>
+                <w:sz w:val="20"/>
+              </w:rPr>
               <w:t>-3.8%</w:t>
             </w:r>
           </w:p>
@@ -1878,7 +3205,16 @@
             <w:tcW w:type="dxa" w:w="2160"/>
           </w:tcPr>
           <w:p>
+            <w:pPr>
+              <w:spacing w:after="40"/>
+            </w:pPr>
             <w:r>
+              <w:rPr>
+                <w:rFonts w:ascii="Arial" w:hAnsi="Arial" w:cs="Arial" w:eastAsia="Arial"/>
+                <w:b w:val="0"/>
+                <w:i w:val="0"/>
+                <w:sz w:val="20"/>
+              </w:rPr>
               <w:t>ALL</w:t>
             </w:r>
           </w:p>
@@ -1888,7 +3224,16 @@
             <w:tcW w:type="dxa" w:w="2160"/>
           </w:tcPr>
           <w:p>
+            <w:pPr>
+              <w:spacing w:after="40"/>
+            </w:pPr>
             <w:r>
+              <w:rPr>
+                <w:rFonts w:ascii="Arial" w:hAnsi="Arial" w:cs="Arial" w:eastAsia="Arial"/>
+                <w:b w:val="0"/>
+                <w:i w:val="0"/>
+                <w:sz w:val="20"/>
+              </w:rPr>
               <w:t>223</w:t>
             </w:r>
           </w:p>
@@ -1898,7 +3243,16 @@
             <w:tcW w:type="dxa" w:w="2160"/>
           </w:tcPr>
           <w:p>
+            <w:pPr>
+              <w:spacing w:after="40"/>
+            </w:pPr>
             <w:r>
+              <w:rPr>
+                <w:rFonts w:ascii="Arial" w:hAnsi="Arial" w:cs="Arial" w:eastAsia="Arial"/>
+                <w:b w:val="0"/>
+                <w:i w:val="0"/>
+                <w:sz w:val="20"/>
+              </w:rPr>
               <w:t>210</w:t>
             </w:r>
           </w:p>
@@ -1908,7 +3262,16 @@
             <w:tcW w:type="dxa" w:w="2160"/>
           </w:tcPr>
           <w:p>
+            <w:pPr>
+              <w:spacing w:after="40"/>
+            </w:pPr>
             <w:r>
+              <w:rPr>
+                <w:rFonts w:ascii="Arial" w:hAnsi="Arial" w:cs="Arial" w:eastAsia="Arial"/>
+                <w:b w:val="0"/>
+                <w:i w:val="0"/>
+                <w:sz w:val="20"/>
+              </w:rPr>
               <w:t>-5.8%</w:t>
             </w:r>
           </w:p>
@@ -1918,35 +3281,56 @@
     <w:p/>
     <w:p>
       <w:pPr>
-        <w:spacing w:before="320" w:after="120"/>
+        <w:spacing w:before="360" w:after="120"/>
       </w:pPr>
       <w:r>
         <w:rPr>
+          <w:rFonts w:ascii="Arial" w:hAnsi="Arial" w:cs="Arial" w:eastAsia="Arial"/>
           <w:b/>
-          <w:sz w:val="28"/>
+          <w:i w:val="0"/>
+          <w:sz w:val="30"/>
         </w:rPr>
         <w:t>5. KSP AB Test</w:t>
       </w:r>
     </w:p>
     <w:p>
+      <w:pPr>
+        <w:spacing w:before="240" w:after="120"/>
+      </w:pPr>
       <w:r>
         <w:rPr>
+          <w:rFonts w:ascii="Arial" w:hAnsi="Arial" w:cs="Arial" w:eastAsia="Arial"/>
           <w:b/>
-          <w:sz w:val="24"/>
+          <w:i w:val="0"/>
+          <w:sz w:val="25"/>
         </w:rPr>
         <w:t>5.1 实验设计</w:t>
       </w:r>
     </w:p>
     <w:p>
+      <w:pPr>
+        <w:spacing w:before="0" w:after="120"/>
+      </w:pPr>
       <w:r>
+        <w:rPr>
+          <w:rFonts w:ascii="Arial" w:hAnsi="Arial" w:cs="Arial" w:eastAsia="Arial"/>
+          <w:b w:val="0"/>
+          <w:i w:val="0"/>
+          <w:sz w:val="21"/>
+        </w:rPr>
         <w:t>使用sft_datagen_re/p0_ksp.py（4 步管线：用户画像→关键词→候选生成→评估），在 AIS GPU 集群对 1966 条商品分别用原始 / 清洗后 description 跑 KSP 生成，模型：Qwen2.5-7B-Instruct。</w:t>
       </w:r>
     </w:p>
     <w:p>
+      <w:pPr>
+        <w:spacing w:before="240" w:after="120"/>
+      </w:pPr>
       <w:r>
         <w:rPr>
+          <w:rFonts w:ascii="Arial" w:hAnsi="Arial" w:cs="Arial" w:eastAsia="Arial"/>
           <w:b/>
-          <w:sz w:val="24"/>
+          <w:i w:val="0"/>
+          <w:sz w:val="25"/>
         </w:rPr>
         <w:t>5.2 核心结果</w:t>
       </w:r>
@@ -1969,9 +3353,15 @@
             <w:tcW w:type="dxa" w:w="2160"/>
           </w:tcPr>
           <w:p>
+            <w:pPr>
+              <w:spacing w:after="40"/>
+            </w:pPr>
             <w:r>
               <w:rPr>
+                <w:rFonts w:ascii="Arial" w:hAnsi="Arial" w:cs="Arial" w:eastAsia="Arial"/>
                 <w:b/>
+                <w:i w:val="0"/>
+                <w:sz w:val="20"/>
               </w:rPr>
               <w:t>指标</w:t>
             </w:r>
@@ -1982,9 +3372,15 @@
             <w:tcW w:type="dxa" w:w="2160"/>
           </w:tcPr>
           <w:p>
+            <w:pPr>
+              <w:spacing w:after="40"/>
+            </w:pPr>
             <w:r>
               <w:rPr>
+                <w:rFonts w:ascii="Arial" w:hAnsi="Arial" w:cs="Arial" w:eastAsia="Arial"/>
                 <w:b/>
+                <w:i w:val="0"/>
+                <w:sz w:val="20"/>
               </w:rPr>
               <w:t>Control（原始）</w:t>
             </w:r>
@@ -1995,9 +3391,15 @@
             <w:tcW w:type="dxa" w:w="2160"/>
           </w:tcPr>
           <w:p>
+            <w:pPr>
+              <w:spacing w:after="40"/>
+            </w:pPr>
             <w:r>
               <w:rPr>
+                <w:rFonts w:ascii="Arial" w:hAnsi="Arial" w:cs="Arial" w:eastAsia="Arial"/>
                 <w:b/>
+                <w:i w:val="0"/>
+                <w:sz w:val="20"/>
               </w:rPr>
               <w:t>Treatment（清洗后）</w:t>
             </w:r>
@@ -2008,9 +3410,15 @@
             <w:tcW w:type="dxa" w:w="2160"/>
           </w:tcPr>
           <w:p>
+            <w:pPr>
+              <w:spacing w:after="40"/>
+            </w:pPr>
             <w:r>
               <w:rPr>
+                <w:rFonts w:ascii="Arial" w:hAnsi="Arial" w:cs="Arial" w:eastAsia="Arial"/>
                 <w:b/>
+                <w:i w:val="0"/>
+                <w:sz w:val="20"/>
               </w:rPr>
               <w:t>变化</w:t>
             </w:r>
@@ -2023,7 +3431,16 @@
             <w:tcW w:type="dxa" w:w="2160"/>
           </w:tcPr>
           <w:p>
+            <w:pPr>
+              <w:spacing w:after="40"/>
+            </w:pPr>
             <w:r>
+              <w:rPr>
+                <w:rFonts w:ascii="Arial" w:hAnsi="Arial" w:cs="Arial" w:eastAsia="Arial"/>
+                <w:b w:val="0"/>
+                <w:i w:val="0"/>
+                <w:sz w:val="20"/>
+              </w:rPr>
               <w:t>来自噪音的 KSP 词</w:t>
             </w:r>
           </w:p>
@@ -2033,7 +3450,16 @@
             <w:tcW w:type="dxa" w:w="2160"/>
           </w:tcPr>
           <w:p>
+            <w:pPr>
+              <w:spacing w:after="40"/>
+            </w:pPr>
             <w:r>
+              <w:rPr>
+                <w:rFonts w:ascii="Arial" w:hAnsi="Arial" w:cs="Arial" w:eastAsia="Arial"/>
+                <w:b w:val="0"/>
+                <w:i w:val="0"/>
+                <w:sz w:val="20"/>
+              </w:rPr>
               <w:t>0.010</w:t>
             </w:r>
           </w:p>
@@ -2043,7 +3469,16 @@
             <w:tcW w:type="dxa" w:w="2160"/>
           </w:tcPr>
           <w:p>
+            <w:pPr>
+              <w:spacing w:after="40"/>
+            </w:pPr>
             <w:r>
+              <w:rPr>
+                <w:rFonts w:ascii="Arial" w:hAnsi="Arial" w:cs="Arial" w:eastAsia="Arial"/>
+                <w:b w:val="0"/>
+                <w:i w:val="0"/>
+                <w:sz w:val="20"/>
+              </w:rPr>
               <w:t>0.003</w:t>
             </w:r>
           </w:p>
@@ -2053,7 +3488,16 @@
             <w:tcW w:type="dxa" w:w="2160"/>
           </w:tcPr>
           <w:p>
+            <w:pPr>
+              <w:spacing w:after="40"/>
+            </w:pPr>
             <w:r>
+              <w:rPr>
+                <w:rFonts w:ascii="Arial" w:hAnsi="Arial" w:cs="Arial" w:eastAsia="Arial"/>
+                <w:b w:val="0"/>
+                <w:i w:val="0"/>
+                <w:sz w:val="20"/>
+              </w:rPr>
               <w:t>-66.7%</w:t>
             </w:r>
           </w:p>
@@ -2065,7 +3509,16 @@
             <w:tcW w:type="dxa" w:w="2160"/>
           </w:tcPr>
           <w:p>
+            <w:pPr>
+              <w:spacing w:after="40"/>
+            </w:pPr>
             <w:r>
+              <w:rPr>
+                <w:rFonts w:ascii="Arial" w:hAnsi="Arial" w:cs="Arial" w:eastAsia="Arial"/>
+                <w:b w:val="0"/>
+                <w:i w:val="0"/>
+                <w:sz w:val="20"/>
+              </w:rPr>
               <w:t>TW 短语命中率</w:t>
             </w:r>
           </w:p>
@@ -2075,7 +3528,16 @@
             <w:tcW w:type="dxa" w:w="2160"/>
           </w:tcPr>
           <w:p>
+            <w:pPr>
+              <w:spacing w:after="40"/>
+            </w:pPr>
             <w:r>
+              <w:rPr>
+                <w:rFonts w:ascii="Arial" w:hAnsi="Arial" w:cs="Arial" w:eastAsia="Arial"/>
+                <w:b w:val="0"/>
+                <w:i w:val="0"/>
+                <w:sz w:val="20"/>
+              </w:rPr>
               <w:t>9.1%</w:t>
             </w:r>
           </w:p>
@@ -2085,7 +3547,16 @@
             <w:tcW w:type="dxa" w:w="2160"/>
           </w:tcPr>
           <w:p>
+            <w:pPr>
+              <w:spacing w:after="40"/>
+            </w:pPr>
             <w:r>
+              <w:rPr>
+                <w:rFonts w:ascii="Arial" w:hAnsi="Arial" w:cs="Arial" w:eastAsia="Arial"/>
+                <w:b w:val="0"/>
+                <w:i w:val="0"/>
+                <w:sz w:val="20"/>
+              </w:rPr>
               <w:t>9.2%</w:t>
             </w:r>
           </w:p>
@@ -2095,7 +3566,16 @@
             <w:tcW w:type="dxa" w:w="2160"/>
           </w:tcPr>
           <w:p>
+            <w:pPr>
+              <w:spacing w:after="40"/>
+            </w:pPr>
             <w:r>
+              <w:rPr>
+                <w:rFonts w:ascii="Arial" w:hAnsi="Arial" w:cs="Arial" w:eastAsia="Arial"/>
+                <w:b w:val="0"/>
+                <w:i w:val="0"/>
+                <w:sz w:val="20"/>
+              </w:rPr>
               <w:t>+0.9%</w:t>
             </w:r>
           </w:p>
@@ -2107,7 +3587,16 @@
             <w:tcW w:type="dxa" w:w="2160"/>
           </w:tcPr>
           <w:p>
+            <w:pPr>
+              <w:spacing w:after="40"/>
+            </w:pPr>
             <w:r>
+              <w:rPr>
+                <w:rFonts w:ascii="Arial" w:hAnsi="Arial" w:cs="Arial" w:eastAsia="Arial"/>
+                <w:b w:val="0"/>
+                <w:i w:val="0"/>
+                <w:sz w:val="20"/>
+              </w:rPr>
               <w:t>BR 覆盖曝光</w:t>
             </w:r>
           </w:p>
@@ -2117,7 +3606,16 @@
             <w:tcW w:type="dxa" w:w="2160"/>
           </w:tcPr>
           <w:p>
+            <w:pPr>
+              <w:spacing w:after="40"/>
+            </w:pPr>
             <w:r>
+              <w:rPr>
+                <w:rFonts w:ascii="Arial" w:hAnsi="Arial" w:cs="Arial" w:eastAsia="Arial"/>
+                <w:b w:val="0"/>
+                <w:i w:val="0"/>
+                <w:sz w:val="20"/>
+              </w:rPr>
               <w:t>1349M</w:t>
             </w:r>
           </w:p>
@@ -2127,7 +3625,16 @@
             <w:tcW w:type="dxa" w:w="2160"/>
           </w:tcPr>
           <w:p>
+            <w:pPr>
+              <w:spacing w:after="40"/>
+            </w:pPr>
             <w:r>
+              <w:rPr>
+                <w:rFonts w:ascii="Arial" w:hAnsi="Arial" w:cs="Arial" w:eastAsia="Arial"/>
+                <w:b w:val="0"/>
+                <w:i w:val="0"/>
+                <w:sz w:val="20"/>
+              </w:rPr>
               <w:t>1553M</w:t>
             </w:r>
           </w:p>
@@ -2137,7 +3644,16 @@
             <w:tcW w:type="dxa" w:w="2160"/>
           </w:tcPr>
           <w:p>
+            <w:pPr>
+              <w:spacing w:after="40"/>
+            </w:pPr>
             <w:r>
+              <w:rPr>
+                <w:rFonts w:ascii="Arial" w:hAnsi="Arial" w:cs="Arial" w:eastAsia="Arial"/>
+                <w:b w:val="0"/>
+                <w:i w:val="0"/>
+                <w:sz w:val="20"/>
+              </w:rPr>
               <w:t>+15.1%</w:t>
             </w:r>
           </w:p>
@@ -2149,7 +3665,16 @@
             <w:tcW w:type="dxa" w:w="2160"/>
           </w:tcPr>
           <w:p>
+            <w:pPr>
+              <w:spacing w:after="40"/>
+            </w:pPr>
             <w:r>
+              <w:rPr>
+                <w:rFonts w:ascii="Arial" w:hAnsi="Arial" w:cs="Arial" w:eastAsia="Arial"/>
+                <w:b w:val="0"/>
+                <w:i w:val="0"/>
+                <w:sz w:val="20"/>
+              </w:rPr>
               <w:t>TW Factscore</w:t>
             </w:r>
           </w:p>
@@ -2159,7 +3684,16 @@
             <w:tcW w:type="dxa" w:w="2160"/>
           </w:tcPr>
           <w:p>
+            <w:pPr>
+              <w:spacing w:after="40"/>
+            </w:pPr>
             <w:r>
+              <w:rPr>
+                <w:rFonts w:ascii="Arial" w:hAnsi="Arial" w:cs="Arial" w:eastAsia="Arial"/>
+                <w:b w:val="0"/>
+                <w:i w:val="0"/>
+                <w:sz w:val="20"/>
+              </w:rPr>
               <w:t>0.527</w:t>
             </w:r>
           </w:p>
@@ -2169,7 +3703,16 @@
             <w:tcW w:type="dxa" w:w="2160"/>
           </w:tcPr>
           <w:p>
+            <w:pPr>
+              <w:spacing w:after="40"/>
+            </w:pPr>
             <w:r>
+              <w:rPr>
+                <w:rFonts w:ascii="Arial" w:hAnsi="Arial" w:cs="Arial" w:eastAsia="Arial"/>
+                <w:b w:val="0"/>
+                <w:i w:val="0"/>
+                <w:sz w:val="20"/>
+              </w:rPr>
               <w:t>0.510</w:t>
             </w:r>
           </w:p>
@@ -2179,7 +3722,16 @@
             <w:tcW w:type="dxa" w:w="2160"/>
           </w:tcPr>
           <w:p>
+            <w:pPr>
+              <w:spacing w:after="40"/>
+            </w:pPr>
             <w:r>
+              <w:rPr>
+                <w:rFonts w:ascii="Arial" w:hAnsi="Arial" w:cs="Arial" w:eastAsia="Arial"/>
+                <w:b w:val="0"/>
+                <w:i w:val="0"/>
+                <w:sz w:val="20"/>
+              </w:rPr>
               <w:t>-1.6%</w:t>
             </w:r>
           </w:p>
@@ -2191,7 +3743,16 @@
             <w:tcW w:type="dxa" w:w="2160"/>
           </w:tcPr>
           <w:p>
+            <w:pPr>
+              <w:spacing w:after="40"/>
+            </w:pPr>
             <w:r>
+              <w:rPr>
+                <w:rFonts w:ascii="Arial" w:hAnsi="Arial" w:cs="Arial" w:eastAsia="Arial"/>
+                <w:b w:val="0"/>
+                <w:i w:val="0"/>
+                <w:sz w:val="20"/>
+              </w:rPr>
               <w:t>BR Factscore</w:t>
             </w:r>
           </w:p>
@@ -2201,7 +3762,16 @@
             <w:tcW w:type="dxa" w:w="2160"/>
           </w:tcPr>
           <w:p>
+            <w:pPr>
+              <w:spacing w:after="40"/>
+            </w:pPr>
             <w:r>
+              <w:rPr>
+                <w:rFonts w:ascii="Arial" w:hAnsi="Arial" w:cs="Arial" w:eastAsia="Arial"/>
+                <w:b w:val="0"/>
+                <w:i w:val="0"/>
+                <w:sz w:val="20"/>
+              </w:rPr>
               <w:t>0.747</w:t>
             </w:r>
           </w:p>
@@ -2211,7 +3781,16 @@
             <w:tcW w:type="dxa" w:w="2160"/>
           </w:tcPr>
           <w:p>
+            <w:pPr>
+              <w:spacing w:after="40"/>
+            </w:pPr>
             <w:r>
+              <w:rPr>
+                <w:rFonts w:ascii="Arial" w:hAnsi="Arial" w:cs="Arial" w:eastAsia="Arial"/>
+                <w:b w:val="0"/>
+                <w:i w:val="0"/>
+                <w:sz w:val="20"/>
+              </w:rPr>
               <w:t>0.748</w:t>
             </w:r>
           </w:p>
@@ -2221,7 +3800,16 @@
             <w:tcW w:type="dxa" w:w="2160"/>
           </w:tcPr>
           <w:p>
+            <w:pPr>
+              <w:spacing w:after="40"/>
+            </w:pPr>
             <w:r>
+              <w:rPr>
+                <w:rFonts w:ascii="Arial" w:hAnsi="Arial" w:cs="Arial" w:eastAsia="Arial"/>
+                <w:b w:val="0"/>
+                <w:i w:val="0"/>
+                <w:sz w:val="20"/>
+              </w:rPr>
               <w:t>+0.1%</w:t>
             </w:r>
           </w:p>
@@ -2231,23 +3819,30 @@
     <w:p/>
     <w:p>
       <w:pPr>
+        <w:spacing w:before="80" w:after="160"/>
         <w:ind w:left="576"/>
       </w:pPr>
       <w:r>
         <w:rPr>
+          <w:rFonts w:ascii="Arial" w:hAnsi="Arial" w:cs="Arial" w:eastAsia="Arial"/>
+          <w:b w:val="0"/>
+          <w:i w:val="0"/>
           <w:color w:val="374151"/>
+          <w:sz w:val="21"/>
         </w:rPr>
         <w:t>Treatment 组 KSP 噪音词来源减少 66.7%，搜索词覆盖中性偏正，Factscore 基本持平。</w:t>
       </w:r>
     </w:p>
     <w:p>
       <w:pPr>
-        <w:spacing w:before="320" w:after="120"/>
+        <w:spacing w:before="360" w:after="120"/>
       </w:pPr>
       <w:r>
         <w:rPr>
+          <w:rFonts w:ascii="Arial" w:hAnsi="Arial" w:cs="Arial" w:eastAsia="Arial"/>
           <w:b/>
-          <w:sz w:val="28"/>
+          <w:i w:val="0"/>
+          <w:sz w:val="30"/>
         </w:rPr>
         <w:t>6. 误删分析</w:t>
       </w:r>
@@ -2268,9 +3863,15 @@
             <w:tcW w:type="dxa" w:w="4320"/>
           </w:tcPr>
           <w:p>
+            <w:pPr>
+              <w:spacing w:after="40"/>
+            </w:pPr>
             <w:r>
               <w:rPr>
+                <w:rFonts w:ascii="Arial" w:hAnsi="Arial" w:cs="Arial" w:eastAsia="Arial"/>
                 <w:b/>
+                <w:i w:val="0"/>
+                <w:sz w:val="20"/>
               </w:rPr>
               <w:t>检查项</w:t>
             </w:r>
@@ -2281,9 +3882,15 @@
             <w:tcW w:type="dxa" w:w="4320"/>
           </w:tcPr>
           <w:p>
+            <w:pPr>
+              <w:spacing w:after="40"/>
+            </w:pPr>
             <w:r>
               <w:rPr>
+                <w:rFonts w:ascii="Arial" w:hAnsi="Arial" w:cs="Arial" w:eastAsia="Arial"/>
                 <w:b/>
+                <w:i w:val="0"/>
+                <w:sz w:val="20"/>
               </w:rPr>
               <w:t>结果</w:t>
             </w:r>
@@ -2296,7 +3903,16 @@
             <w:tcW w:type="dxa" w:w="4320"/>
           </w:tcPr>
           <w:p>
+            <w:pPr>
+              <w:spacing w:after="40"/>
+            </w:pPr>
             <w:r>
+              <w:rPr>
+                <w:rFonts w:ascii="Arial" w:hAnsi="Arial" w:cs="Arial" w:eastAsia="Arial"/>
+                <w:b w:val="0"/>
+                <w:i w:val="0"/>
+                <w:sz w:val="20"/>
+              </w:rPr>
               <w:t>规格数据误删</w:t>
             </w:r>
           </w:p>
@@ -2306,7 +3922,16 @@
             <w:tcW w:type="dxa" w:w="4320"/>
           </w:tcPr>
           <w:p>
+            <w:pPr>
+              <w:spacing w:after="40"/>
+            </w:pPr>
             <w:r>
+              <w:rPr>
+                <w:rFonts w:ascii="Arial" w:hAnsi="Arial" w:cs="Arial" w:eastAsia="Arial"/>
+                <w:b w:val="0"/>
+                <w:i w:val="0"/>
+                <w:sz w:val="20"/>
+              </w:rPr>
               <w:t>0 / 3993 = 0%</w:t>
             </w:r>
           </w:p>
@@ -2318,7 +3943,16 @@
             <w:tcW w:type="dxa" w:w="4320"/>
           </w:tcPr>
           <w:p>
+            <w:pPr>
+              <w:spacing w:after="40"/>
+            </w:pPr>
             <w:r>
+              <w:rPr>
+                <w:rFonts w:ascii="Arial" w:hAnsi="Arial" w:cs="Arial" w:eastAsia="Arial"/>
+                <w:b w:val="0"/>
+                <w:i w:val="0"/>
+                <w:sz w:val="20"/>
+              </w:rPr>
               <w:t>认证词误删</w:t>
             </w:r>
           </w:p>
@@ -2328,7 +3962,16 @@
             <w:tcW w:type="dxa" w:w="4320"/>
           </w:tcPr>
           <w:p>
+            <w:pPr>
+              <w:spacing w:after="40"/>
+            </w:pPr>
             <w:r>
+              <w:rPr>
+                <w:rFonts w:ascii="Arial" w:hAnsi="Arial" w:cs="Arial" w:eastAsia="Arial"/>
+                <w:b w:val="0"/>
+                <w:i w:val="0"/>
+                <w:sz w:val="20"/>
+              </w:rPr>
               <w:t>0 / 58 = 0%</w:t>
             </w:r>
           </w:p>
@@ -2340,7 +3983,16 @@
             <w:tcW w:type="dxa" w:w="4320"/>
           </w:tcPr>
           <w:p>
+            <w:pPr>
+              <w:spacing w:after="40"/>
+            </w:pPr>
             <w:r>
+              <w:rPr>
+                <w:rFonts w:ascii="Arial" w:hAnsi="Arial" w:cs="Arial" w:eastAsia="Arial"/>
+                <w:b w:val="0"/>
+                <w:i w:val="0"/>
+                <w:sz w:val="20"/>
+              </w:rPr>
               <w:t>引入额外换行</w:t>
             </w:r>
           </w:p>
@@ -2350,7 +4002,16 @@
             <w:tcW w:type="dxa" w:w="4320"/>
           </w:tcPr>
           <w:p>
+            <w:pPr>
+              <w:spacing w:after="40"/>
+            </w:pPr>
             <w:r>
+              <w:rPr>
+                <w:rFonts w:ascii="Arial" w:hAnsi="Arial" w:cs="Arial" w:eastAsia="Arial"/>
+                <w:b w:val="0"/>
+                <w:i w:val="0"/>
+                <w:sz w:val="20"/>
+              </w:rPr>
               <w:t>0 例</w:t>
             </w:r>
           </w:p>
@@ -2359,45 +4020,73 @@
     </w:tbl>
     <w:p/>
     <w:p>
+      <w:pPr>
+        <w:spacing w:before="0" w:after="120"/>
+      </w:pPr>
       <w:r>
+        <w:rPr>
+          <w:rFonts w:ascii="Arial" w:hAnsi="Arial" w:cs="Arial" w:eastAsia="Arial"/>
+          <w:b w:val="0"/>
+          <w:i w:val="0"/>
+          <w:sz w:val="21"/>
+        </w:rPr>
         <w:t>已知边界情况：</w:t>
       </w:r>
     </w:p>
     <w:p>
       <w:pPr>
         <w:pStyle w:val="ListBullet"/>
+        <w:spacing w:after="60"/>
       </w:pPr>
       <w:r>
+        <w:rPr>
+          <w:rFonts w:ascii="Arial" w:hAnsi="Arial" w:cs="Arial" w:eastAsia="Arial"/>
+          <w:b w:val="0"/>
+          <w:i w:val="0"/>
+          <w:sz w:val="21"/>
+        </w:rPr>
         <w:t>产品信息和物流信息混在同一长行（&gt;100字符）→ 整行保留（保守，可接受）</w:t>
       </w:r>
     </w:p>
     <w:p>
       <w:pPr>
         <w:pStyle w:val="ListBullet"/>
+        <w:spacing w:after="60"/>
       </w:pPr>
       <w:r>
+        <w:rPr>
+          <w:rFonts w:ascii="Arial" w:hAnsi="Arial" w:cs="Arial" w:eastAsia="Arial"/>
+          <w:b w:val="0"/>
+          <w:i w:val="0"/>
+          <w:sz w:val="21"/>
+        </w:rPr>
         <w:t>店铺优惠券行（點關注領取10元優惠券）→ 词库未覆盖，保留（已知漏检）</w:t>
       </w:r>
     </w:p>
     <w:p>
       <w:pPr>
-        <w:spacing w:before="320" w:after="120"/>
+        <w:spacing w:before="360" w:after="120"/>
       </w:pPr>
       <w:r>
         <w:rPr>
+          <w:rFonts w:ascii="Arial" w:hAnsi="Arial" w:cs="Arial" w:eastAsia="Arial"/>
           <w:b/>
-          <w:sz w:val="28"/>
+          <w:i w:val="0"/>
+          <w:sz w:val="30"/>
         </w:rPr>
         <w:t>7. 接入方式</w:t>
       </w:r>
     </w:p>
     <w:p>
       <w:pPr>
+        <w:spacing w:before="80" w:after="160"/>
         <w:ind w:left="432"/>
       </w:pPr>
       <w:r>
         <w:rPr>
-          <w:rFonts w:ascii="Courier New" w:hAnsi="Courier New"/>
+          <w:rFonts w:ascii="Courier New" w:hAnsi="Courier New" w:cs="Courier New" w:eastAsia="Courier New"/>
+          <w:b w:val="0"/>
+          <w:i w:val="0"/>
           <w:sz w:val="18"/>
         </w:rPr>
         <w:br/>
@@ -2411,22 +4100,43 @@
       </w:r>
     </w:p>
     <w:p>
+      <w:pPr>
+        <w:spacing w:before="0" w:after="120"/>
+      </w:pPr>
       <w:r>
+        <w:rPr>
+          <w:rFonts w:ascii="Arial" w:hAnsi="Arial" w:cs="Arial" w:eastAsia="Arial"/>
+          <w:b w:val="0"/>
+          <w:i w:val="0"/>
+          <w:sz w:val="21"/>
+        </w:rPr>
         <w:t>词库维护：修改reranker_sft_old/data/cleaning_keywords.json，无需改代码。</w:t>
       </w:r>
     </w:p>
     <w:p>
+      <w:pPr>
+        <w:spacing w:before="0" w:after="120"/>
+      </w:pPr>
       <w:r>
+        <w:rPr>
+          <w:rFonts w:ascii="Arial" w:hAnsi="Arial" w:cs="Arial" w:eastAsia="Arial"/>
+          <w:b w:val="0"/>
+          <w:i w:val="0"/>
+          <w:sz w:val="21"/>
+        </w:rPr>
         <w:t>接入 P0 KSP：在load_items后加一行：</w:t>
       </w:r>
     </w:p>
     <w:p>
       <w:pPr>
+        <w:spacing w:before="80" w:after="160"/>
         <w:ind w:left="432"/>
       </w:pPr>
       <w:r>
         <w:rPr>
-          <w:rFonts w:ascii="Courier New" w:hAnsi="Courier New"/>
+          <w:rFonts w:ascii="Courier New" w:hAnsi="Courier New" w:cs="Courier New" w:eastAsia="Courier New"/>
+          <w:b w:val="0"/>
+          <w:i w:val="0"/>
           <w:sz w:val="18"/>
         </w:rPr>
         <w:br/>
@@ -2440,12 +4150,14 @@
     </w:p>
     <w:p>
       <w:pPr>
-        <w:spacing w:before="320" w:after="120"/>
+        <w:spacing w:before="360" w:after="120"/>
       </w:pPr>
       <w:r>
         <w:rPr>
+          <w:rFonts w:ascii="Arial" w:hAnsi="Arial" w:cs="Arial" w:eastAsia="Arial"/>
           <w:b/>
-          <w:sz w:val="28"/>
+          <w:i w:val="0"/>
+          <w:sz w:val="30"/>
         </w:rPr>
         <w:t>8. 结论</w:t>
       </w:r>
@@ -2453,48 +4165,88 @@
     <w:p>
       <w:pPr>
         <w:pStyle w:val="ListBullet"/>
+        <w:spacing w:after="60"/>
       </w:pPr>
       <w:r>
+        <w:rPr>
+          <w:rFonts w:ascii="Arial" w:hAnsi="Arial" w:cs="Arial" w:eastAsia="Arial"/>
+          <w:b w:val="0"/>
+          <w:i w:val="0"/>
+          <w:sz w:val="21"/>
+        </w:rPr>
         <w:t>两阶段管线（预处理 + 行级过滤）设计简洁，逻辑清晰，易于维护</w:t>
       </w:r>
     </w:p>
     <w:p>
       <w:pPr>
         <w:pStyle w:val="ListBullet"/>
+        <w:spacing w:after="60"/>
       </w:pPr>
       <w:r>
+        <w:rPr>
+          <w:rFonts w:ascii="Arial" w:hAnsi="Arial" w:cs="Arial" w:eastAsia="Arial"/>
+          <w:b w:val="0"/>
+          <w:i w:val="0"/>
+          <w:sz w:val="21"/>
+        </w:rPr>
         <w:t>词库独立于代码（cleaning_keywords.json），扩展地区 / 增加关键词只改 JSON</w:t>
       </w:r>
     </w:p>
     <w:p>
       <w:pPr>
         <w:pStyle w:val="ListBullet"/>
+        <w:spacing w:after="60"/>
       </w:pPr>
       <w:r>
+        <w:rPr>
+          <w:rFonts w:ascii="Arial" w:hAnsi="Arial" w:cs="Arial" w:eastAsia="Arial"/>
+          <w:b w:val="0"/>
+          <w:i w:val="0"/>
+          <w:sz w:val="21"/>
+        </w:rPr>
         <w:t>规格/认证/产地保留率100%，无误删产品事实</w:t>
       </w:r>
     </w:p>
     <w:p>
       <w:pPr>
         <w:pStyle w:val="ListBullet"/>
+        <w:spacing w:after="60"/>
       </w:pPr>
       <w:r>
+        <w:rPr>
+          <w:rFonts w:ascii="Arial" w:hAnsi="Arial" w:cs="Arial" w:eastAsia="Arial"/>
+          <w:b w:val="0"/>
+          <w:i w:val="0"/>
+          <w:sz w:val="21"/>
+        </w:rPr>
         <w:t>KSP 噪音词来源减少66.7%，搜索覆盖中性偏正</w:t>
       </w:r>
     </w:p>
     <w:p>
       <w:pPr>
         <w:pStyle w:val="ListBullet"/>
+        <w:spacing w:after="60"/>
       </w:pPr>
       <w:r>
+        <w:rPr>
+          <w:rFonts w:ascii="Arial" w:hAnsi="Arial" w:cs="Arial" w:eastAsia="Arial"/>
+          <w:b w:val="0"/>
+          <w:i w:val="0"/>
+          <w:sz w:val="21"/>
+        </w:rPr>
         <w:t>TW 效果最显著（token 节省 16.1%）；建议优先在 TW 和 BR 上线</w:t>
       </w:r>
     </w:p>
     <w:p>
+      <w:pPr>
+        <w:spacing w:before="240" w:after="120"/>
+      </w:pPr>
       <w:r>
         <w:rPr>
+          <w:rFonts w:ascii="Arial" w:hAnsi="Arial" w:cs="Arial" w:eastAsia="Arial"/>
           <w:b/>
-          <w:sz w:val="24"/>
+          <w:i w:val="0"/>
+          <w:sz w:val="25"/>
         </w:rPr>
         <w:t>后续计划</w:t>
       </w:r>
@@ -2502,24 +4254,45 @@
     <w:p>
       <w:pPr>
         <w:pStyle w:val="ListBullet"/>
+        <w:spacing w:after="60"/>
       </w:pPr>
       <w:r>
+        <w:rPr>
+          <w:rFonts w:ascii="Arial" w:hAnsi="Arial" w:cs="Arial" w:eastAsia="Arial"/>
+          <w:b w:val="0"/>
+          <w:i w:val="0"/>
+          <w:sz w:val="21"/>
+        </w:rPr>
         <w:t>完成人工标注（200 条，标注工具），基于结果补充词库漏检项</w:t>
       </w:r>
     </w:p>
     <w:p>
       <w:pPr>
         <w:pStyle w:val="ListBullet"/>
+        <w:spacing w:after="60"/>
       </w:pPr>
       <w:r>
+        <w:rPr>
+          <w:rFonts w:ascii="Arial" w:hAnsi="Arial" w:cs="Arial" w:eastAsia="Arial"/>
+          <w:b w:val="0"/>
+          <w:i w:val="0"/>
+          <w:sz w:val="21"/>
+        </w:rPr>
         <w:t>正式接入 P0 KSP，上线 AB test 验证标题质量提升</w:t>
       </w:r>
     </w:p>
     <w:p>
       <w:pPr>
         <w:pStyle w:val="ListBullet"/>
+        <w:spacing w:after="60"/>
       </w:pPr>
       <w:r>
+        <w:rPr>
+          <w:rFonts w:ascii="Arial" w:hAnsi="Arial" w:cs="Arial" w:eastAsia="Arial"/>
+          <w:b w:val="0"/>
+          <w:i w:val="0"/>
+          <w:sz w:val="21"/>
+        </w:rPr>
         <w:t>根据各地区运营反馈持续迭代词库（cleaning_keywords.json）</w:t>
       </w:r>
     </w:p>
@@ -2897,8 +4670,7 @@
     <w:qFormat/>
     <w:rsid w:val="00FC693F"/>
     <w:rPr>
-      <w:rFonts w:ascii="Arial" w:hAnsi="Arial"/>
-      <w:sz w:val="21"/>
+      <w:rFonts w:ascii="Arial" w:hAnsi="Arial" w:cs="Arial" w:eastAsia="Arial"/>
     </w:rPr>
   </w:style>
   <w:style w:type="paragraph" w:styleId="Header">

</xml_diff>

<commit_message>
use Achuan-2 pandoc template for better styling
</commit_message>
<xml_diff>
--- a/cleaning_report.docx
+++ b/cleaning_report.docx
@@ -4,7 +4,7 @@
   <w:body>
     <w:p>
       <w:pPr>
-        <w:pStyle w:val="Title"/>
+        <w:pStyle w:val="a5"/>
       </w:pPr>
       <w:r>
         <w:t xml:space="preserve">Description </w:t>
@@ -16,10 +16,10 @@
         <w:t xml:space="preserve">清洗项目报告</w:t>
       </w:r>
     </w:p>
-    <w:bookmarkStart w:id="34" w:name="description-前置清洗方案"/>
-    <w:p>
-      <w:pPr>
-        <w:pStyle w:val="Heading1"/>
+    <w:bookmarkStart w:id="48" w:name="description-前置清洗方案"/>
+    <w:p>
+      <w:pPr>
+        <w:pStyle w:val="10"/>
       </w:pPr>
       <w:r>
         <w:t xml:space="preserve">Description </w:t>
@@ -51,10 +51,10 @@
         <w:t xml:space="preserve">团队</w:t>
       </w:r>
     </w:p>
-    <w:bookmarkStart w:id="9" w:name="动机"/>
-    <w:p>
-      <w:pPr>
-        <w:pStyle w:val="Heading2"/>
+    <w:bookmarkStart w:id="23" w:name="动机"/>
+    <w:p>
+      <w:pPr>
+        <w:pStyle w:val="20"/>
       </w:pPr>
       <w:r>
         <w:t xml:space="preserve">1. </w:t>
@@ -430,7 +430,7 @@
     </w:tbl>
     <w:p>
       <w:pPr>
-        <w:pStyle w:val="BodyText"/>
+        <w:pStyle w:val="a0"/>
       </w:pPr>
       <w:r>
         <w:rPr>
@@ -459,7 +459,7 @@
     </w:p>
     <w:p>
       <w:pPr>
-        <w:pStyle w:val="BlockText"/>
+        <w:pStyle w:val="a9"/>
       </w:pPr>
       <w:r>
         <w:rPr>
@@ -496,11 +496,11 @@
         <w:t xml:space="preserve">卖点。</w:t>
       </w:r>
     </w:p>
-    <w:bookmarkEnd w:id="9"/>
-    <w:bookmarkStart w:id="14" w:name="方案设计"/>
-    <w:p>
-      <w:pPr>
-        <w:pStyle w:val="Heading2"/>
+    <w:bookmarkEnd w:id="23"/>
+    <w:bookmarkStart w:id="28" w:name="方案设计"/>
+    <w:p>
+      <w:pPr>
+        <w:pStyle w:val="20"/>
       </w:pPr>
       <w:r>
         <w:t xml:space="preserve">2. </w:t>
@@ -512,10 +512,10 @@
         <w:t xml:space="preserve">方案设计</w:t>
       </w:r>
     </w:p>
-    <w:bookmarkStart w:id="10" w:name="设计原则"/>
-    <w:p>
-      <w:pPr>
-        <w:pStyle w:val="Heading3"/>
+    <w:bookmarkStart w:id="24" w:name="设计原则"/>
+    <w:p>
+      <w:pPr>
+        <w:pStyle w:val="3"/>
       </w:pPr>
       <w:r>
         <w:t xml:space="preserve">2.1 </w:t>
@@ -573,11 +573,11 @@
         <w:t xml:space="preserve">——含规格单位、型号、认证词、产地词的行，无论是否同时命中噪音关键词，强制保留</w:t>
       </w:r>
     </w:p>
-    <w:bookmarkEnd w:id="10"/>
-    <w:bookmarkStart w:id="11" w:name="两阶段管线"/>
-    <w:p>
-      <w:pPr>
-        <w:pStyle w:val="Heading3"/>
+    <w:bookmarkEnd w:id="24"/>
+    <w:bookmarkStart w:id="25" w:name="两阶段管线"/>
+    <w:p>
+      <w:pPr>
+        <w:pStyle w:val="3"/>
       </w:pPr>
       <w:r>
         <w:t xml:space="preserve">2.2 </w:t>
@@ -716,7 +716,7 @@
     </w:p>
     <w:p>
       <w:pPr>
-        <w:pStyle w:val="BodyText"/>
+        <w:pStyle w:val="a0"/>
       </w:pPr>
       <w:r>
         <w:rPr>
@@ -751,7 +751,7 @@
     </w:p>
     <w:p>
       <w:pPr>
-        <w:pStyle w:val="BodyText"/>
+        <w:pStyle w:val="a0"/>
       </w:pPr>
       <w:r>
         <w:rPr>
@@ -783,7 +783,7 @@
     </w:p>
     <w:p>
       <w:pPr>
-        <w:pStyle w:val="BodyText"/>
+        <w:pStyle w:val="a0"/>
       </w:pPr>
       <w:r>
         <w:rPr>
@@ -803,7 +803,7 @@
     </w:p>
     <w:p>
       <w:pPr>
-        <w:pStyle w:val="BodyText"/>
+        <w:pStyle w:val="a0"/>
       </w:pPr>
       <w:r>
         <w:rPr>
@@ -823,7 +823,7 @@
     </w:p>
     <w:p>
       <w:pPr>
-        <w:pStyle w:val="BodyText"/>
+        <w:pStyle w:val="a0"/>
       </w:pPr>
       <w:r>
         <w:rPr>
@@ -846,7 +846,7 @@
     </w:p>
     <w:p>
       <w:pPr>
-        <w:pStyle w:val="BodyText"/>
+        <w:pStyle w:val="a0"/>
       </w:pPr>
       <w:r>
         <w:rPr>
@@ -881,7 +881,7 @@
     </w:p>
     <w:p>
       <w:pPr>
-        <w:pStyle w:val="BodyText"/>
+        <w:pStyle w:val="a0"/>
       </w:pPr>
       <w:r>
         <w:rPr>
@@ -910,7 +910,7 @@
     </w:p>
     <w:p>
       <w:pPr>
-        <w:pStyle w:val="BodyText"/>
+        <w:pStyle w:val="a0"/>
       </w:pPr>
       <w:r>
         <w:rPr>
@@ -921,7 +921,7 @@
     </w:p>
     <w:p>
       <w:pPr>
-        <w:pStyle w:val="BodyText"/>
+        <w:pStyle w:val="a0"/>
       </w:pPr>
       <w:r>
         <w:rPr>
@@ -944,7 +944,7 @@
     </w:p>
     <w:p>
       <w:pPr>
-        <w:pStyle w:val="BodyText"/>
+        <w:pStyle w:val="a0"/>
       </w:pPr>
       <w:r>
         <w:rPr>
@@ -976,7 +976,7 @@
     </w:p>
     <w:p>
       <w:pPr>
-        <w:pStyle w:val="BodyText"/>
+        <w:pStyle w:val="a0"/>
       </w:pPr>
       <w:r>
         <w:rPr>
@@ -1008,7 +1008,7 @@
     </w:p>
     <w:p>
       <w:pPr>
-        <w:pStyle w:val="BodyText"/>
+        <w:pStyle w:val="a0"/>
       </w:pPr>
       <w:r>
         <w:rPr>
@@ -1043,7 +1043,7 @@
     </w:p>
     <w:p>
       <w:pPr>
-        <w:pStyle w:val="BodyText"/>
+        <w:pStyle w:val="a0"/>
       </w:pPr>
       <w:r>
         <w:rPr>
@@ -1090,7 +1090,7 @@
     </w:p>
     <w:p>
       <w:pPr>
-        <w:pStyle w:val="BodyText"/>
+        <w:pStyle w:val="a0"/>
       </w:pPr>
       <w:r>
         <w:rPr>
@@ -1117,11 +1117,11 @@
         <w:t xml:space="preserve">宁可留多</w:t>
       </w:r>
     </w:p>
-    <w:bookmarkEnd w:id="11"/>
-    <w:bookmarkStart w:id="12" w:name="行级过滤逻辑"/>
-    <w:p>
-      <w:pPr>
-        <w:pStyle w:val="Heading3"/>
+    <w:bookmarkEnd w:id="25"/>
+    <w:bookmarkStart w:id="26" w:name="行级过滤逻辑"/>
+    <w:p>
+      <w:pPr>
+        <w:pStyle w:val="3"/>
       </w:pPr>
       <w:r>
         <w:t xml:space="preserve">2.3 </w:t>
@@ -1353,11 +1353,11 @@
         <w:t xml:space="preserve">字符的行不删，防止误删产品事实。</w:t>
       </w:r>
     </w:p>
-    <w:bookmarkEnd w:id="12"/>
-    <w:bookmarkStart w:id="13" w:name="词库结构cleaning_keywords.json"/>
-    <w:p>
-      <w:pPr>
-        <w:pStyle w:val="Heading3"/>
+    <w:bookmarkEnd w:id="26"/>
+    <w:bookmarkStart w:id="27" w:name="词库结构cleaning_keywords.json"/>
+    <w:p>
+      <w:pPr>
+        <w:pStyle w:val="3"/>
       </w:pPr>
       <w:r>
         <w:t xml:space="preserve">2.4 </w:t>
@@ -1748,7 +1748,7 @@
     </w:tbl>
     <w:p>
       <w:pPr>
-        <w:pStyle w:val="BodyText"/>
+        <w:pStyle w:val="a0"/>
       </w:pPr>
       <w:r>
         <w:t xml:space="preserve">6 </w:t>
@@ -2443,12 +2443,12 @@
         </w:tc>
       </w:tr>
     </w:tbl>
-    <w:bookmarkEnd w:id="13"/>
-    <w:bookmarkEnd w:id="14"/>
-    <w:bookmarkStart w:id="20" w:name="case-示例"/>
-    <w:p>
-      <w:pPr>
-        <w:pStyle w:val="Heading2"/>
+    <w:bookmarkEnd w:id="27"/>
+    <w:bookmarkEnd w:id="28"/>
+    <w:bookmarkStart w:id="34" w:name="case-示例"/>
+    <w:p>
+      <w:pPr>
+        <w:pStyle w:val="20"/>
       </w:pPr>
       <w:r>
         <w:t xml:space="preserve">3. Case </w:t>
@@ -2460,10 +2460,10 @@
         <w:t xml:space="preserve">示例</w:t>
       </w:r>
     </w:p>
-    <w:bookmarkStart w:id="15" w:name="物流删除-规格保护-id"/>
-    <w:p>
-      <w:pPr>
-        <w:pStyle w:val="Heading3"/>
+    <w:bookmarkStart w:id="29" w:name="物流删除-规格保护-id"/>
+    <w:p>
+      <w:pPr>
+        <w:pStyle w:val="3"/>
       </w:pPr>
       <w:r>
         <w:rPr>
@@ -2512,7 +2512,7 @@
     </w:p>
     <w:p>
       <w:pPr>
-        <w:pStyle w:val="BodyText"/>
+        <w:pStyle w:val="a0"/>
       </w:pPr>
       <w:r>
         <w:rPr>
@@ -2524,11 +2524,11 @@
         <w:t xml:space="preserve">Berat bersih 500g</w:t>
       </w:r>
     </w:p>
-    <w:bookmarkEnd w:id="15"/>
-    <w:bookmarkStart w:id="16" w:name="客服-型号保护-sg"/>
-    <w:p>
-      <w:pPr>
-        <w:pStyle w:val="Heading3"/>
+    <w:bookmarkEnd w:id="29"/>
+    <w:bookmarkStart w:id="30" w:name="客服-型号保护-sg"/>
+    <w:p>
+      <w:pPr>
+        <w:pStyle w:val="3"/>
       </w:pPr>
       <w:r>
         <w:rPr>
@@ -2577,7 +2577,7 @@
     </w:p>
     <w:p>
       <w:pPr>
-        <w:pStyle w:val="BodyText"/>
+        <w:pStyle w:val="a0"/>
       </w:pPr>
       <w:r>
         <w:rPr>
@@ -2595,11 +2595,11 @@
         <w:t xml:space="preserve">40mm Driver</w:t>
       </w:r>
     </w:p>
-    <w:bookmarkEnd w:id="16"/>
-    <w:bookmarkStart w:id="17" w:name="产地保护-id"/>
-    <w:p>
-      <w:pPr>
-        <w:pStyle w:val="Heading3"/>
+    <w:bookmarkEnd w:id="30"/>
+    <w:bookmarkStart w:id="31" w:name="产地保护-id"/>
+    <w:p>
+      <w:pPr>
+        <w:pStyle w:val="3"/>
       </w:pPr>
       <w:r>
         <w:rPr>
@@ -2658,7 +2658,7 @@
     </w:p>
     <w:p>
       <w:pPr>
-        <w:pStyle w:val="BodyText"/>
+        <w:pStyle w:val="a0"/>
       </w:pPr>
       <w:r>
         <w:rPr>
@@ -2670,11 +2670,11 @@
         <w:t xml:space="preserve">Teh terbaik dari perkebunan Kerinci, Sumatera</w:t>
       </w:r>
     </w:p>
-    <w:bookmarkEnd w:id="17"/>
-    <w:bookmarkStart w:id="18" w:name="长度保护混合内容id"/>
-    <w:p>
-      <w:pPr>
-        <w:pStyle w:val="Heading3"/>
+    <w:bookmarkEnd w:id="31"/>
+    <w:bookmarkStart w:id="32" w:name="长度保护混合内容id"/>
+    <w:p>
+      <w:pPr>
+        <w:pStyle w:val="3"/>
       </w:pPr>
       <w:r>
         <w:rPr>
@@ -2708,7 +2708,7 @@
     </w:p>
     <w:p>
       <w:pPr>
-        <w:pStyle w:val="BodyText"/>
+        <w:pStyle w:val="a0"/>
       </w:pPr>
       <w:r>
         <w:rPr>
@@ -2722,7 +2722,7 @@
     </w:p>
     <w:p>
       <w:pPr>
-        <w:pStyle w:val="BodyText"/>
+        <w:pStyle w:val="a0"/>
       </w:pPr>
       <w:r>
         <w:t xml:space="preserve">↑ </w:t>
@@ -2743,11 +2743,11 @@
         <w:t xml:space="preserve">字符，整行保留</w:t>
       </w:r>
     </w:p>
-    <w:bookmarkEnd w:id="18"/>
-    <w:bookmarkStart w:id="19" w:name="退换货-规格保护-tw"/>
-    <w:p>
-      <w:pPr>
-        <w:pStyle w:val="Heading3"/>
+    <w:bookmarkEnd w:id="32"/>
+    <w:bookmarkStart w:id="33" w:name="退换货-规格保护-tw"/>
+    <w:p>
+      <w:pPr>
+        <w:pStyle w:val="3"/>
       </w:pPr>
       <w:r>
         <w:rPr>
@@ -2820,7 +2820,7 @@
     </w:p>
     <w:p>
       <w:pPr>
-        <w:pStyle w:val="BodyText"/>
+        <w:pStyle w:val="a0"/>
       </w:pPr>
       <w:r>
         <w:rPr>
@@ -2859,12 +2859,12 @@
         <w:t xml:space="preserve"> 25cm x 15cm</w:t>
       </w:r>
     </w:p>
-    <w:bookmarkEnd w:id="19"/>
-    <w:bookmarkEnd w:id="20"/>
-    <w:bookmarkStart w:id="25" w:name="验证结果"/>
-    <w:p>
-      <w:pPr>
-        <w:pStyle w:val="Heading2"/>
+    <w:bookmarkEnd w:id="33"/>
+    <w:bookmarkEnd w:id="34"/>
+    <w:bookmarkStart w:id="39" w:name="验证结果"/>
+    <w:p>
+      <w:pPr>
+        <w:pStyle w:val="20"/>
       </w:pPr>
       <w:r>
         <w:t xml:space="preserve">4. </w:t>
@@ -2876,10 +2876,10 @@
         <w:t xml:space="preserve">验证结果</w:t>
       </w:r>
     </w:p>
-    <w:bookmarkStart w:id="21" w:name="清洗质量8000-条-每地区-1000-条"/>
-    <w:p>
-      <w:pPr>
-        <w:pStyle w:val="Heading3"/>
+    <w:bookmarkStart w:id="35" w:name="清洗质量8000-条-每地区-1000-条"/>
+    <w:p>
+      <w:pPr>
+        <w:pStyle w:val="3"/>
       </w:pPr>
       <w:r>
         <w:t xml:space="preserve">4.1 </w:t>
@@ -2928,7 +2928,7 @@
     </w:p>
     <w:p>
       <w:pPr>
-        <w:pStyle w:val="BodyText"/>
+        <w:pStyle w:val="a0"/>
       </w:pPr>
       <w:r>
         <w:rPr>
@@ -2945,7 +2945,7 @@
     </w:p>
     <w:p>
       <w:pPr>
-        <w:pStyle w:val="BodyText"/>
+        <w:pStyle w:val="a0"/>
       </w:pPr>
       <w:r>
         <w:t xml:space="preserve">100%</w:t>
@@ -2953,7 +2953,7 @@
     </w:p>
     <w:p>
       <w:pPr>
-        <w:pStyle w:val="BodyText"/>
+        <w:pStyle w:val="a0"/>
       </w:pPr>
       <w:r>
         <w:rPr>
@@ -2970,7 +2970,7 @@
     </w:p>
     <w:p>
       <w:pPr>
-        <w:pStyle w:val="BodyText"/>
+        <w:pStyle w:val="a0"/>
       </w:pPr>
       <w:r>
         <w:t xml:space="preserve">0</w:t>
@@ -2978,7 +2978,7 @@
     </w:p>
     <w:p>
       <w:pPr>
-        <w:pStyle w:val="BodyText"/>
+        <w:pStyle w:val="a0"/>
       </w:pPr>
       <w:r>
         <w:rPr>
@@ -2989,7 +2989,7 @@
     </w:p>
     <w:p>
       <w:pPr>
-        <w:pStyle w:val="BodyText"/>
+        <w:pStyle w:val="a0"/>
       </w:pPr>
       <w:r>
         <w:t xml:space="preserve">4.7%</w:t>
@@ -2997,7 +2997,7 @@
     </w:p>
     <w:p>
       <w:pPr>
-        <w:pStyle w:val="BodyText"/>
+        <w:pStyle w:val="a0"/>
       </w:pPr>
       <w:r>
         <w:rPr>
@@ -3006,11 +3006,11 @@
         <w:t xml:space="preserve">总删除率</w:t>
       </w:r>
     </w:p>
-    <w:bookmarkEnd w:id="21"/>
-    <w:bookmarkStart w:id="22" w:name="各阶段删除占比"/>
-    <w:p>
-      <w:pPr>
-        <w:pStyle w:val="Heading3"/>
+    <w:bookmarkEnd w:id="35"/>
+    <w:bookmarkStart w:id="36" w:name="各阶段删除占比"/>
+    <w:p>
+      <w:pPr>
+        <w:pStyle w:val="3"/>
       </w:pPr>
       <w:r>
         <w:t xml:space="preserve">4.2 </w:t>
@@ -3193,11 +3193,11 @@
         </w:tc>
       </w:tr>
     </w:tbl>
-    <w:bookmarkEnd w:id="22"/>
-    <w:bookmarkStart w:id="23" w:name="地区差异"/>
-    <w:p>
-      <w:pPr>
-        <w:pStyle w:val="Heading3"/>
+    <w:bookmarkEnd w:id="36"/>
+    <w:bookmarkStart w:id="37" w:name="地区差异"/>
+    <w:p>
+      <w:pPr>
+        <w:pStyle w:val="3"/>
       </w:pPr>
       <w:r>
         <w:t xml:space="preserve">4.3 </w:t>
@@ -3566,11 +3566,11 @@
         </w:tc>
       </w:tr>
     </w:tbl>
-    <w:bookmarkEnd w:id="23"/>
-    <w:bookmarkStart w:id="24" w:name="token-长度分析qwen-tokenizer"/>
-    <w:p>
-      <w:pPr>
-        <w:pStyle w:val="Heading3"/>
+    <w:bookmarkEnd w:id="37"/>
+    <w:bookmarkStart w:id="38" w:name="token-长度分析qwen-tokenizer"/>
+    <w:p>
+      <w:pPr>
+        <w:pStyle w:val="3"/>
       </w:pPr>
       <w:r>
         <w:t xml:space="preserve">4.4 Token </w:t>
@@ -3859,21 +3859,21 @@
         </w:tc>
       </w:tr>
     </w:tbl>
-    <w:bookmarkEnd w:id="24"/>
-    <w:bookmarkEnd w:id="25"/>
-    <w:bookmarkStart w:id="28" w:name="ksp-ab-test"/>
-    <w:p>
-      <w:pPr>
-        <w:pStyle w:val="Heading2"/>
+    <w:bookmarkEnd w:id="38"/>
+    <w:bookmarkEnd w:id="39"/>
+    <w:bookmarkStart w:id="42" w:name="ksp-ab-test"/>
+    <w:p>
+      <w:pPr>
+        <w:pStyle w:val="20"/>
       </w:pPr>
       <w:r>
         <w:t xml:space="preserve">5. KSP AB Test</w:t>
       </w:r>
     </w:p>
-    <w:bookmarkStart w:id="26" w:name="实验设计"/>
-    <w:p>
-      <w:pPr>
-        <w:pStyle w:val="Heading3"/>
+    <w:bookmarkStart w:id="40" w:name="实验设计"/>
+    <w:p>
+      <w:pPr>
+        <w:pStyle w:val="3"/>
       </w:pPr>
       <w:r>
         <w:t xml:space="preserve">5.1 </w:t>
@@ -3965,11 +3965,11 @@
         <w:t xml:space="preserve">生成，模型：Qwen2.5-7B-Instruct。</w:t>
       </w:r>
     </w:p>
-    <w:bookmarkEnd w:id="26"/>
-    <w:bookmarkStart w:id="27" w:name="核心结果"/>
-    <w:p>
-      <w:pPr>
-        <w:pStyle w:val="Heading3"/>
+    <w:bookmarkEnd w:id="40"/>
+    <w:bookmarkStart w:id="41" w:name="核心结果"/>
+    <w:p>
+      <w:pPr>
+        <w:pStyle w:val="3"/>
       </w:pPr>
       <w:r>
         <w:t xml:space="preserve">5.2 </w:t>
@@ -4315,7 +4315,7 @@
     </w:tbl>
     <w:p>
       <w:pPr>
-        <w:pStyle w:val="BlockText"/>
+        <w:pStyle w:val="a9"/>
       </w:pPr>
       <w:r>
         <w:t xml:space="preserve">Treatment </w:t>
@@ -4354,12 +4354,12 @@
         <w:t xml:space="preserve">基本持平。</w:t>
       </w:r>
     </w:p>
-    <w:bookmarkEnd w:id="27"/>
-    <w:bookmarkEnd w:id="28"/>
-    <w:bookmarkStart w:id="29" w:name="误删分析"/>
-    <w:p>
-      <w:pPr>
-        <w:pStyle w:val="Heading2"/>
+    <w:bookmarkEnd w:id="41"/>
+    <w:bookmarkEnd w:id="42"/>
+    <w:bookmarkStart w:id="43" w:name="误删分析"/>
+    <w:p>
+      <w:pPr>
+        <w:pStyle w:val="20"/>
       </w:pPr>
       <w:r>
         <w:t xml:space="preserve">6. </w:t>
@@ -4518,7 +4518,7 @@
     </w:tbl>
     <w:p>
       <w:pPr>
-        <w:pStyle w:val="BodyText"/>
+        <w:pStyle w:val="a0"/>
       </w:pPr>
       <w:r>
         <w:rPr>
@@ -4588,11 +4588,11 @@
         <w:t xml:space="preserve">词库未覆盖，保留（已知漏检）</w:t>
       </w:r>
     </w:p>
-    <w:bookmarkEnd w:id="29"/>
-    <w:bookmarkStart w:id="30" w:name="接入方式"/>
-    <w:p>
-      <w:pPr>
-        <w:pStyle w:val="Heading2"/>
+    <w:bookmarkEnd w:id="43"/>
+    <w:bookmarkStart w:id="44" w:name="接入方式"/>
+    <w:p>
+      <w:pPr>
+        <w:pStyle w:val="20"/>
       </w:pPr>
       <w:r>
         <w:t xml:space="preserve">7. </w:t>
@@ -4667,7 +4667,7 @@
     </w:p>
     <w:p>
       <w:pPr>
-        <w:pStyle w:val="BodyText"/>
+        <w:pStyle w:val="a0"/>
       </w:pPr>
       <w:r>
         <w:rPr>
@@ -4735,11 +4735,11 @@
         <w:t xml:space="preserve">)</w:t>
       </w:r>
     </w:p>
-    <w:bookmarkEnd w:id="30"/>
-    <w:bookmarkStart w:id="33" w:name="结论"/>
-    <w:p>
-      <w:pPr>
-        <w:pStyle w:val="Heading2"/>
+    <w:bookmarkEnd w:id="44"/>
+    <w:bookmarkStart w:id="47" w:name="结论"/>
+    <w:p>
+      <w:pPr>
+        <w:pStyle w:val="20"/>
       </w:pPr>
       <w:r>
         <w:t xml:space="preserve">8. </w:t>
@@ -4944,10 +4944,10 @@
         <w:t xml:space="preserve">上线</w:t>
       </w:r>
     </w:p>
-    <w:bookmarkStart w:id="32" w:name="后续计划"/>
-    <w:p>
-      <w:pPr>
-        <w:pStyle w:val="Heading3"/>
+    <w:bookmarkStart w:id="46" w:name="后续计划"/>
+    <w:p>
+      <w:pPr>
+        <w:pStyle w:val="3"/>
       </w:pPr>
       <w:r>
         <w:rPr>
@@ -4979,10 +4979,10 @@
         </w:rPr>
         <w:t xml:space="preserve">条，</w:t>
       </w:r>
-      <w:hyperlink r:id="rId31">
+      <w:hyperlink r:id="rId45">
         <w:r>
           <w:rPr>
-            <w:rStyle w:val="Hyperlink"/>
+            <w:rStyle w:val="ae"/>
             <w:rFonts w:hint="eastAsia"/>
           </w:rPr>
           <w:t xml:space="preserve">标注工具</w:t>
@@ -5055,13 +5055,15 @@
         <w:t xml:space="preserve">）</w:t>
       </w:r>
     </w:p>
-    <w:bookmarkEnd w:id="32"/>
-    <w:bookmarkEnd w:id="33"/>
-    <w:bookmarkEnd w:id="34"/>
+    <w:bookmarkEnd w:id="46"/>
+    <w:bookmarkEnd w:id="47"/>
+    <w:bookmarkEnd w:id="48"/>
     <w:sectPr>
-      <w:footnotePr>
-        <w:numRestart w:val="eachSect"/>
-      </w:footnotePr>
+      <w:footerReference r:id="rId14" w:type="default"/>
+      <w:pgSz w:code="9" w:h="16838" w:w="11906"/>
+      <w:pgMar w:bottom="1440" w:footer="720" w:gutter="0" w:header="720" w:left="1800" w:right="1800" w:top="1440"/>
+      <w:cols w:space="720"/>
+      <w:docGrid w:linePitch="326"/>
     </w:sectPr>
   </w:body>
 </w:document>
@@ -5071,6 +5073,51 @@
 <w:comments xmlns:w="http://schemas.openxmlformats.org/wordprocessingml/2006/main" xmlns:m="http://schemas.openxmlformats.org/officeDocument/2006/math" xmlns:r="http://schemas.openxmlformats.org/officeDocument/2006/relationships" xmlns:o="urn:schemas-microsoft-com:office:office" xmlns:v="urn:schemas-microsoft-com:vml" xmlns:w10="urn:schemas-microsoft-com:office:word" xmlns:a="http://schemas.openxmlformats.org/drawingml/2006/main" xmlns:pic="http://schemas.openxmlformats.org/drawingml/2006/picture" xmlns:wp="http://schemas.openxmlformats.org/drawingml/2006/wordprocessingDrawing"/>
 </file>
 
+<file path=word/footer1.xml><?xml version="1.0" encoding="utf-8"?>
+<w:ftr xmlns:wpc="http://schemas.microsoft.com/office/word/2010/wordprocessingCanvas" xmlns:cx="http://schemas.microsoft.com/office/drawing/2014/chartex" xmlns:cx1="http://schemas.microsoft.com/office/drawing/2015/9/8/chartex" xmlns:cx2="http://schemas.microsoft.com/office/drawing/2015/10/21/chartex" xmlns:cx3="http://schemas.microsoft.com/office/drawing/2016/5/9/chartex" xmlns:cx4="http://schemas.microsoft.com/office/drawing/2016/5/10/chartex" xmlns:cx5="http://schemas.microsoft.com/office/drawing/2016/5/11/chartex" xmlns:cx6="http://schemas.microsoft.com/office/drawing/2016/5/12/chartex" xmlns:cx7="http://schemas.microsoft.com/office/drawing/2016/5/13/chartex" xmlns:cx8="http://schemas.microsoft.com/office/drawing/2016/5/14/chartex" xmlns:mc="http://schemas.openxmlformats.org/markup-compatibility/2006" xmlns:aink="http://schemas.microsoft.com/office/drawing/2016/ink" xmlns:am3d="http://schemas.microsoft.com/office/drawing/2017/model3d" xmlns:o="urn:schemas-microsoft-com:office:office" xmlns:oel="http://schemas.microsoft.com/office/2019/extlst" xmlns:r="http://schemas.openxmlformats.org/officeDocument/2006/relationships" xmlns:m="http://schemas.openxmlformats.org/officeDocument/2006/math" xmlns:v="urn:schemas-microsoft-com:vml" xmlns:wp14="http://schemas.microsoft.com/office/word/2010/wordprocessingDrawing" xmlns:wp="http://schemas.openxmlformats.org/drawingml/2006/wordprocessingDrawing" xmlns:w10="urn:schemas-microsoft-com:office:word" xmlns:w="http://schemas.openxmlformats.org/wordprocessingml/2006/main" xmlns:w14="http://schemas.microsoft.com/office/word/2010/wordml" xmlns:w15="http://schemas.microsoft.com/office/word/2012/wordml" xmlns:w16cex="http://schemas.microsoft.com/office/word/2018/wordml/cex" xmlns:w16cid="http://schemas.microsoft.com/office/word/2016/wordml/cid" xmlns:w16="http://schemas.microsoft.com/office/word/2018/wordml" xmlns:w16du="http://schemas.microsoft.com/office/word/2023/wordml/word16du" xmlns:w16sdtdh="http://schemas.microsoft.com/office/word/2020/wordml/sdtdatahash" xmlns:w16sdtfl="http://schemas.microsoft.com/office/word/2024/wordml/sdtformatlock" xmlns:w16se="http://schemas.microsoft.com/office/word/2015/wordml/symex" xmlns:wpg="http://schemas.microsoft.com/office/word/2010/wordprocessingGroup" xmlns:wpi="http://schemas.microsoft.com/office/word/2010/wordprocessingInk" xmlns:wne="http://schemas.microsoft.com/office/word/2006/wordml" xmlns:wps="http://schemas.microsoft.com/office/word/2010/wordprocessingShape" mc:Ignorable="w14 w15 w16se w16cid w16 w16cex w16sdtdh w16sdtfl w16du wp14">
+  <w:sdt>
+    <w:sdtPr>
+      <w:id w:val="-1363818139"/>
+      <w:docPartObj>
+        <w:docPartGallery w:val="Page Numbers (Bottom of Page)"/>
+        <w:docPartUnique/>
+      </w:docPartObj>
+    </w:sdtPr>
+    <w:sdtContent>
+      <w:p>
+        <w:pPr>
+          <w:pStyle w:val="af1"/>
+          <w:jc w:val="center"/>
+        </w:pPr>
+        <w:r>
+          <w:fldChar w:fldCharType="begin"/>
+        </w:r>
+        <w:r>
+          <w:instrText>PAGE   \* MERGEFORMAT</w:instrText>
+        </w:r>
+        <w:r>
+          <w:fldChar w:fldCharType="separate"/>
+        </w:r>
+        <w:r>
+          <w:rPr>
+            <w:lang w:val="zh-CN" w:eastAsia="zh-CN"/>
+          </w:rPr>
+          <w:t>2</w:t>
+        </w:r>
+        <w:r>
+          <w:fldChar w:fldCharType="end"/>
+        </w:r>
+      </w:p>
+    </w:sdtContent>
+  </w:sdt>
+  <w:p>
+    <w:pPr>
+      <w:pStyle w:val="af1"/>
+    </w:pPr>
+  </w:p>
+</w:ftr>
+</file>
+
 <file path=word/footnotes.xml><?xml version="1.0" encoding="utf-8"?>
 <w:footnotes xmlns:w="http://schemas.openxmlformats.org/wordprocessingml/2006/main" xmlns:m="http://schemas.openxmlformats.org/officeDocument/2006/math" xmlns:r="http://schemas.openxmlformats.org/officeDocument/2006/relationships" xmlns:o="urn:schemas-microsoft-com:office:office" xmlns:v="urn:schemas-microsoft-com:vml" xmlns:w10="urn:schemas-microsoft-com:office:word" xmlns:a="http://schemas.openxmlformats.org/drawingml/2006/main" xmlns:pic="http://schemas.openxmlformats.org/drawingml/2006/picture" xmlns:wp="http://schemas.openxmlformats.org/drawingml/2006/wordprocessingDrawing">
   <w:footnote w:type="continuationSeparator" w:id="0">
@@ -5091,7 +5138,669 @@
 </file>
 
 <file path=word/numbering.xml><?xml version="1.0" encoding="utf-8"?>
-<w:numbering xmlns:w="http://schemas.openxmlformats.org/wordprocessingml/2006/main">
+<w:numbering xmlns:aink="http://schemas.microsoft.com/office/drawing/2016/ink" xmlns:am3d="http://schemas.microsoft.com/office/drawing/2017/model3d" xmlns:cx="http://schemas.microsoft.com/office/drawing/2014/chartex" xmlns:cx1="http://schemas.microsoft.com/office/drawing/2015/9/8/chartex" xmlns:cx2="http://schemas.microsoft.com/office/drawing/2015/10/21/chartex" xmlns:cx3="http://schemas.microsoft.com/office/drawing/2016/5/9/chartex" xmlns:cx4="http://schemas.microsoft.com/office/drawing/2016/5/10/chartex" xmlns:cx5="http://schemas.microsoft.com/office/drawing/2016/5/11/chartex" xmlns:cx6="http://schemas.microsoft.com/office/drawing/2016/5/12/chartex" xmlns:cx7="http://schemas.microsoft.com/office/drawing/2016/5/13/chartex" xmlns:cx8="http://schemas.microsoft.com/office/drawing/2016/5/14/chartex" xmlns:m="http://schemas.openxmlformats.org/officeDocument/2006/math" xmlns:mc="http://schemas.openxmlformats.org/markup-compatibility/2006" xmlns:o="urn:schemas-microsoft-com:office:office" xmlns:oel="http://schemas.microsoft.com/office/2019/extlst" xmlns:r="http://schemas.openxmlformats.org/officeDocument/2006/relationships" xmlns:v="urn:schemas-microsoft-com:vml" xmlns:w="http://schemas.openxmlformats.org/wordprocessingml/2006/main" xmlns:w10="urn:schemas-microsoft-com:office:word" xmlns:w14="http://schemas.microsoft.com/office/word/2010/wordml" xmlns:w15="http://schemas.microsoft.com/office/word/2012/wordml" xmlns:w16="http://schemas.microsoft.com/office/word/2018/wordml" xmlns:w16cex="http://schemas.microsoft.com/office/word/2018/wordml/cex" xmlns:w16cid="http://schemas.microsoft.com/office/word/2016/wordml/cid" xmlns:w16du="http://schemas.microsoft.com/office/word/2023/wordml/word16du" xmlns:w16sdtdh="http://schemas.microsoft.com/office/word/2020/wordml/sdtdatahash" xmlns:w16sdtfl="http://schemas.microsoft.com/office/word/2024/wordml/sdtformatlock" xmlns:w16se="http://schemas.microsoft.com/office/word/2015/wordml/symex" xmlns:wne="http://schemas.microsoft.com/office/word/2006/wordml" xmlns:wp="http://schemas.openxmlformats.org/drawingml/2006/wordprocessingDrawing" xmlns:wp14="http://schemas.microsoft.com/office/word/2010/wordprocessingDrawing" xmlns:wpc="http://schemas.microsoft.com/office/word/2010/wordprocessingCanvas" xmlns:wpg="http://schemas.microsoft.com/office/word/2010/wordprocessingGroup" xmlns:wpi="http://schemas.microsoft.com/office/word/2010/wordprocessingInk" xmlns:wps="http://schemas.microsoft.com/office/word/2010/wordprocessingShape" mc:Ignorable="w14 w15 w16se w16cid w16 w16cex w16sdtdh w16sdtfl w16du wp14">
+  <w:abstractNum w15:restartNumberingAfterBreak="0" w:abstractNumId="0">
+    <w:nsid w:val="0000A990"/>
+    <w:multiLevelType w:val="multilevel"/>
+    <w:tmpl w:val="F7DE9768"/>
+    <w:lvl w:ilvl="0">
+      <w:numFmt w:val="bullet"/>
+      <w:lvlText w:val=" "/>
+      <w:lvlJc w:val="left"/>
+      <w:pPr>
+        <w:ind w:hanging="480" w:left="720"/>
+      </w:pPr>
+    </w:lvl>
+    <w:lvl w:ilvl="1">
+      <w:numFmt w:val="bullet"/>
+      <w:lvlText w:val=" "/>
+      <w:lvlJc w:val="left"/>
+      <w:pPr>
+        <w:ind w:hanging="480" w:left="1440"/>
+      </w:pPr>
+    </w:lvl>
+    <w:lvl w:ilvl="2">
+      <w:numFmt w:val="bullet"/>
+      <w:lvlText w:val=" "/>
+      <w:lvlJc w:val="left"/>
+      <w:pPr>
+        <w:ind w:hanging="480" w:left="2160"/>
+      </w:pPr>
+    </w:lvl>
+    <w:lvl w:ilvl="3">
+      <w:numFmt w:val="bullet"/>
+      <w:lvlText w:val=" "/>
+      <w:lvlJc w:val="left"/>
+      <w:pPr>
+        <w:ind w:hanging="480" w:left="2880"/>
+      </w:pPr>
+    </w:lvl>
+    <w:lvl w:ilvl="4">
+      <w:numFmt w:val="bullet"/>
+      <w:lvlText w:val=" "/>
+      <w:lvlJc w:val="left"/>
+      <w:pPr>
+        <w:ind w:hanging="480" w:left="3600"/>
+      </w:pPr>
+    </w:lvl>
+    <w:lvl w:ilvl="5">
+      <w:numFmt w:val="bullet"/>
+      <w:lvlText w:val=" "/>
+      <w:lvlJc w:val="left"/>
+      <w:pPr>
+        <w:ind w:hanging="480" w:left="4320"/>
+      </w:pPr>
+    </w:lvl>
+    <w:lvl w:ilvl="6">
+      <w:numFmt w:val="bullet"/>
+      <w:lvlText w:val=" "/>
+      <w:lvlJc w:val="left"/>
+      <w:pPr>
+        <w:ind w:hanging="480" w:left="5040"/>
+      </w:pPr>
+    </w:lvl>
+    <w:lvl w:ilvl="7">
+      <w:numFmt w:val="bullet"/>
+      <w:lvlText w:val=" "/>
+      <w:lvlJc w:val="left"/>
+      <w:pPr>
+        <w:ind w:hanging="480" w:left="5760"/>
+      </w:pPr>
+    </w:lvl>
+    <w:lvl w:ilvl="8">
+      <w:numFmt w:val="bullet"/>
+      <w:lvlText w:val=" "/>
+      <w:lvlJc w:val="left"/>
+      <w:pPr>
+        <w:ind w:hanging="480" w:left="6480"/>
+      </w:pPr>
+    </w:lvl>
+  </w:abstractNum>
+  <w:abstractNum w15:restartNumberingAfterBreak="0" w:abstractNumId="1">
+    <w:nsid w:val="0000A991"/>
+    <w:multiLevelType w:val="multilevel"/>
+    <w:tmpl w:val="AC362672"/>
+    <w:lvl w:ilvl="0">
+      <w:numFmt w:val="bullet"/>
+      <w:suff w:val="space"/>
+      <w:lvlText w:val="•"/>
+      <w:lvlJc w:val="left"/>
+      <w:pPr>
+        <w:ind w:firstLine="0" w:left="567"/>
+      </w:pPr>
+      <w:rPr>
+        <w:rFonts w:ascii="微软雅黑" w:eastAsia="微软雅黑" w:hAnsi="微软雅黑" w:hint="eastAsia"/>
+        <w:sz w:val="28"/>
+      </w:rPr>
+    </w:lvl>
+    <w:lvl w:ilvl="1">
+      <w:numFmt w:val="bullet"/>
+      <w:suff w:val="space"/>
+      <w:lvlText w:val=""/>
+      <w:lvlJc w:val="left"/>
+      <w:pPr>
+        <w:ind w:firstLine="0" w:left="1134"/>
+      </w:pPr>
+      <w:rPr>
+        <w:rFonts w:ascii="Wingdings" w:hAnsi="Wingdings" w:hint="default"/>
+        <w:sz w:val="28"/>
+      </w:rPr>
+    </w:lvl>
+    <w:lvl w:ilvl="2">
+      <w:numFmt w:val="bullet"/>
+      <w:suff w:val="space"/>
+      <w:lvlText w:val=""/>
+      <w:lvlJc w:val="left"/>
+      <w:pPr>
+        <w:ind w:firstLine="0" w:left="1701"/>
+      </w:pPr>
+      <w:rPr>
+        <w:rFonts w:ascii="Wingdings" w:hAnsi="Wingdings" w:hint="default"/>
+        <w:sz w:val="28"/>
+      </w:rPr>
+    </w:lvl>
+    <w:lvl w:ilvl="3">
+      <w:numFmt w:val="bullet"/>
+      <w:suff w:val="space"/>
+      <w:lvlText w:val="•"/>
+      <w:lvlJc w:val="left"/>
+      <w:pPr>
+        <w:ind w:firstLine="0" w:left="2268"/>
+      </w:pPr>
+      <w:rPr>
+        <w:rFonts w:ascii="微软雅黑" w:eastAsia="微软雅黑" w:hAnsi="微软雅黑" w:hint="eastAsia"/>
+        <w:sz w:val="28"/>
+      </w:rPr>
+    </w:lvl>
+    <w:lvl w:ilvl="4">
+      <w:numFmt w:val="bullet"/>
+      <w:suff w:val="space"/>
+      <w:lvlText w:val="•"/>
+      <w:lvlJc w:val="left"/>
+      <w:pPr>
+        <w:ind w:firstLine="0" w:left="2835"/>
+      </w:pPr>
+      <w:rPr>
+        <w:rFonts w:ascii="微软雅黑" w:eastAsia="微软雅黑" w:hAnsi="微软雅黑" w:hint="eastAsia"/>
+        <w:sz w:val="28"/>
+      </w:rPr>
+    </w:lvl>
+    <w:lvl w:ilvl="5">
+      <w:numFmt w:val="bullet"/>
+      <w:suff w:val="space"/>
+      <w:lvlText w:val="•"/>
+      <w:lvlJc w:val="left"/>
+      <w:pPr>
+        <w:ind w:firstLine="0" w:left="3402"/>
+      </w:pPr>
+      <w:rPr>
+        <w:rFonts w:hint="eastAsia"/>
+        <w:sz w:val="28"/>
+      </w:rPr>
+    </w:lvl>
+    <w:lvl w:ilvl="6">
+      <w:numFmt w:val="bullet"/>
+      <w:suff w:val="space"/>
+      <w:lvlText w:val="•"/>
+      <w:lvlJc w:val="left"/>
+      <w:pPr>
+        <w:ind w:firstLine="0" w:left="3969"/>
+      </w:pPr>
+      <w:rPr>
+        <w:rFonts w:hint="eastAsia"/>
+        <w:sz w:val="28"/>
+      </w:rPr>
+    </w:lvl>
+    <w:lvl w:ilvl="7">
+      <w:numFmt w:val="bullet"/>
+      <w:suff w:val="space"/>
+      <w:lvlText w:val="•"/>
+      <w:lvlJc w:val="left"/>
+      <w:pPr>
+        <w:ind w:firstLine="0" w:left="4536"/>
+      </w:pPr>
+      <w:rPr>
+        <w:rFonts w:hint="eastAsia"/>
+        <w:sz w:val="28"/>
+      </w:rPr>
+    </w:lvl>
+    <w:lvl w:ilvl="8">
+      <w:numFmt w:val="bullet"/>
+      <w:suff w:val="space"/>
+      <w:lvlText w:val="•"/>
+      <w:lvlJc w:val="left"/>
+      <w:pPr>
+        <w:ind w:firstLine="0" w:left="5103"/>
+      </w:pPr>
+      <w:rPr>
+        <w:rFonts w:hint="eastAsia"/>
+        <w:sz w:val="28"/>
+      </w:rPr>
+    </w:lvl>
+  </w:abstractNum>
+  <w:abstractNum w15:restartNumberingAfterBreak="0" w:abstractNumId="2">
+    <w:nsid w:val="00A99201"/>
+    <w:multiLevelType w:val="multilevel"/>
+    <w:tmpl w:val="2140DE3A"/>
+    <w:lvl w:ilvl="0">
+      <w:start w:val="1"/>
+      <w:numFmt w:val="decimal"/>
+      <w:suff w:val="space"/>
+      <w:lvlText w:val="%1."/>
+      <w:lvlJc w:val="right"/>
+      <w:pPr>
+        <w:ind w:firstLine="198" w:left="567"/>
+      </w:pPr>
+      <w:rPr>
+        <w:rFonts w:hint="eastAsia"/>
+      </w:rPr>
+    </w:lvl>
+    <w:lvl w:ilvl="1">
+      <w:start w:val="1"/>
+      <w:numFmt w:val="decimal"/>
+      <w:suff w:val="space"/>
+      <w:lvlText w:val="%2)"/>
+      <w:lvlJc w:val="right"/>
+      <w:pPr>
+        <w:ind w:firstLine="198" w:left="1134"/>
+      </w:pPr>
+      <w:rPr>
+        <w:rFonts w:hint="eastAsia"/>
+      </w:rPr>
+    </w:lvl>
+    <w:lvl w:ilvl="2">
+      <w:start w:val="1"/>
+      <w:numFmt w:val="upperLetter"/>
+      <w:suff w:val="space"/>
+      <w:lvlText w:val="%3."/>
+      <w:lvlJc w:val="right"/>
+      <w:pPr>
+        <w:ind w:firstLine="198" w:left="1701"/>
+      </w:pPr>
+      <w:rPr>
+        <w:rFonts w:hint="eastAsia"/>
+      </w:rPr>
+    </w:lvl>
+    <w:lvl w:ilvl="3">
+      <w:start w:val="1"/>
+      <w:numFmt w:val="lowerLetter"/>
+      <w:suff w:val="space"/>
+      <w:lvlText w:val="%4."/>
+      <w:lvlJc w:val="right"/>
+      <w:pPr>
+        <w:ind w:firstLine="198" w:left="2268"/>
+      </w:pPr>
+      <w:rPr>
+        <w:rFonts w:hint="eastAsia"/>
+      </w:rPr>
+    </w:lvl>
+    <w:lvl w:ilvl="4">
+      <w:start w:val="1"/>
+      <w:numFmt w:val="decimal"/>
+      <w:suff w:val="space"/>
+      <w:lvlText w:val="%5."/>
+      <w:lvlJc w:val="right"/>
+      <w:pPr>
+        <w:ind w:firstLine="198" w:left="2835"/>
+      </w:pPr>
+      <w:rPr>
+        <w:rFonts w:hint="eastAsia"/>
+      </w:rPr>
+    </w:lvl>
+    <w:lvl w:ilvl="5">
+      <w:start w:val="1"/>
+      <w:numFmt w:val="decimal"/>
+      <w:suff w:val="space"/>
+      <w:lvlText w:val="%6)"/>
+      <w:lvlJc w:val="right"/>
+      <w:pPr>
+        <w:ind w:firstLine="198" w:left="3402"/>
+      </w:pPr>
+      <w:rPr>
+        <w:rFonts w:hint="eastAsia"/>
+      </w:rPr>
+    </w:lvl>
+    <w:lvl w:ilvl="6">
+      <w:start w:val="1"/>
+      <w:numFmt w:val="upperLetter"/>
+      <w:suff w:val="space"/>
+      <w:lvlText w:val="%7."/>
+      <w:lvlJc w:val="right"/>
+      <w:pPr>
+        <w:ind w:firstLine="198" w:left="3969"/>
+      </w:pPr>
+      <w:rPr>
+        <w:rFonts w:hint="eastAsia"/>
+      </w:rPr>
+    </w:lvl>
+    <w:lvl w:ilvl="7">
+      <w:start w:val="1"/>
+      <w:numFmt w:val="lowerLetter"/>
+      <w:suff w:val="space"/>
+      <w:lvlText w:val="%8."/>
+      <w:lvlJc w:val="right"/>
+      <w:pPr>
+        <w:ind w:firstLine="198" w:left="4536"/>
+      </w:pPr>
+      <w:rPr>
+        <w:rFonts w:hint="eastAsia"/>
+      </w:rPr>
+    </w:lvl>
+    <w:lvl w:ilvl="8">
+      <w:start w:val="1"/>
+      <w:numFmt w:val="lowerRoman"/>
+      <w:suff w:val="space"/>
+      <w:lvlText w:val="%9."/>
+      <w:lvlJc w:val="right"/>
+      <w:pPr>
+        <w:ind w:firstLine="198" w:left="5103"/>
+      </w:pPr>
+      <w:rPr>
+        <w:rFonts w:hint="eastAsia"/>
+      </w:rPr>
+    </w:lvl>
+  </w:abstractNum>
+  <w:abstractNum w15:restartNumberingAfterBreak="0" w:abstractNumId="3">
+    <w:nsid w:val="289471C0"/>
+    <w:multiLevelType w:val="hybridMultilevel"/>
+    <w:tmpl w:val="1FD8214E"/>
+    <w:lvl w:ilvl="0" w:tplc="04090001">
+      <w:start w:val="1"/>
+      <w:numFmt w:val="bullet"/>
+      <w:lvlText w:val=""/>
+      <w:lvlJc w:val="left"/>
+      <w:pPr>
+        <w:ind w:hanging="440" w:left="920"/>
+      </w:pPr>
+      <w:rPr>
+        <w:rFonts w:ascii="Wingdings" w:hAnsi="Wingdings" w:hint="default"/>
+      </w:rPr>
+    </w:lvl>
+    <w:lvl w:ilvl="1" w:tentative="1" w:tplc="04090003">
+      <w:start w:val="1"/>
+      <w:numFmt w:val="bullet"/>
+      <w:lvlText w:val=""/>
+      <w:lvlJc w:val="left"/>
+      <w:pPr>
+        <w:ind w:hanging="440" w:left="1360"/>
+      </w:pPr>
+      <w:rPr>
+        <w:rFonts w:ascii="Wingdings" w:hAnsi="Wingdings" w:hint="default"/>
+      </w:rPr>
+    </w:lvl>
+    <w:lvl w:ilvl="2" w:tentative="1" w:tplc="04090005">
+      <w:start w:val="1"/>
+      <w:numFmt w:val="bullet"/>
+      <w:lvlText w:val=""/>
+      <w:lvlJc w:val="left"/>
+      <w:pPr>
+        <w:ind w:hanging="440" w:left="1800"/>
+      </w:pPr>
+      <w:rPr>
+        <w:rFonts w:ascii="Wingdings" w:hAnsi="Wingdings" w:hint="default"/>
+      </w:rPr>
+    </w:lvl>
+    <w:lvl w:ilvl="3" w:tentative="1" w:tplc="04090001">
+      <w:start w:val="1"/>
+      <w:numFmt w:val="bullet"/>
+      <w:lvlText w:val=""/>
+      <w:lvlJc w:val="left"/>
+      <w:pPr>
+        <w:ind w:hanging="440" w:left="2240"/>
+      </w:pPr>
+      <w:rPr>
+        <w:rFonts w:ascii="Wingdings" w:hAnsi="Wingdings" w:hint="default"/>
+      </w:rPr>
+    </w:lvl>
+    <w:lvl w:ilvl="4" w:tentative="1" w:tplc="04090003">
+      <w:start w:val="1"/>
+      <w:numFmt w:val="bullet"/>
+      <w:lvlText w:val=""/>
+      <w:lvlJc w:val="left"/>
+      <w:pPr>
+        <w:ind w:hanging="440" w:left="2680"/>
+      </w:pPr>
+      <w:rPr>
+        <w:rFonts w:ascii="Wingdings" w:hAnsi="Wingdings" w:hint="default"/>
+      </w:rPr>
+    </w:lvl>
+    <w:lvl w:ilvl="5" w:tentative="1" w:tplc="04090005">
+      <w:start w:val="1"/>
+      <w:numFmt w:val="bullet"/>
+      <w:lvlText w:val=""/>
+      <w:lvlJc w:val="left"/>
+      <w:pPr>
+        <w:ind w:hanging="440" w:left="3120"/>
+      </w:pPr>
+      <w:rPr>
+        <w:rFonts w:ascii="Wingdings" w:hAnsi="Wingdings" w:hint="default"/>
+      </w:rPr>
+    </w:lvl>
+    <w:lvl w:ilvl="6" w:tentative="1" w:tplc="04090001">
+      <w:start w:val="1"/>
+      <w:numFmt w:val="bullet"/>
+      <w:lvlText w:val=""/>
+      <w:lvlJc w:val="left"/>
+      <w:pPr>
+        <w:ind w:hanging="440" w:left="3560"/>
+      </w:pPr>
+      <w:rPr>
+        <w:rFonts w:ascii="Wingdings" w:hAnsi="Wingdings" w:hint="default"/>
+      </w:rPr>
+    </w:lvl>
+    <w:lvl w:ilvl="7" w:tentative="1" w:tplc="04090003">
+      <w:start w:val="1"/>
+      <w:numFmt w:val="bullet"/>
+      <w:lvlText w:val=""/>
+      <w:lvlJc w:val="left"/>
+      <w:pPr>
+        <w:ind w:hanging="440" w:left="4000"/>
+      </w:pPr>
+      <w:rPr>
+        <w:rFonts w:ascii="Wingdings" w:hAnsi="Wingdings" w:hint="default"/>
+      </w:rPr>
+    </w:lvl>
+    <w:lvl w:ilvl="8" w:tentative="1" w:tplc="04090005">
+      <w:start w:val="1"/>
+      <w:numFmt w:val="bullet"/>
+      <w:lvlText w:val=""/>
+      <w:lvlJc w:val="left"/>
+      <w:pPr>
+        <w:ind w:hanging="440" w:left="4440"/>
+      </w:pPr>
+      <w:rPr>
+        <w:rFonts w:ascii="Wingdings" w:hAnsi="Wingdings" w:hint="default"/>
+      </w:rPr>
+    </w:lvl>
+  </w:abstractNum>
+  <w:abstractNum w15:restartNumberingAfterBreak="0" w:abstractNumId="4">
+    <w:nsid w:val="2BC278D3"/>
+    <w:multiLevelType w:val="multilevel"/>
+    <w:tmpl w:val="5262CB2E"/>
+    <w:styleLink w:val="1"/>
+    <w:lvl w:ilvl="0">
+      <w:numFmt w:val="bullet"/>
+      <w:lvlText w:val="•"/>
+      <w:lvlJc w:val="left"/>
+      <w:pPr>
+        <w:ind w:hanging="480" w:left="720"/>
+      </w:pPr>
+      <w:rPr>
+        <w:rFonts w:ascii="微软雅黑" w:eastAsia="微软雅黑" w:hAnsi="微软雅黑" w:hint="eastAsia"/>
+        <w:sz w:val="28"/>
+      </w:rPr>
+    </w:lvl>
+    <w:lvl w:ilvl="1">
+      <w:numFmt w:val="bullet"/>
+      <w:lvlText w:val=""/>
+      <w:lvlJc w:val="left"/>
+      <w:pPr>
+        <w:ind w:hanging="480" w:left="1440"/>
+      </w:pPr>
+      <w:rPr>
+        <w:rFonts w:ascii="Wingdings" w:eastAsia="微软雅黑" w:hAnsi="Wingdings" w:hint="default"/>
+        <w:sz w:val="28"/>
+      </w:rPr>
+    </w:lvl>
+    <w:lvl w:ilvl="2">
+      <w:numFmt w:val="bullet"/>
+      <w:lvlText w:val=""/>
+      <w:lvlJc w:val="left"/>
+      <w:pPr>
+        <w:ind w:hanging="480" w:left="2160"/>
+      </w:pPr>
+      <w:rPr>
+        <w:rFonts w:ascii="Wingdings" w:eastAsia="微软雅黑" w:hAnsi="Wingdings" w:hint="default"/>
+        <w:sz w:val="28"/>
+      </w:rPr>
+    </w:lvl>
+    <w:lvl w:ilvl="3">
+      <w:numFmt w:val="bullet"/>
+      <w:lvlText w:val="•"/>
+      <w:lvlJc w:val="left"/>
+      <w:pPr>
+        <w:ind w:hanging="480" w:left="2880"/>
+      </w:pPr>
+      <w:rPr>
+        <w:rFonts w:ascii="微软雅黑" w:eastAsia="微软雅黑" w:hAnsi="微软雅黑" w:hint="eastAsia"/>
+        <w:sz w:val="28"/>
+      </w:rPr>
+    </w:lvl>
+    <w:lvl w:ilvl="4">
+      <w:numFmt w:val="bullet"/>
+      <w:lvlText w:val="•"/>
+      <w:lvlJc w:val="left"/>
+      <w:pPr>
+        <w:ind w:hanging="480" w:left="3600"/>
+      </w:pPr>
+      <w:rPr>
+        <w:rFonts w:ascii="微软雅黑" w:eastAsia="微软雅黑" w:hAnsi="微软雅黑" w:hint="eastAsia"/>
+        <w:sz w:val="28"/>
+      </w:rPr>
+    </w:lvl>
+    <w:lvl w:ilvl="5">
+      <w:numFmt w:val="bullet"/>
+      <w:lvlText w:val="•"/>
+      <w:lvlJc w:val="left"/>
+      <w:pPr>
+        <w:ind w:hanging="480" w:left="4320"/>
+      </w:pPr>
+      <w:rPr>
+        <w:rFonts w:eastAsia="微软雅黑" w:hint="eastAsia"/>
+        <w:sz w:val="28"/>
+      </w:rPr>
+    </w:lvl>
+    <w:lvl w:ilvl="6">
+      <w:numFmt w:val="bullet"/>
+      <w:lvlText w:val="•"/>
+      <w:lvlJc w:val="left"/>
+      <w:pPr>
+        <w:ind w:hanging="480" w:left="5040"/>
+      </w:pPr>
+      <w:rPr>
+        <w:rFonts w:eastAsia="微软雅黑"/>
+        <w:sz w:val="28"/>
+      </w:rPr>
+    </w:lvl>
+    <w:lvl w:ilvl="7">
+      <w:numFmt w:val="bullet"/>
+      <w:lvlText w:val="•"/>
+      <w:lvlJc w:val="left"/>
+      <w:pPr>
+        <w:ind w:hanging="480" w:left="5760"/>
+      </w:pPr>
+      <w:rPr>
+        <w:rFonts w:eastAsia="微软雅黑" w:hint="eastAsia"/>
+        <w:sz w:val="28"/>
+      </w:rPr>
+    </w:lvl>
+    <w:lvl w:ilvl="8">
+      <w:numFmt w:val="bullet"/>
+      <w:lvlText w:val="•"/>
+      <w:lvlJc w:val="left"/>
+      <w:pPr>
+        <w:ind w:hanging="480" w:left="6480"/>
+      </w:pPr>
+      <w:rPr>
+        <w:rFonts w:eastAsia="微软雅黑" w:hint="eastAsia"/>
+        <w:sz w:val="28"/>
+      </w:rPr>
+    </w:lvl>
+  </w:abstractNum>
+  <w:abstractNum w15:restartNumberingAfterBreak="0" w:abstractNumId="5">
+    <w:nsid w:val="553929AC"/>
+    <w:multiLevelType w:val="multilevel"/>
+    <w:tmpl w:val="22C0AC60"/>
+    <w:styleLink w:val="2"/>
+    <w:lvl w:ilvl="0">
+      <w:start w:val="1"/>
+      <w:numFmt w:val="decimal"/>
+      <w:lvlText w:val="%1."/>
+      <w:lvlJc w:val="left"/>
+      <w:pPr>
+        <w:ind w:hanging="480" w:left="1440"/>
+      </w:pPr>
+      <w:rPr>
+        <w:rFonts w:hint="eastAsia"/>
+      </w:rPr>
+    </w:lvl>
+    <w:lvl w:ilvl="1">
+      <w:start w:val="1"/>
+      <w:numFmt w:val="decimal"/>
+      <w:lvlText w:val="%2)"/>
+      <w:lvlJc w:val="left"/>
+      <w:pPr>
+        <w:ind w:hanging="480" w:left="2160"/>
+      </w:pPr>
+      <w:rPr>
+        <w:rFonts w:hint="eastAsia"/>
+      </w:rPr>
+    </w:lvl>
+    <w:lvl w:ilvl="2">
+      <w:start w:val="1"/>
+      <w:numFmt w:val="upperLetter"/>
+      <w:lvlText w:val="%3."/>
+      <w:lvlJc w:val="left"/>
+      <w:pPr>
+        <w:ind w:hanging="480" w:left="2880"/>
+      </w:pPr>
+      <w:rPr>
+        <w:rFonts w:hint="eastAsia"/>
+      </w:rPr>
+    </w:lvl>
+    <w:lvl w:ilvl="3">
+      <w:start w:val="1"/>
+      <w:numFmt w:val="lowerLetter"/>
+      <w:lvlText w:val="%4."/>
+      <w:lvlJc w:val="left"/>
+      <w:pPr>
+        <w:ind w:hanging="480" w:left="3600"/>
+      </w:pPr>
+      <w:rPr>
+        <w:rFonts w:hint="eastAsia"/>
+      </w:rPr>
+    </w:lvl>
+    <w:lvl w:ilvl="4">
+      <w:start w:val="1"/>
+      <w:numFmt w:val="decimal"/>
+      <w:lvlText w:val="%5."/>
+      <w:lvlJc w:val="left"/>
+      <w:pPr>
+        <w:ind w:hanging="480" w:left="4320"/>
+      </w:pPr>
+      <w:rPr>
+        <w:rFonts w:hint="eastAsia"/>
+      </w:rPr>
+    </w:lvl>
+    <w:lvl w:ilvl="5">
+      <w:start w:val="1"/>
+      <w:numFmt w:val="decimal"/>
+      <w:lvlText w:val="%6)"/>
+      <w:lvlJc w:val="left"/>
+      <w:pPr>
+        <w:ind w:hanging="480" w:left="5040"/>
+      </w:pPr>
+      <w:rPr>
+        <w:rFonts w:hint="eastAsia"/>
+      </w:rPr>
+    </w:lvl>
+    <w:lvl w:ilvl="6">
+      <w:start w:val="1"/>
+      <w:numFmt w:val="upperLetter"/>
+      <w:lvlText w:val="%7."/>
+      <w:lvlJc w:val="left"/>
+      <w:pPr>
+        <w:ind w:hanging="480" w:left="5760"/>
+      </w:pPr>
+      <w:rPr>
+        <w:rFonts w:hint="eastAsia"/>
+      </w:rPr>
+    </w:lvl>
+    <w:lvl w:ilvl="7">
+      <w:start w:val="1"/>
+      <w:numFmt w:val="lowerLetter"/>
+      <w:lvlText w:val="%8."/>
+      <w:lvlJc w:val="left"/>
+      <w:pPr>
+        <w:ind w:hanging="480" w:left="6480"/>
+      </w:pPr>
+      <w:rPr>
+        <w:rFonts w:hint="eastAsia"/>
+      </w:rPr>
+    </w:lvl>
+    <w:lvl w:ilvl="8">
+      <w:start w:val="1"/>
+      <w:numFmt w:val="lowerRoman"/>
+      <w:lvlText w:val="%9."/>
+      <w:lvlJc w:val="left"/>
+      <w:pPr>
+        <w:ind w:hanging="480" w:left="7200"/>
+      </w:pPr>
+      <w:rPr>
+        <w:rFonts w:hint="eastAsia"/>
+      </w:rPr>
+    </w:lvl>
+  </w:abstractNum>
   <w:abstractNum w:abstractNumId="990">
     <w:nsid w:val="0000A990"/>
     <w:multiLevelType w:val="multilevel"/>
@@ -5356,6 +6065,234 @@
       </w:rPr>
     </w:lvl>
   </w:abstractNum>
+  <w:num w16cid:durableId="179438853" w:numId="1">
+    <w:abstractNumId w:val="4"/>
+  </w:num>
+  <w:num w16cid:durableId="1185561364" w:numId="2">
+    <w:abstractNumId w:val="5"/>
+  </w:num>
+  <w:num w16cid:durableId="2049603216" w:numId="3">
+    <w:abstractNumId w:val="0"/>
+  </w:num>
+  <w:num w16cid:durableId="703869699" w:numId="4">
+    <w:abstractNumId w:val="2"/>
+  </w:num>
+  <w:num w16cid:durableId="1822653246" w:numId="5">
+    <w:abstractNumId w:val="2"/>
+  </w:num>
+  <w:num w16cid:durableId="2079478619" w:numId="6">
+    <w:abstractNumId w:val="2"/>
+  </w:num>
+  <w:num w16cid:durableId="1567565266" w:numId="7">
+    <w:abstractNumId w:val="2"/>
+    <w:lvlOverride w:ilvl="0">
+      <w:startOverride w:val="1"/>
+    </w:lvlOverride>
+    <w:lvlOverride w:ilvl="1">
+      <w:startOverride w:val="1"/>
+    </w:lvlOverride>
+    <w:lvlOverride w:ilvl="2">
+      <w:startOverride w:val="1"/>
+    </w:lvlOverride>
+    <w:lvlOverride w:ilvl="3">
+      <w:startOverride w:val="1"/>
+    </w:lvlOverride>
+    <w:lvlOverride w:ilvl="4">
+      <w:startOverride w:val="1"/>
+    </w:lvlOverride>
+    <w:lvlOverride w:ilvl="5">
+      <w:startOverride w:val="1"/>
+    </w:lvlOverride>
+    <w:lvlOverride w:ilvl="6">
+      <w:startOverride w:val="1"/>
+    </w:lvlOverride>
+    <w:lvlOverride w:ilvl="7">
+      <w:startOverride w:val="1"/>
+    </w:lvlOverride>
+    <w:lvlOverride w:ilvl="8">
+      <w:startOverride w:val="1"/>
+    </w:lvlOverride>
+  </w:num>
+  <w:num w16cid:durableId="1744447668" w:numId="8">
+    <w:abstractNumId w:val="2"/>
+    <w:lvlOverride w:ilvl="0">
+      <w:startOverride w:val="1"/>
+    </w:lvlOverride>
+    <w:lvlOverride w:ilvl="1">
+      <w:startOverride w:val="1"/>
+    </w:lvlOverride>
+    <w:lvlOverride w:ilvl="2">
+      <w:startOverride w:val="1"/>
+    </w:lvlOverride>
+    <w:lvlOverride w:ilvl="3">
+      <w:startOverride w:val="1"/>
+    </w:lvlOverride>
+    <w:lvlOverride w:ilvl="4">
+      <w:startOverride w:val="1"/>
+    </w:lvlOverride>
+    <w:lvlOverride w:ilvl="5">
+      <w:startOverride w:val="1"/>
+    </w:lvlOverride>
+    <w:lvlOverride w:ilvl="6">
+      <w:startOverride w:val="1"/>
+    </w:lvlOverride>
+    <w:lvlOverride w:ilvl="7">
+      <w:startOverride w:val="1"/>
+    </w:lvlOverride>
+    <w:lvlOverride w:ilvl="8">
+      <w:startOverride w:val="1"/>
+    </w:lvlOverride>
+  </w:num>
+  <w:num w16cid:durableId="1594360317" w:numId="9">
+    <w:abstractNumId w:val="2"/>
+    <w:lvlOverride w:ilvl="0">
+      <w:startOverride w:val="1"/>
+    </w:lvlOverride>
+    <w:lvlOverride w:ilvl="1">
+      <w:startOverride w:val="1"/>
+    </w:lvlOverride>
+    <w:lvlOverride w:ilvl="2">
+      <w:startOverride w:val="1"/>
+    </w:lvlOverride>
+    <w:lvlOverride w:ilvl="3">
+      <w:startOverride w:val="1"/>
+    </w:lvlOverride>
+    <w:lvlOverride w:ilvl="4">
+      <w:startOverride w:val="1"/>
+    </w:lvlOverride>
+    <w:lvlOverride w:ilvl="5">
+      <w:startOverride w:val="1"/>
+    </w:lvlOverride>
+    <w:lvlOverride w:ilvl="6">
+      <w:startOverride w:val="1"/>
+    </w:lvlOverride>
+    <w:lvlOverride w:ilvl="7">
+      <w:startOverride w:val="1"/>
+    </w:lvlOverride>
+    <w:lvlOverride w:ilvl="8">
+      <w:startOverride w:val="1"/>
+    </w:lvlOverride>
+  </w:num>
+  <w:num w16cid:durableId="898518209" w:numId="10">
+    <w:abstractNumId w:val="2"/>
+    <w:lvlOverride w:ilvl="0">
+      <w:startOverride w:val="1"/>
+    </w:lvlOverride>
+    <w:lvlOverride w:ilvl="1">
+      <w:startOverride w:val="1"/>
+    </w:lvlOverride>
+    <w:lvlOverride w:ilvl="2">
+      <w:startOverride w:val="1"/>
+    </w:lvlOverride>
+    <w:lvlOverride w:ilvl="3">
+      <w:startOverride w:val="1"/>
+    </w:lvlOverride>
+    <w:lvlOverride w:ilvl="4">
+      <w:startOverride w:val="1"/>
+    </w:lvlOverride>
+    <w:lvlOverride w:ilvl="5">
+      <w:startOverride w:val="1"/>
+    </w:lvlOverride>
+    <w:lvlOverride w:ilvl="6">
+      <w:startOverride w:val="1"/>
+    </w:lvlOverride>
+    <w:lvlOverride w:ilvl="7">
+      <w:startOverride w:val="1"/>
+    </w:lvlOverride>
+    <w:lvlOverride w:ilvl="8">
+      <w:startOverride w:val="1"/>
+    </w:lvlOverride>
+  </w:num>
+  <w:num w16cid:durableId="843059312" w:numId="11">
+    <w:abstractNumId w:val="2"/>
+    <w:lvlOverride w:ilvl="0">
+      <w:startOverride w:val="1"/>
+    </w:lvlOverride>
+    <w:lvlOverride w:ilvl="1">
+      <w:startOverride w:val="1"/>
+    </w:lvlOverride>
+    <w:lvlOverride w:ilvl="2">
+      <w:startOverride w:val="1"/>
+    </w:lvlOverride>
+    <w:lvlOverride w:ilvl="3">
+      <w:startOverride w:val="1"/>
+    </w:lvlOverride>
+    <w:lvlOverride w:ilvl="4">
+      <w:startOverride w:val="1"/>
+    </w:lvlOverride>
+    <w:lvlOverride w:ilvl="5">
+      <w:startOverride w:val="1"/>
+    </w:lvlOverride>
+    <w:lvlOverride w:ilvl="6">
+      <w:startOverride w:val="1"/>
+    </w:lvlOverride>
+    <w:lvlOverride w:ilvl="7">
+      <w:startOverride w:val="1"/>
+    </w:lvlOverride>
+    <w:lvlOverride w:ilvl="8">
+      <w:startOverride w:val="1"/>
+    </w:lvlOverride>
+  </w:num>
+  <w:num w16cid:durableId="2111394418" w:numId="12">
+    <w:abstractNumId w:val="1"/>
+  </w:num>
+  <w:num w16cid:durableId="723678939" w:numId="13">
+    <w:abstractNumId w:val="1"/>
+  </w:num>
+  <w:num w16cid:durableId="2047368205" w:numId="14">
+    <w:abstractNumId w:val="1"/>
+  </w:num>
+  <w:num w16cid:durableId="974989202" w:numId="15">
+    <w:abstractNumId w:val="1"/>
+  </w:num>
+  <w:num w16cid:durableId="55974617" w:numId="16">
+    <w:abstractNumId w:val="1"/>
+  </w:num>
+  <w:num w16cid:durableId="1273897876" w:numId="17">
+    <w:abstractNumId w:val="1"/>
+  </w:num>
+  <w:num w16cid:durableId="1449272727" w:numId="18">
+    <w:abstractNumId w:val="1"/>
+  </w:num>
+  <w:num w16cid:durableId="154762627" w:numId="19">
+    <w:abstractNumId w:val="1"/>
+  </w:num>
+  <w:num w16cid:durableId="1122966913" w:numId="20">
+    <w:abstractNumId w:val="1"/>
+  </w:num>
+  <w:num w16cid:durableId="370495256" w:numId="21">
+    <w:abstractNumId w:val="2"/>
+    <w:lvlOverride w:ilvl="0">
+      <w:startOverride w:val="1"/>
+    </w:lvlOverride>
+    <w:lvlOverride w:ilvl="1">
+      <w:startOverride w:val="1"/>
+    </w:lvlOverride>
+    <w:lvlOverride w:ilvl="2">
+      <w:startOverride w:val="1"/>
+    </w:lvlOverride>
+    <w:lvlOverride w:ilvl="3">
+      <w:startOverride w:val="1"/>
+    </w:lvlOverride>
+    <w:lvlOverride w:ilvl="4">
+      <w:startOverride w:val="1"/>
+    </w:lvlOverride>
+    <w:lvlOverride w:ilvl="5">
+      <w:startOverride w:val="1"/>
+    </w:lvlOverride>
+    <w:lvlOverride w:ilvl="6">
+      <w:startOverride w:val="1"/>
+    </w:lvlOverride>
+    <w:lvlOverride w:ilvl="7">
+      <w:startOverride w:val="1"/>
+    </w:lvlOverride>
+    <w:lvlOverride w:ilvl="8">
+      <w:startOverride w:val="1"/>
+    </w:lvlOverride>
+  </w:num>
+  <w:num w16cid:durableId="425224256" w:numId="22">
+    <w:abstractNumId w:val="3"/>
+  </w:num>
   <w:num w:numId="1000">
     <w:abstractNumId w:val="990"/>
   </w:num>
@@ -5456,7 +6393,7 @@
 </file>
 
 <file path=word/styles.xml><?xml version="1.0" encoding="utf-8"?>
-<w:styles xmlns:r="http://schemas.openxmlformats.org/officeDocument/2006/relationships" xmlns:w="http://schemas.openxmlformats.org/wordprocessingml/2006/main">
+<w:styles xmlns:mc="http://schemas.openxmlformats.org/markup-compatibility/2006" xmlns:r="http://schemas.openxmlformats.org/officeDocument/2006/relationships" xmlns:w="http://schemas.openxmlformats.org/wordprocessingml/2006/main" xmlns:w14="http://schemas.microsoft.com/office/word/2010/wordml" xmlns:w15="http://schemas.microsoft.com/office/word/2012/wordml" xmlns:w16="http://schemas.microsoft.com/office/word/2018/wordml" xmlns:w16cex="http://schemas.microsoft.com/office/word/2018/wordml/cex" xmlns:w16cid="http://schemas.microsoft.com/office/word/2016/wordml/cid" xmlns:w16du="http://schemas.microsoft.com/office/word/2023/wordml/word16du" xmlns:w16sdtdh="http://schemas.microsoft.com/office/word/2020/wordml/sdtdatahash" xmlns:w16sdtfl="http://schemas.microsoft.com/office/word/2024/wordml/sdtformatlock" xmlns:w16se="http://schemas.microsoft.com/office/word/2015/wordml/symex" mc:Ignorable="w14 w15 w16se w16cid w16 w16cex w16sdtdh w16sdtfl w16du">
   <w:docDefaults>
     <w:rPrDefault>
       <w:rPr>
@@ -5472,528 +6409,464 @@
       </w:pPr>
     </w:pPrDefault>
   </w:docDefaults>
-  <w:latentStyles w:count="276" w:defLockedState="0" w:defQFormat="0" w:defSemiHidden="0" w:defUIPriority="0" w:defUnhideWhenUsed="0"/>
-  <w:style w:default="1" w:styleId="Normal" w:type="paragraph">
+  <w:latentStyles w:count="376" w:defLockedState="0" w:defQFormat="0" w:defSemiHidden="0" w:defUIPriority="0" w:defUnhideWhenUsed="0">
+    <w:lsdException w:name="footer" w:uiPriority="99"/>
+    <w:lsdException w:name="Normal Table" w:semiHidden="1" w:unhideWhenUsed="1"/>
+    <w:lsdException w:name="Table Simple 1" w:semiHidden="1" w:unhideWhenUsed="1"/>
+    <w:lsdException w:name="Table Simple 2" w:semiHidden="1" w:unhideWhenUsed="1"/>
+    <w:lsdException w:name="Table Simple 3" w:semiHidden="1" w:unhideWhenUsed="1"/>
+    <w:lsdException w:name="Table Classic 1" w:semiHidden="1" w:unhideWhenUsed="1"/>
+    <w:lsdException w:name="Table Classic 2" w:semiHidden="1" w:unhideWhenUsed="1"/>
+    <w:lsdException w:name="Table Classic 3" w:semiHidden="1" w:unhideWhenUsed="1"/>
+    <w:lsdException w:name="Table Classic 4" w:semiHidden="1" w:unhideWhenUsed="1"/>
+    <w:lsdException w:name="Table Colorful 1" w:semiHidden="1" w:unhideWhenUsed="1"/>
+    <w:lsdException w:name="Table Colorful 2" w:semiHidden="1" w:unhideWhenUsed="1"/>
+    <w:lsdException w:name="Table Colorful 3" w:semiHidden="1" w:unhideWhenUsed="1"/>
+    <w:lsdException w:name="Table Columns 1" w:semiHidden="1" w:unhideWhenUsed="1"/>
+    <w:lsdException w:name="Table Columns 2" w:semiHidden="1" w:unhideWhenUsed="1"/>
+    <w:lsdException w:name="Table Columns 3" w:semiHidden="1" w:unhideWhenUsed="1"/>
+    <w:lsdException w:name="Table Columns 4" w:semiHidden="1" w:unhideWhenUsed="1"/>
+    <w:lsdException w:name="Table Columns 5" w:semiHidden="1" w:unhideWhenUsed="1"/>
+    <w:lsdException w:name="Table Grid 1" w:semiHidden="1" w:unhideWhenUsed="1"/>
+    <w:lsdException w:name="Table Grid 2" w:semiHidden="1" w:unhideWhenUsed="1"/>
+    <w:lsdException w:name="Table Grid 3" w:semiHidden="1" w:unhideWhenUsed="1"/>
+    <w:lsdException w:name="Table Grid 4" w:semiHidden="1" w:unhideWhenUsed="1"/>
+    <w:lsdException w:name="Table Grid 5" w:semiHidden="1" w:unhideWhenUsed="1"/>
+    <w:lsdException w:name="Table Grid 6" w:semiHidden="1" w:unhideWhenUsed="1"/>
+    <w:lsdException w:name="Table Grid 7" w:semiHidden="1" w:unhideWhenUsed="1"/>
+    <w:lsdException w:name="Table Grid 8" w:semiHidden="1" w:unhideWhenUsed="1"/>
+    <w:lsdException w:name="Table List 1" w:semiHidden="1" w:unhideWhenUsed="1"/>
+    <w:lsdException w:name="Table List 2" w:semiHidden="1" w:unhideWhenUsed="1"/>
+    <w:lsdException w:name="Table List 3" w:semiHidden="1" w:unhideWhenUsed="1"/>
+    <w:lsdException w:name="Table List 4" w:semiHidden="1" w:unhideWhenUsed="1"/>
+    <w:lsdException w:name="Table List 5" w:semiHidden="1" w:unhideWhenUsed="1"/>
+    <w:lsdException w:name="Table List 6" w:semiHidden="1" w:unhideWhenUsed="1"/>
+    <w:lsdException w:name="Table List 7" w:semiHidden="1" w:unhideWhenUsed="1"/>
+    <w:lsdException w:name="Table List 8" w:semiHidden="1" w:unhideWhenUsed="1"/>
+    <w:lsdException w:name="Table 3D effects 1" w:semiHidden="1" w:unhideWhenUsed="1"/>
+    <w:lsdException w:name="Table 3D effects 2" w:semiHidden="1" w:unhideWhenUsed="1"/>
+    <w:lsdException w:name="Table 3D effects 3" w:semiHidden="1" w:unhideWhenUsed="1"/>
+    <w:lsdException w:name="Table Contemporary" w:semiHidden="1" w:unhideWhenUsed="1"/>
+    <w:lsdException w:name="Table Elegant" w:semiHidden="1" w:unhideWhenUsed="1"/>
+    <w:lsdException w:name="Table Professional" w:semiHidden="1" w:unhideWhenUsed="1"/>
+    <w:lsdException w:name="Table Subtle 1" w:semiHidden="1" w:unhideWhenUsed="1"/>
+    <w:lsdException w:name="Table Subtle 2" w:semiHidden="1" w:unhideWhenUsed="1"/>
+    <w:lsdException w:name="Table Web 1" w:semiHidden="1" w:unhideWhenUsed="1"/>
+    <w:lsdException w:name="Table Web 2" w:semiHidden="1" w:unhideWhenUsed="1"/>
+    <w:lsdException w:name="Table Web 3" w:semiHidden="1" w:unhideWhenUsed="1"/>
+    <w:lsdException w:name="Table Theme" w:semiHidden="1" w:unhideWhenUsed="1"/>
+    <w:lsdException w:name="Light Shading"/>
+    <w:lsdException w:name="Light List"/>
+    <w:lsdException w:name="Light Grid"/>
+    <w:lsdException w:name="Medium Shading 1"/>
+    <w:lsdException w:name="Medium Shading 2"/>
+    <w:lsdException w:name="Medium List 1"/>
+    <w:lsdException w:name="Medium List 2"/>
+    <w:lsdException w:name="Medium Grid 1"/>
+    <w:lsdException w:name="Medium Grid 2"/>
+    <w:lsdException w:name="Medium Grid 3"/>
+    <w:lsdException w:name="Dark List"/>
+    <w:lsdException w:name="Colorful Shading"/>
+    <w:lsdException w:name="Colorful List"/>
+    <w:lsdException w:name="Colorful Grid"/>
+    <w:lsdException w:name="Light Shading Accent 1"/>
+    <w:lsdException w:name="Light List Accent 1"/>
+    <w:lsdException w:name="Light Grid Accent 1"/>
+    <w:lsdException w:name="Medium Shading 1 Accent 1"/>
+    <w:lsdException w:name="Medium Shading 2 Accent 1"/>
+    <w:lsdException w:name="Medium List 1 Accent 1"/>
+    <w:lsdException w:name="Medium List 2 Accent 1"/>
+    <w:lsdException w:name="Medium Grid 1 Accent 1"/>
+    <w:lsdException w:name="Medium Grid 2 Accent 1"/>
+    <w:lsdException w:name="Medium Grid 3 Accent 1"/>
+    <w:lsdException w:name="Dark List Accent 1"/>
+    <w:lsdException w:name="Colorful Shading Accent 1"/>
+    <w:lsdException w:name="Colorful List Accent 1"/>
+    <w:lsdException w:name="Colorful Grid Accent 1"/>
+    <w:lsdException w:name="Light Shading Accent 2"/>
+    <w:lsdException w:name="Light List Accent 2"/>
+    <w:lsdException w:name="Light Grid Accent 2"/>
+    <w:lsdException w:name="Medium Shading 1 Accent 2"/>
+    <w:lsdException w:name="Medium Shading 2 Accent 2"/>
+    <w:lsdException w:name="Medium List 1 Accent 2"/>
+    <w:lsdException w:name="Medium List 2 Accent 2"/>
+    <w:lsdException w:name="Medium Grid 1 Accent 2"/>
+    <w:lsdException w:name="Medium Grid 2 Accent 2"/>
+    <w:lsdException w:name="Medium Grid 3 Accent 2"/>
+    <w:lsdException w:name="Dark List Accent 2"/>
+    <w:lsdException w:name="Colorful Shading Accent 2"/>
+    <w:lsdException w:name="Colorful List Accent 2"/>
+    <w:lsdException w:name="Colorful Grid Accent 2"/>
+    <w:lsdException w:name="Light Shading Accent 3"/>
+    <w:lsdException w:name="Light List Accent 3"/>
+    <w:lsdException w:name="Light Grid Accent 3"/>
+    <w:lsdException w:name="Medium Shading 1 Accent 3"/>
+    <w:lsdException w:name="Medium Shading 2 Accent 3"/>
+    <w:lsdException w:name="Medium List 1 Accent 3"/>
+    <w:lsdException w:name="Medium List 2 Accent 3"/>
+    <w:lsdException w:name="Medium Grid 1 Accent 3"/>
+    <w:lsdException w:name="Medium Grid 2 Accent 3"/>
+    <w:lsdException w:name="Medium Grid 3 Accent 3"/>
+    <w:lsdException w:name="Dark List Accent 3"/>
+    <w:lsdException w:name="Colorful Shading Accent 3"/>
+    <w:lsdException w:name="Colorful List Accent 3"/>
+    <w:lsdException w:name="Colorful Grid Accent 3"/>
+    <w:lsdException w:name="Light Shading Accent 4"/>
+    <w:lsdException w:name="Light List Accent 4"/>
+    <w:lsdException w:name="Light Grid Accent 4"/>
+    <w:lsdException w:name="Medium Shading 1 Accent 4"/>
+    <w:lsdException w:name="Medium Shading 2 Accent 4"/>
+    <w:lsdException w:name="Medium List 1 Accent 4"/>
+    <w:lsdException w:name="Medium List 2 Accent 4"/>
+    <w:lsdException w:name="Medium Grid 1 Accent 4"/>
+    <w:lsdException w:name="Medium Grid 2 Accent 4"/>
+    <w:lsdException w:name="Medium Grid 3 Accent 4"/>
+    <w:lsdException w:name="Dark List Accent 4"/>
+    <w:lsdException w:name="Colorful Shading Accent 4"/>
+    <w:lsdException w:name="Colorful List Accent 4"/>
+    <w:lsdException w:name="Colorful Grid Accent 4"/>
+    <w:lsdException w:name="Light Shading Accent 5"/>
+    <w:lsdException w:name="Light List Accent 5"/>
+    <w:lsdException w:name="Light Grid Accent 5"/>
+    <w:lsdException w:name="Medium Shading 1 Accent 5"/>
+    <w:lsdException w:name="Medium Shading 2 Accent 5"/>
+    <w:lsdException w:name="Medium List 1 Accent 5"/>
+    <w:lsdException w:name="Medium List 2 Accent 5"/>
+    <w:lsdException w:name="Medium Grid 1 Accent 5"/>
+    <w:lsdException w:name="Medium Grid 2 Accent 5"/>
+    <w:lsdException w:name="Medium Grid 3 Accent 5"/>
+    <w:lsdException w:name="Dark List Accent 5"/>
+    <w:lsdException w:name="Colorful Shading Accent 5"/>
+    <w:lsdException w:name="Colorful List Accent 5"/>
+    <w:lsdException w:name="Colorful Grid Accent 5"/>
+    <w:lsdException w:name="Light Shading Accent 6"/>
+    <w:lsdException w:name="Light List Accent 6"/>
+    <w:lsdException w:name="Light Grid Accent 6"/>
+    <w:lsdException w:name="Medium Shading 1 Accent 6"/>
+    <w:lsdException w:name="Medium Shading 2 Accent 6"/>
+    <w:lsdException w:name="Medium List 1 Accent 6"/>
+    <w:lsdException w:name="Medium List 2 Accent 6"/>
+    <w:lsdException w:name="Medium Grid 1 Accent 6"/>
+    <w:lsdException w:name="Medium Grid 2 Accent 6"/>
+    <w:lsdException w:name="Medium Grid 3 Accent 6"/>
+    <w:lsdException w:name="Dark List Accent 6"/>
+    <w:lsdException w:name="Colorful Shading Accent 6"/>
+    <w:lsdException w:name="Colorful List Accent 6"/>
+    <w:lsdException w:name="Colorful Grid Accent 6"/>
+    <w:lsdException w:name="Plain Table 1" w:uiPriority="41"/>
+    <w:lsdException w:name="Plain Table 2" w:uiPriority="42"/>
+    <w:lsdException w:name="Plain Table 3" w:uiPriority="43"/>
+    <w:lsdException w:name="Plain Table 4" w:uiPriority="44"/>
+    <w:lsdException w:name="Plain Table 5" w:uiPriority="45"/>
+    <w:lsdException w:name="Grid Table Light" w:uiPriority="40"/>
+    <w:lsdException w:name="Grid Table 1 Light" w:uiPriority="46"/>
+    <w:lsdException w:name="Grid Table 2" w:uiPriority="47"/>
+    <w:lsdException w:name="Grid Table 3" w:uiPriority="48"/>
+    <w:lsdException w:name="Grid Table 4" w:uiPriority="49"/>
+    <w:lsdException w:name="Grid Table 5 Dark" w:uiPriority="50"/>
+    <w:lsdException w:name="Grid Table 6 Colorful" w:uiPriority="51"/>
+    <w:lsdException w:name="Grid Table 7 Colorful" w:uiPriority="52"/>
+    <w:lsdException w:name="Grid Table 1 Light Accent 1" w:uiPriority="46"/>
+    <w:lsdException w:name="Grid Table 2 Accent 1" w:uiPriority="47"/>
+    <w:lsdException w:name="Grid Table 3 Accent 1" w:uiPriority="48"/>
+    <w:lsdException w:name="Grid Table 4 Accent 1" w:uiPriority="49"/>
+    <w:lsdException w:name="Grid Table 5 Dark Accent 1" w:uiPriority="50"/>
+    <w:lsdException w:name="Grid Table 6 Colorful Accent 1" w:uiPriority="51"/>
+    <w:lsdException w:name="Grid Table 7 Colorful Accent 1" w:uiPriority="52"/>
+    <w:lsdException w:name="Grid Table 1 Light Accent 2" w:uiPriority="46"/>
+    <w:lsdException w:name="Grid Table 2 Accent 2" w:uiPriority="47"/>
+    <w:lsdException w:name="Grid Table 3 Accent 2" w:uiPriority="48"/>
+    <w:lsdException w:name="Grid Table 4 Accent 2" w:uiPriority="49"/>
+    <w:lsdException w:name="Grid Table 5 Dark Accent 2" w:uiPriority="50"/>
+    <w:lsdException w:name="Grid Table 6 Colorful Accent 2" w:uiPriority="51"/>
+    <w:lsdException w:name="Grid Table 7 Colorful Accent 2" w:uiPriority="52"/>
+    <w:lsdException w:name="Grid Table 1 Light Accent 3" w:uiPriority="46"/>
+    <w:lsdException w:name="Grid Table 2 Accent 3" w:uiPriority="47"/>
+    <w:lsdException w:name="Grid Table 3 Accent 3" w:uiPriority="48"/>
+    <w:lsdException w:name="Grid Table 4 Accent 3" w:uiPriority="49"/>
+    <w:lsdException w:name="Grid Table 5 Dark Accent 3" w:uiPriority="50"/>
+    <w:lsdException w:name="Grid Table 6 Colorful Accent 3" w:uiPriority="51"/>
+    <w:lsdException w:name="Grid Table 7 Colorful Accent 3" w:uiPriority="52"/>
+    <w:lsdException w:name="Grid Table 1 Light Accent 4" w:uiPriority="46"/>
+    <w:lsdException w:name="Grid Table 2 Accent 4" w:uiPriority="47"/>
+    <w:lsdException w:name="Grid Table 3 Accent 4" w:uiPriority="48"/>
+    <w:lsdException w:name="Grid Table 4 Accent 4" w:uiPriority="49"/>
+    <w:lsdException w:name="Grid Table 5 Dark Accent 4" w:uiPriority="50"/>
+    <w:lsdException w:name="Grid Table 6 Colorful Accent 4" w:uiPriority="51"/>
+    <w:lsdException w:name="Grid Table 7 Colorful Accent 4" w:uiPriority="52"/>
+    <w:lsdException w:name="Grid Table 1 Light Accent 5" w:uiPriority="46"/>
+    <w:lsdException w:name="Grid Table 2 Accent 5" w:uiPriority="47"/>
+    <w:lsdException w:name="Grid Table 3 Accent 5" w:uiPriority="48"/>
+    <w:lsdException w:name="Grid Table 4 Accent 5" w:uiPriority="49"/>
+    <w:lsdException w:name="Grid Table 5 Dark Accent 5" w:uiPriority="50"/>
+    <w:lsdException w:name="Grid Table 6 Colorful Accent 5" w:uiPriority="51"/>
+    <w:lsdException w:name="Grid Table 7 Colorful Accent 5" w:uiPriority="52"/>
+    <w:lsdException w:name="Grid Table 1 Light Accent 6" w:uiPriority="46"/>
+    <w:lsdException w:name="Grid Table 2 Accent 6" w:uiPriority="47"/>
+    <w:lsdException w:name="Grid Table 3 Accent 6" w:uiPriority="48"/>
+    <w:lsdException w:name="Grid Table 4 Accent 6" w:uiPriority="49"/>
+    <w:lsdException w:name="Grid Table 5 Dark Accent 6" w:uiPriority="50"/>
+    <w:lsdException w:name="Grid Table 6 Colorful Accent 6" w:uiPriority="51"/>
+    <w:lsdException w:name="Grid Table 7 Colorful Accent 6" w:uiPriority="52"/>
+    <w:lsdException w:name="List Table 1 Light" w:uiPriority="46"/>
+    <w:lsdException w:name="List Table 2" w:uiPriority="47"/>
+    <w:lsdException w:name="List Table 3" w:uiPriority="48"/>
+    <w:lsdException w:name="List Table 4" w:uiPriority="49"/>
+    <w:lsdException w:name="List Table 5 Dark" w:uiPriority="50"/>
+    <w:lsdException w:name="List Table 6 Colorful" w:uiPriority="51"/>
+    <w:lsdException w:name="List Table 7 Colorful" w:uiPriority="52"/>
+    <w:lsdException w:name="List Table 1 Light Accent 1" w:uiPriority="46"/>
+    <w:lsdException w:name="List Table 2 Accent 1" w:uiPriority="47"/>
+    <w:lsdException w:name="List Table 3 Accent 1" w:uiPriority="48"/>
+    <w:lsdException w:name="List Table 4 Accent 1" w:uiPriority="49"/>
+    <w:lsdException w:name="List Table 5 Dark Accent 1" w:uiPriority="50"/>
+    <w:lsdException w:name="List Table 6 Colorful Accent 1" w:uiPriority="51"/>
+    <w:lsdException w:name="List Table 7 Colorful Accent 1" w:uiPriority="52"/>
+    <w:lsdException w:name="List Table 1 Light Accent 2" w:uiPriority="46"/>
+    <w:lsdException w:name="List Table 2 Accent 2" w:uiPriority="47"/>
+    <w:lsdException w:name="List Table 3 Accent 2" w:uiPriority="48"/>
+    <w:lsdException w:name="List Table 4 Accent 2" w:uiPriority="49"/>
+    <w:lsdException w:name="List Table 5 Dark Accent 2" w:uiPriority="50"/>
+    <w:lsdException w:name="List Table 6 Colorful Accent 2" w:uiPriority="51"/>
+    <w:lsdException w:name="List Table 7 Colorful Accent 2" w:uiPriority="52"/>
+    <w:lsdException w:name="List Table 1 Light Accent 3" w:uiPriority="46"/>
+    <w:lsdException w:name="List Table 2 Accent 3" w:uiPriority="47"/>
+    <w:lsdException w:name="List Table 3 Accent 3" w:uiPriority="48"/>
+    <w:lsdException w:name="List Table 4 Accent 3" w:uiPriority="49"/>
+    <w:lsdException w:name="List Table 5 Dark Accent 3" w:uiPriority="50"/>
+    <w:lsdException w:name="List Table 6 Colorful Accent 3" w:uiPriority="51"/>
+    <w:lsdException w:name="List Table 7 Colorful Accent 3" w:uiPriority="52"/>
+    <w:lsdException w:name="List Table 1 Light Accent 4" w:uiPriority="46"/>
+    <w:lsdException w:name="List Table 2 Accent 4" w:uiPriority="47"/>
+    <w:lsdException w:name="List Table 3 Accent 4" w:uiPriority="48"/>
+    <w:lsdException w:name="List Table 4 Accent 4" w:uiPriority="49"/>
+    <w:lsdException w:name="List Table 5 Dark Accent 4" w:uiPriority="50"/>
+    <w:lsdException w:name="List Table 6 Colorful Accent 4" w:uiPriority="51"/>
+    <w:lsdException w:name="List Table 7 Colorful Accent 4" w:uiPriority="52"/>
+    <w:lsdException w:name="List Table 1 Light Accent 5" w:uiPriority="46"/>
+    <w:lsdException w:name="List Table 2 Accent 5" w:uiPriority="47"/>
+    <w:lsdException w:name="List Table 3 Accent 5" w:uiPriority="48"/>
+    <w:lsdException w:name="List Table 4 Accent 5" w:uiPriority="49"/>
+    <w:lsdException w:name="List Table 5 Dark Accent 5" w:uiPriority="50"/>
+    <w:lsdException w:name="List Table 6 Colorful Accent 5" w:uiPriority="51"/>
+    <w:lsdException w:name="List Table 7 Colorful Accent 5" w:uiPriority="52"/>
+    <w:lsdException w:name="List Table 1 Light Accent 6" w:uiPriority="46"/>
+    <w:lsdException w:name="List Table 2 Accent 6" w:uiPriority="47"/>
+    <w:lsdException w:name="List Table 3 Accent 6" w:uiPriority="48"/>
+    <w:lsdException w:name="List Table 4 Accent 6" w:uiPriority="49"/>
+    <w:lsdException w:name="List Table 5 Dark Accent 6" w:uiPriority="50"/>
+    <w:lsdException w:name="List Table 6 Colorful Accent 6" w:uiPriority="51"/>
+    <w:lsdException w:name="List Table 7 Colorful Accent 6" w:uiPriority="52"/>
+    <w:lsdException w:name="Mention" w:semiHidden="1" w:uiPriority="99" w:unhideWhenUsed="1"/>
+    <w:lsdException w:name="Smart Hyperlink" w:semiHidden="1" w:uiPriority="99" w:unhideWhenUsed="1"/>
+    <w:lsdException w:name="Hashtag" w:semiHidden="1" w:uiPriority="99" w:unhideWhenUsed="1"/>
+    <w:lsdException w:name="Unresolved Mention" w:semiHidden="1" w:uiPriority="99" w:unhideWhenUsed="1"/>
+    <w:lsdException w:name="Smart Link" w:semiHidden="1" w:uiPriority="99" w:unhideWhenUsed="1"/>
+  </w:latentStyles>
+  <w:style w:default="1" w:styleId="a" w:type="paragraph">
     <w:name w:val="Normal"/>
     <w:qFormat/>
-  </w:style>
-  <w:style w:styleId="BodyText" w:type="paragraph">
-    <w:name w:val="Body Text"/>
-    <w:basedOn w:val="Normal"/>
-    <w:link w:val="BodyTextChar"/>
-    <w:qFormat/>
+    <w:rsid w:val="00BD3843"/>
     <w:pPr>
-      <w:spacing w:after="180" w:before="180"/>
-    </w:pPr>
-  </w:style>
-  <w:style w:customStyle="1" w:styleId="FirstParagraph" w:type="paragraph">
-    <w:name w:val="First Paragraph"/>
-    <w:basedOn w:val="BodyText"/>
-    <w:next w:val="BodyText"/>
-    <w:qFormat/>
-  </w:style>
-  <w:style w:customStyle="1" w:styleId="Compact" w:type="paragraph">
-    <w:name w:val="Compact"/>
-    <w:basedOn w:val="BodyText"/>
-    <w:qFormat/>
-    <w:pPr>
-      <w:spacing w:after="36" w:before="36"/>
-    </w:pPr>
-  </w:style>
-  <w:style w:styleId="Title" w:type="paragraph">
-    <w:name w:val="Title"/>
-    <w:basedOn w:val="Normal"/>
-    <w:next w:val="BodyText"/>
-    <w:link w:val="TitleChar"/>
-    <w:uiPriority w:val="10"/>
-    <w:qFormat/>
-    <w:rsid w:val="00A10FD9"/>
-    <w:pPr>
-      <w:spacing w:after="80" w:line="240" w:lineRule="auto"/>
-      <w:contextualSpacing/>
-      <w:jc w:val="center"/>
+      <w:spacing w:after="0" w:line="360" w:lineRule="auto"/>
     </w:pPr>
     <w:rPr>
-      <w:rFonts w:asciiTheme="majorHAnsi" w:cstheme="majorBidi" w:eastAsiaTheme="majorEastAsia" w:hAnsiTheme="majorHAnsi"/>
-      <w:sz w:val="56"/>
-      <w:szCs w:val="56"/>
+      <w:rFonts w:ascii="Times New Roman" w:eastAsia="宋体" w:hAnsi="Times New Roman"/>
     </w:rPr>
   </w:style>
-  <w:style w:customStyle="1" w:styleId="TitleChar" w:type="character">
-    <w:name w:val="Title Char"/>
-    <w:basedOn w:val="DefaultParagraphFont"/>
-    <w:link w:val="Title"/>
-    <w:uiPriority w:val="10"/>
-    <w:rsid w:val="00A10FD9"/>
-    <w:rPr>
-      <w:rFonts w:asciiTheme="majorHAnsi" w:cstheme="majorBidi" w:eastAsiaTheme="majorEastAsia" w:hAnsiTheme="majorHAnsi"/>
-      <w:sz w:val="56"/>
-      <w:szCs w:val="56"/>
-    </w:rPr>
-  </w:style>
-  <w:style w:styleId="Subtitle" w:type="paragraph">
-    <w:name w:val="Subtitle"/>
-    <w:basedOn w:val="Title"/>
-    <w:next w:val="BodyText"/>
-    <w:link w:val="SubtitleChar"/>
-    <w:uiPriority w:val="11"/>
+  <w:style w:styleId="10" w:type="paragraph">
+    <w:name w:val="heading 1"/>
+    <w:basedOn w:val="a"/>
+    <w:next w:val="a0"/>
+    <w:autoRedefine/>
+    <w:uiPriority w:val="9"/>
     <w:qFormat/>
-    <w:rsid w:val="00A10FD9"/>
+    <w:rsid w:val="00891C5E"/>
     <w:pPr>
-      <w:numPr>
-        <w:ilvl w:val="1"/>
-      </w:numPr>
+      <w:keepNext/>
+      <w:keepLines/>
+      <w:pageBreakBefore/>
+      <w:spacing w:before="480"/>
+      <w:jc w:val="center"/>
+      <w:outlineLvl w:val="0"/>
     </w:pPr>
     <w:rPr>
-      <w:rFonts w:cstheme="majorBidi" w:eastAsiaTheme="majorEastAsia"/>
-      <w:spacing w:val="15"/>
+      <w:rFonts w:cstheme="majorBidi" w:eastAsia="黑体"/>
+      <w:b/>
+      <w:bCs/>
+      <w:sz w:val="36"/>
+      <w:szCs w:val="32"/>
+    </w:rPr>
+  </w:style>
+  <w:style w:styleId="20" w:type="paragraph">
+    <w:name w:val="heading 2"/>
+    <w:basedOn w:val="a"/>
+    <w:next w:val="a0"/>
+    <w:uiPriority w:val="9"/>
+    <w:unhideWhenUsed/>
+    <w:qFormat/>
+    <w:rsid w:val="00C22677"/>
+    <w:pPr>
+      <w:keepNext/>
+      <w:keepLines/>
+      <w:spacing w:before="300"/>
+      <w:outlineLvl w:val="1"/>
+    </w:pPr>
+    <w:rPr>
+      <w:rFonts w:cstheme="majorBidi" w:eastAsia="黑体"/>
+      <w:b/>
+      <w:bCs/>
+      <w:sz w:val="32"/>
+      <w:szCs w:val="32"/>
+    </w:rPr>
+  </w:style>
+  <w:style w:styleId="3" w:type="paragraph">
+    <w:name w:val="heading 3"/>
+    <w:basedOn w:val="a"/>
+    <w:next w:val="a0"/>
+    <w:uiPriority w:val="9"/>
+    <w:unhideWhenUsed/>
+    <w:qFormat/>
+    <w:rsid w:val="004A10CE"/>
+    <w:pPr>
+      <w:keepNext/>
+      <w:keepLines/>
+      <w:spacing w:before="200"/>
+      <w:outlineLvl w:val="2"/>
+    </w:pPr>
+    <w:rPr>
+      <w:rFonts w:cstheme="majorBidi" w:eastAsia="黑体"/>
+      <w:b/>
+      <w:bCs/>
       <w:sz w:val="28"/>
       <w:szCs w:val="28"/>
     </w:rPr>
   </w:style>
-  <w:style w:customStyle="1" w:styleId="SubtitleChar" w:type="character">
-    <w:name w:val="Subtitle Char"/>
-    <w:basedOn w:val="DefaultParagraphFont"/>
-    <w:link w:val="Subtitle"/>
-    <w:uiPriority w:val="11"/>
-    <w:rsid w:val="00A10FD9"/>
+  <w:style w:styleId="4" w:type="paragraph">
+    <w:name w:val="heading 4"/>
+    <w:basedOn w:val="a"/>
+    <w:next w:val="a0"/>
+    <w:link w:val="40"/>
+    <w:uiPriority w:val="9"/>
+    <w:unhideWhenUsed/>
+    <w:qFormat/>
+    <w:rsid w:val="004A10CE"/>
+    <w:pPr>
+      <w:keepNext/>
+      <w:keepLines/>
+      <w:spacing w:before="200"/>
+      <w:outlineLvl w:val="3"/>
+    </w:pPr>
     <w:rPr>
-      <w:rFonts w:cstheme="majorBidi" w:eastAsiaTheme="majorEastAsia"/>
-      <w:color w:themeColor="text1" w:themeTint="A6" w:val="595959"/>
-      <w:spacing w:val="15"/>
-      <w:sz w:val="28"/>
-      <w:szCs w:val="28"/>
+      <w:rFonts w:cstheme="majorBidi" w:eastAsia="黑体"/>
+      <w:b/>
+      <w:bCs/>
     </w:rPr>
   </w:style>
-  <w:style w:customStyle="1" w:styleId="Author" w:type="paragraph">
-    <w:name w:val="Author"/>
-    <w:basedOn w:val="Title"/>
-    <w:next w:val="BodyText"/>
+  <w:style w:styleId="5" w:type="paragraph">
+    <w:name w:val="heading 5"/>
+    <w:basedOn w:val="a"/>
+    <w:next w:val="a0"/>
+    <w:uiPriority w:val="9"/>
+    <w:unhideWhenUsed/>
+    <w:qFormat/>
+    <w:rsid w:val="00BA49AB"/>
+    <w:pPr>
+      <w:keepNext/>
+      <w:keepLines/>
+      <w:spacing w:before="200"/>
+      <w:outlineLvl w:val="4"/>
+    </w:pPr>
+    <w:rPr>
+      <w:rFonts w:asciiTheme="majorHAnsi" w:cstheme="majorBidi" w:eastAsia="黑体" w:hAnsiTheme="majorHAnsi"/>
+      <w:b/>
+      <w:iCs/>
+    </w:rPr>
+  </w:style>
+  <w:style w:styleId="6" w:type="paragraph">
+    <w:name w:val="heading 6"/>
+    <w:basedOn w:val="a"/>
+    <w:next w:val="a0"/>
+    <w:uiPriority w:val="9"/>
+    <w:unhideWhenUsed/>
+    <w:qFormat/>
+    <w:rsid w:val="004A10CE"/>
+    <w:pPr>
+      <w:keepNext/>
+      <w:keepLines/>
+      <w:spacing w:before="200"/>
+      <w:outlineLvl w:val="5"/>
+    </w:pPr>
+    <w:rPr>
+      <w:rFonts w:cstheme="majorBidi" w:eastAsia="黑体"/>
+      <w:b/>
+    </w:rPr>
+  </w:style>
+  <w:style w:styleId="7" w:type="paragraph">
+    <w:name w:val="heading 7"/>
+    <w:basedOn w:val="a"/>
+    <w:next w:val="a0"/>
+    <w:uiPriority w:val="9"/>
+    <w:unhideWhenUsed/>
     <w:qFormat/>
     <w:pPr>
       <w:keepNext/>
       <w:keepLines/>
+      <w:spacing w:before="200"/>
+      <w:outlineLvl w:val="6"/>
     </w:pPr>
     <w:rPr>
-      <w:sz w:val="24"/>
-      <w:szCs w:val="24"/>
+      <w:rFonts w:asciiTheme="majorHAnsi" w:cstheme="majorBidi" w:eastAsiaTheme="majorEastAsia" w:hAnsiTheme="majorHAnsi"/>
+      <w:color w:themeColor="accent1" w:val="4F81BD"/>
     </w:rPr>
   </w:style>
-  <w:style w:styleId="Date" w:type="paragraph">
-    <w:name w:val="Date"/>
-    <w:basedOn w:val="Title"/>
-    <w:next w:val="BodyText"/>
+  <w:style w:styleId="8" w:type="paragraph">
+    <w:name w:val="heading 8"/>
+    <w:basedOn w:val="a"/>
+    <w:next w:val="a0"/>
+    <w:uiPriority w:val="9"/>
+    <w:unhideWhenUsed/>
     <w:qFormat/>
     <w:pPr>
       <w:keepNext/>
       <w:keepLines/>
+      <w:spacing w:before="200"/>
+      <w:outlineLvl w:val="7"/>
     </w:pPr>
     <w:rPr>
-      <w:sz w:val="24"/>
-      <w:szCs w:val="24"/>
+      <w:rFonts w:asciiTheme="majorHAnsi" w:cstheme="majorBidi" w:eastAsiaTheme="majorEastAsia" w:hAnsiTheme="majorHAnsi"/>
+      <w:color w:themeColor="accent1" w:val="4F81BD"/>
     </w:rPr>
   </w:style>
-  <w:style w:customStyle="1" w:styleId="AbstractTitle" w:type="paragraph">
-    <w:name w:val="Abstract Title"/>
-    <w:basedOn w:val="Normal"/>
-    <w:next w:val="Abstract"/>
+  <w:style w:styleId="9" w:type="paragraph">
+    <w:name w:val="heading 9"/>
+    <w:basedOn w:val="a"/>
+    <w:next w:val="a0"/>
+    <w:uiPriority w:val="9"/>
+    <w:unhideWhenUsed/>
     <w:qFormat/>
     <w:pPr>
       <w:keepNext/>
       <w:keepLines/>
-      <w:spacing w:after="0" w:before="300"/>
-      <w:jc w:val="center"/>
-    </w:pPr>
-    <w:rPr>
-      <w:b/>
-      <w:sz w:val="20"/>
-      <w:szCs w:val="20"/>
-    </w:rPr>
-  </w:style>
-  <w:style w:customStyle="1" w:styleId="Abstract" w:type="paragraph">
-    <w:name w:val="Abstract"/>
-    <w:basedOn w:val="Normal"/>
-    <w:next w:val="BodyText"/>
-    <w:qFormat/>
-    <w:pPr>
-      <w:keepNext/>
-      <w:keepLines/>
-      <w:spacing w:after="300" w:before="100"/>
-    </w:pPr>
-    <w:rPr>
-      <w:sz w:val="20"/>
-      <w:szCs w:val="20"/>
-    </w:rPr>
-  </w:style>
-  <w:style w:styleId="Bibliography" w:type="paragraph">
-    <w:name w:val="Bibliography"/>
-    <w:basedOn w:val="Normal"/>
-    <w:next w:val="Bibliography"/>
-    <w:qFormat/>
-    <w:pPr/>
-    <w:rPr/>
-  </w:style>
-  <w:style w:styleId="Heading1" w:type="paragraph">
-    <w:name w:val="heading 1"/>
-    <w:basedOn w:val="Normal"/>
-    <w:next w:val="BodyText"/>
-    <w:link w:val="Heading1Char"/>
-    <w:uiPriority w:val="9"/>
-    <w:qFormat/>
-    <w:rsid w:val="00A10FD9"/>
-    <w:pPr>
-      <w:keepNext/>
-      <w:keepLines/>
-      <w:spacing w:after="80" w:before="360"/>
-      <w:outlineLvl w:val="0"/>
+      <w:spacing w:before="200"/>
+      <w:outlineLvl w:val="8"/>
     </w:pPr>
     <w:rPr>
       <w:rFonts w:asciiTheme="majorHAnsi" w:cstheme="majorBidi" w:eastAsiaTheme="majorEastAsia" w:hAnsiTheme="majorHAnsi"/>
-      <w:color w:themeColor="accent1" w:themeShade="BF" w:val="0F4761"/>
-      <w:sz w:val="40"/>
-      <w:szCs w:val="40"/>
+      <w:color w:themeColor="accent1" w:val="4F81BD"/>
     </w:rPr>
   </w:style>
-  <w:style w:styleId="Heading2" w:type="paragraph">
-    <w:name w:val="heading 2"/>
-    <w:basedOn w:val="Normal"/>
-    <w:next w:val="BodyText"/>
-    <w:link w:val="Heading2Char"/>
-    <w:uiPriority w:val="9"/>
+  <w:style w:default="1" w:styleId="a1" w:type="character">
+    <w:name w:val="Default Paragraph Font"/>
+    <w:uiPriority w:val="1"/>
     <w:semiHidden/>
     <w:unhideWhenUsed/>
-    <w:qFormat/>
-    <w:rsid w:val="00A10FD9"/>
-    <w:pPr>
-      <w:keepNext/>
-      <w:keepLines/>
-      <w:spacing w:after="80" w:before="160"/>
-      <w:outlineLvl w:val="1"/>
-    </w:pPr>
-    <w:rPr>
-      <w:rFonts w:asciiTheme="majorHAnsi" w:cstheme="majorBidi" w:eastAsiaTheme="majorEastAsia" w:hAnsiTheme="majorHAnsi"/>
-      <w:color w:themeColor="accent1" w:themeShade="BF" w:val="0F4761"/>
-      <w:sz w:val="32"/>
-      <w:szCs w:val="32"/>
-    </w:rPr>
-  </w:style>
-  <w:style w:styleId="Heading3" w:type="paragraph">
-    <w:name w:val="heading 3"/>
-    <w:basedOn w:val="Normal"/>
-    <w:next w:val="BodyText"/>
-    <w:link w:val="Heading3Char"/>
-    <w:uiPriority w:val="9"/>
+  </w:style>
+  <w:style w:default="1" w:styleId="a2" w:type="table">
+    <w:name w:val="Normal Table"/>
+    <w:uiPriority w:val="99"/>
     <w:semiHidden/>
     <w:unhideWhenUsed/>
-    <w:qFormat/>
-    <w:rsid w:val="00A10FD9"/>
-    <w:pPr>
-      <w:keepNext/>
-      <w:keepLines/>
-      <w:spacing w:after="80" w:before="160"/>
-      <w:outlineLvl w:val="2"/>
-    </w:pPr>
-    <w:rPr>
-      <w:rFonts w:cstheme="majorBidi" w:eastAsiaTheme="majorEastAsia"/>
-      <w:color w:themeColor="accent1" w:themeShade="BF" w:val="0F4761"/>
-      <w:sz w:val="28"/>
-      <w:szCs w:val="28"/>
-    </w:rPr>
-  </w:style>
-  <w:style w:styleId="Heading4" w:type="paragraph">
-    <w:name w:val="heading 4"/>
-    <w:basedOn w:val="Normal"/>
-    <w:next w:val="BodyText"/>
-    <w:link w:val="Heading4Char"/>
-    <w:uiPriority w:val="9"/>
-    <w:semiHidden/>
-    <w:unhideWhenUsed/>
-    <w:qFormat/>
-    <w:rsid w:val="00A10FD9"/>
-    <w:pPr>
-      <w:keepNext/>
-      <w:keepLines/>
-      <w:spacing w:after="40" w:before="80"/>
-      <w:outlineLvl w:val="3"/>
-    </w:pPr>
-    <w:rPr>
-      <w:rFonts w:cstheme="majorBidi" w:eastAsiaTheme="majorEastAsia"/>
-      <w:i/>
-      <w:iCs/>
-      <w:color w:themeColor="accent1" w:themeShade="BF" w:val="0F4761"/>
-    </w:rPr>
-  </w:style>
-  <w:style w:styleId="Heading5" w:type="paragraph">
-    <w:name w:val="heading 5"/>
-    <w:basedOn w:val="Normal"/>
-    <w:next w:val="BodyText"/>
-    <w:link w:val="Heading5Char"/>
-    <w:uiPriority w:val="9"/>
-    <w:semiHidden/>
-    <w:unhideWhenUsed/>
-    <w:qFormat/>
-    <w:rsid w:val="00A10FD9"/>
-    <w:pPr>
-      <w:keepNext/>
-      <w:keepLines/>
-      <w:spacing w:after="40" w:before="80"/>
-      <w:outlineLvl w:val="4"/>
-    </w:pPr>
-    <w:rPr>
-      <w:rFonts w:cstheme="majorBidi" w:eastAsiaTheme="majorEastAsia"/>
-      <w:color w:themeColor="accent1" w:themeShade="BF" w:val="0F4761"/>
-    </w:rPr>
-  </w:style>
-  <w:style w:styleId="Heading6" w:type="paragraph">
-    <w:name w:val="heading 6"/>
-    <w:basedOn w:val="Normal"/>
-    <w:next w:val="BodyText"/>
-    <w:link w:val="Heading6Char"/>
-    <w:uiPriority w:val="9"/>
-    <w:semiHidden/>
-    <w:unhideWhenUsed/>
-    <w:qFormat/>
-    <w:rsid w:val="00A10FD9"/>
-    <w:pPr>
-      <w:keepNext/>
-      <w:keepLines/>
-      <w:spacing w:after="0" w:before="40"/>
-      <w:outlineLvl w:val="5"/>
-    </w:pPr>
-    <w:rPr>
-      <w:rFonts w:cstheme="majorBidi" w:eastAsiaTheme="majorEastAsia"/>
-      <w:i/>
-      <w:iCs/>
-      <w:color w:themeColor="text1" w:themeTint="A6" w:val="595959"/>
-    </w:rPr>
-  </w:style>
-  <w:style w:styleId="Heading7" w:type="paragraph">
-    <w:name w:val="heading 7"/>
-    <w:basedOn w:val="Normal"/>
-    <w:next w:val="BodyText"/>
-    <w:link w:val="Heading7Char"/>
-    <w:uiPriority w:val="9"/>
-    <w:semiHidden/>
-    <w:unhideWhenUsed/>
-    <w:qFormat/>
-    <w:rsid w:val="00A10FD9"/>
-    <w:pPr>
-      <w:keepNext/>
-      <w:keepLines/>
-      <w:spacing w:after="0" w:before="40"/>
-      <w:outlineLvl w:val="6"/>
-    </w:pPr>
-    <w:rPr>
-      <w:rFonts w:cstheme="majorBidi" w:eastAsiaTheme="majorEastAsia"/>
-      <w:color w:themeColor="text1" w:themeTint="A6" w:val="595959"/>
-    </w:rPr>
-  </w:style>
-  <w:style w:styleId="Heading8" w:type="paragraph">
-    <w:name w:val="heading 8"/>
-    <w:basedOn w:val="Normal"/>
-    <w:next w:val="BodyText"/>
-    <w:link w:val="Heading8Char"/>
-    <w:uiPriority w:val="9"/>
-    <w:semiHidden/>
-    <w:unhideWhenUsed/>
-    <w:qFormat/>
-    <w:rsid w:val="00A10FD9"/>
-    <w:pPr>
-      <w:keepNext/>
-      <w:keepLines/>
-      <w:spacing w:after="0"/>
-      <w:outlineLvl w:val="7"/>
-    </w:pPr>
-    <w:rPr>
-      <w:rFonts w:cstheme="majorBidi" w:eastAsiaTheme="majorEastAsia"/>
-      <w:i/>
-      <w:iCs/>
-      <w:color w:themeColor="text1" w:themeTint="D8" w:val="272727"/>
-    </w:rPr>
-  </w:style>
-  <w:style w:styleId="Heading9" w:type="paragraph">
-    <w:name w:val="heading 9"/>
-    <w:basedOn w:val="Normal"/>
-    <w:next w:val="BodyText"/>
-    <w:link w:val="Heading9Char"/>
-    <w:uiPriority w:val="9"/>
-    <w:semiHidden/>
-    <w:unhideWhenUsed/>
-    <w:qFormat/>
-    <w:rsid w:val="00A10FD9"/>
-    <w:pPr>
-      <w:keepNext/>
-      <w:keepLines/>
-      <w:spacing w:after="0"/>
-      <w:outlineLvl w:val="8"/>
-    </w:pPr>
-    <w:rPr>
-      <w:rFonts w:cstheme="majorBidi" w:eastAsiaTheme="majorEastAsia"/>
-      <w:color w:themeColor="text1" w:themeTint="D8" w:val="272727"/>
-    </w:rPr>
-  </w:style>
-  <w:style w:customStyle="1" w:styleId="Heading1Char" w:type="character">
-    <w:name w:val="Heading 1 Char"/>
-    <w:basedOn w:val="DefaultParagraphFont"/>
-    <w:link w:val="Heading1"/>
-    <w:uiPriority w:val="9"/>
-    <w:rsid w:val="00A10FD9"/>
-    <w:rPr>
-      <w:rFonts w:asciiTheme="majorHAnsi" w:cstheme="majorBidi" w:eastAsiaTheme="majorEastAsia" w:hAnsiTheme="majorHAnsi"/>
-      <w:color w:themeColor="accent1" w:themeShade="BF" w:val="0F4761"/>
-      <w:sz w:val="40"/>
-      <w:szCs w:val="40"/>
-    </w:rPr>
-  </w:style>
-  <w:style w:customStyle="1" w:styleId="Heading2Char" w:type="character">
-    <w:name w:val="Heading 2 Char"/>
-    <w:basedOn w:val="DefaultParagraphFont"/>
-    <w:link w:val="Heading2"/>
-    <w:uiPriority w:val="9"/>
-    <w:semiHidden/>
-    <w:rsid w:val="00A10FD9"/>
-    <w:rPr>
-      <w:rFonts w:asciiTheme="majorHAnsi" w:cstheme="majorBidi" w:eastAsiaTheme="majorEastAsia" w:hAnsiTheme="majorHAnsi"/>
-      <w:color w:themeColor="accent1" w:themeShade="BF" w:val="0F4761"/>
-      <w:sz w:val="32"/>
-      <w:szCs w:val="32"/>
-    </w:rPr>
-  </w:style>
-  <w:style w:customStyle="1" w:styleId="Heading3Char" w:type="character">
-    <w:name w:val="Heading 3 Char"/>
-    <w:basedOn w:val="DefaultParagraphFont"/>
-    <w:link w:val="Heading3"/>
-    <w:uiPriority w:val="9"/>
-    <w:semiHidden/>
-    <w:rsid w:val="00A10FD9"/>
-    <w:rPr>
-      <w:rFonts w:cstheme="majorBidi" w:eastAsiaTheme="majorEastAsia"/>
-      <w:color w:themeColor="accent1" w:themeShade="BF" w:val="0F4761"/>
-      <w:sz w:val="28"/>
-      <w:szCs w:val="28"/>
-    </w:rPr>
-  </w:style>
-  <w:style w:customStyle="1" w:styleId="Heading4Char" w:type="character">
-    <w:name w:val="Heading 4 Char"/>
-    <w:basedOn w:val="DefaultParagraphFont"/>
-    <w:link w:val="Heading4"/>
-    <w:uiPriority w:val="9"/>
-    <w:semiHidden/>
-    <w:rsid w:val="00A10FD9"/>
-    <w:rPr>
-      <w:rFonts w:cstheme="majorBidi" w:eastAsiaTheme="majorEastAsia"/>
-      <w:i/>
-      <w:iCs/>
-      <w:color w:themeColor="accent1" w:themeShade="BF" w:val="0F4761"/>
-    </w:rPr>
-  </w:style>
-  <w:style w:customStyle="1" w:styleId="Heading5Char" w:type="character">
-    <w:name w:val="Heading 5 Char"/>
-    <w:basedOn w:val="DefaultParagraphFont"/>
-    <w:link w:val="Heading5"/>
-    <w:uiPriority w:val="9"/>
-    <w:semiHidden/>
-    <w:rsid w:val="00A10FD9"/>
-    <w:rPr>
-      <w:rFonts w:cstheme="majorBidi" w:eastAsiaTheme="majorEastAsia"/>
-      <w:color w:themeColor="accent1" w:themeShade="BF" w:val="0F4761"/>
-    </w:rPr>
-  </w:style>
-  <w:style w:customStyle="1" w:styleId="Heading6Char" w:type="character">
-    <w:name w:val="Heading 6 Char"/>
-    <w:basedOn w:val="DefaultParagraphFont"/>
-    <w:link w:val="Heading6"/>
-    <w:uiPriority w:val="9"/>
-    <w:semiHidden/>
-    <w:rsid w:val="00A10FD9"/>
-    <w:rPr>
-      <w:rFonts w:cstheme="majorBidi" w:eastAsiaTheme="majorEastAsia"/>
-      <w:i/>
-      <w:iCs/>
-      <w:color w:themeColor="text1" w:themeTint="A6" w:val="595959"/>
-    </w:rPr>
-  </w:style>
-  <w:style w:customStyle="1" w:styleId="Heading7Char" w:type="character">
-    <w:name w:val="Heading 7 Char"/>
-    <w:basedOn w:val="DefaultParagraphFont"/>
-    <w:link w:val="Heading7"/>
-    <w:uiPriority w:val="9"/>
-    <w:semiHidden/>
-    <w:rsid w:val="00A10FD9"/>
-    <w:rPr>
-      <w:rFonts w:cstheme="majorBidi" w:eastAsiaTheme="majorEastAsia"/>
-      <w:color w:themeColor="text1" w:themeTint="A6" w:val="595959"/>
-    </w:rPr>
-  </w:style>
-  <w:style w:customStyle="1" w:styleId="Heading8Char" w:type="character">
-    <w:name w:val="Heading 8 Char"/>
-    <w:basedOn w:val="DefaultParagraphFont"/>
-    <w:link w:val="Heading8"/>
-    <w:uiPriority w:val="9"/>
-    <w:semiHidden/>
-    <w:rsid w:val="00A10FD9"/>
-    <w:rPr>
-      <w:rFonts w:cstheme="majorBidi" w:eastAsiaTheme="majorEastAsia"/>
-      <w:i/>
-      <w:iCs/>
-      <w:color w:themeColor="text1" w:themeTint="D8" w:val="272727"/>
-    </w:rPr>
-  </w:style>
-  <w:style w:customStyle="1" w:styleId="Heading9Char" w:type="character">
-    <w:name w:val="Heading 9 Char"/>
-    <w:basedOn w:val="DefaultParagraphFont"/>
-    <w:link w:val="Heading9"/>
-    <w:uiPriority w:val="9"/>
-    <w:semiHidden/>
-    <w:rsid w:val="00A10FD9"/>
-    <w:rPr>
-      <w:rFonts w:cstheme="majorBidi" w:eastAsiaTheme="majorEastAsia"/>
-      <w:color w:themeColor="text1" w:themeTint="D8" w:val="272727"/>
-    </w:rPr>
-  </w:style>
-  <w:style w:styleId="BlockText" w:type="paragraph">
-    <w:name w:val="Block Text"/>
-    <w:basedOn w:val="BodyText"/>
-    <w:next w:val="BodyText"/>
-    <w:uiPriority w:val="9"/>
-    <w:unhideWhenUsed/>
-    <w:qFormat/>
-    <w:pPr>
-      <w:spacing w:after="100" w:before="100"/>
-      <w:ind w:firstLine="0" w:left="480" w:right="480"/>
-    </w:pPr>
-  </w:style>
-  <w:style w:styleId="FootnoteText" w:type="paragraph">
-    <w:name w:val="Footnote Text"/>
-    <w:basedOn w:val="Normal"/>
-    <w:next w:val="FootnoteText"/>
-    <w:uiPriority w:val="9"/>
-    <w:unhideWhenUsed/>
-    <w:qFormat/>
-  </w:style>
-  <w:style w:styleId="FootnoteBlockText" w:type="paragraph">
-    <w:name w:val="Footnote Block Text"/>
-    <w:basedOn w:val="FootnoteText"/>
-    <w:next w:val="FootnoteText"/>
-    <w:uiPriority w:val="9"/>
-    <w:unhideWhenUsed/>
-    <w:qFormat/>
-    <w:pPr>
-      <w:spacing w:after="100" w:before="100"/>
-      <w:ind w:firstLine="0" w:left="480" w:right="480"/>
-    </w:pPr>
-  </w:style>
-  <w:style w:default="1" w:styleId="DefaultParagraphFont" w:type="character">
-    <w:name w:val="Default Paragraph Font"/>
-    <w:semiHidden/>
-    <w:unhideWhenUsed/>
-  </w:style>
-  <w:style w:default="1" w:styleId="Table" w:type="table">
-    <w:name w:val="Table"/>
-    <w:basedOn w:val="TableNormal"/>
-    <w:semiHidden/>
-    <w:unhideWhenUsed/>
-    <w:qFormat/>
     <w:tblPr>
       <w:tblInd w:type="dxa" w:w="0"/>
       <w:tblCellMar>
@@ -6003,23 +6876,206 @@
         <w:right w:type="dxa" w:w="108"/>
       </w:tblCellMar>
     </w:tblPr>
+  </w:style>
+  <w:style w:default="1" w:styleId="a3" w:type="numbering">
+    <w:name w:val="No List"/>
+    <w:uiPriority w:val="99"/>
+    <w:semiHidden/>
+    <w:unhideWhenUsed/>
+  </w:style>
+  <w:style w:styleId="a0" w:type="paragraph">
+    <w:name w:val="Body Text"/>
+    <w:basedOn w:val="FirstParagraph"/>
+    <w:link w:val="a4"/>
+    <w:qFormat/>
+    <w:rsid w:val="00743667"/>
+  </w:style>
+  <w:style w:customStyle="1" w:styleId="FirstParagraph" w:type="paragraph">
+    <w:name w:val="First Paragraph"/>
+    <w:basedOn w:val="a"/>
+    <w:next w:val="a0"/>
+    <w:qFormat/>
+    <w:rsid w:val="006629BB"/>
+    <w:pPr>
+      <w:spacing w:before="180"/>
+      <w:ind w:firstLine="200" w:firstLineChars="200"/>
+    </w:pPr>
+    <w:rPr>
+      <w:lang w:eastAsia="zh-CN"/>
+    </w:rPr>
+  </w:style>
+  <w:style w:customStyle="1" w:styleId="Compact" w:type="paragraph">
+    <w:name w:val="Compact"/>
+    <w:basedOn w:val="a0"/>
+    <w:qFormat/>
+    <w:rsid w:val="001B6BBA"/>
+    <w:pPr>
+      <w:spacing w:after="60" w:before="60"/>
+      <w:ind w:firstLine="0" w:firstLineChars="0"/>
+    </w:pPr>
+  </w:style>
+  <w:style w:styleId="a5" w:type="paragraph">
+    <w:name w:val="Title"/>
+    <w:basedOn w:val="a"/>
+    <w:next w:val="a0"/>
+    <w:qFormat/>
+    <w:pPr>
+      <w:keepNext/>
+      <w:keepLines/>
+      <w:spacing w:after="240" w:before="480"/>
+      <w:jc w:val="center"/>
+    </w:pPr>
+    <w:rPr>
+      <w:rFonts w:asciiTheme="majorHAnsi" w:cstheme="majorBidi" w:eastAsiaTheme="majorEastAsia" w:hAnsiTheme="majorHAnsi"/>
+      <w:b/>
+      <w:bCs/>
+      <w:color w:themeColor="accent1" w:themeShade="B5" w:val="345A8A"/>
+      <w:sz w:val="36"/>
+      <w:szCs w:val="36"/>
+    </w:rPr>
+  </w:style>
+  <w:style w:styleId="a6" w:type="paragraph">
+    <w:name w:val="Subtitle"/>
+    <w:basedOn w:val="a5"/>
+    <w:next w:val="a0"/>
+    <w:qFormat/>
+    <w:pPr>
+      <w:spacing w:before="240"/>
+    </w:pPr>
+    <w:rPr>
+      <w:sz w:val="30"/>
+      <w:szCs w:val="30"/>
+    </w:rPr>
+  </w:style>
+  <w:style w:customStyle="1" w:styleId="Author" w:type="paragraph">
+    <w:name w:val="Author"/>
+    <w:next w:val="a0"/>
+    <w:qFormat/>
+    <w:pPr>
+      <w:keepNext/>
+      <w:keepLines/>
+      <w:jc w:val="center"/>
+    </w:pPr>
+  </w:style>
+  <w:style w:styleId="a7" w:type="paragraph">
+    <w:name w:val="Date"/>
+    <w:next w:val="a0"/>
+    <w:qFormat/>
+    <w:pPr>
+      <w:keepNext/>
+      <w:keepLines/>
+      <w:jc w:val="center"/>
+    </w:pPr>
+  </w:style>
+  <w:style w:customStyle="1" w:styleId="Abstract" w:type="paragraph">
+    <w:name w:val="Abstract"/>
+    <w:basedOn w:val="a"/>
+    <w:next w:val="a0"/>
+    <w:qFormat/>
+    <w:pPr>
+      <w:keepNext/>
+      <w:keepLines/>
+      <w:spacing w:after="300" w:before="300"/>
+    </w:pPr>
+    <w:rPr>
+      <w:sz w:val="20"/>
+      <w:szCs w:val="20"/>
+    </w:rPr>
+  </w:style>
+  <w:style w:styleId="a8" w:type="paragraph">
+    <w:name w:val="Bibliography"/>
+    <w:basedOn w:val="a"/>
+    <w:qFormat/>
+    <w:rsid w:val="006629BB"/>
+    <w:pPr>
+      <w:tabs>
+        <w:tab w:pos="384" w:val="left"/>
+      </w:tabs>
+      <w:ind w:hanging="200" w:hangingChars="200" w:left="200"/>
+    </w:pPr>
+  </w:style>
+  <w:style w:styleId="a9" w:type="paragraph">
+    <w:name w:val="Block Text"/>
+    <w:basedOn w:val="a"/>
+    <w:uiPriority w:val="9"/>
+    <w:unhideWhenUsed/>
+    <w:qFormat/>
+    <w:rsid w:val="00113CC5"/>
+    <w:pPr>
+      <w:pBdr>
+        <w:left w:color="BFBFBF" w:space="4" w:sz="48" w:themeColor="background1" w:themeShade="BF" w:val="single"/>
+      </w:pBdr>
+      <w:spacing w:before="100"/>
+      <w:ind w:left="200" w:leftChars="200" w:right="100" w:rightChars="100"/>
+    </w:pPr>
+    <w:rPr>
+      <w:rFonts w:eastAsiaTheme="minorEastAsia"/>
+      <w:lang w:eastAsia="zh-CN"/>
+    </w:rPr>
+  </w:style>
+  <w:style w:styleId="aa" w:type="paragraph">
+    <w:name w:val="footnote text"/>
+    <w:basedOn w:val="a"/>
+    <w:uiPriority w:val="9"/>
+    <w:unhideWhenUsed/>
+    <w:qFormat/>
+  </w:style>
+  <w:style w:customStyle="1" w:styleId="Table" w:type="table">
+    <w:name w:val="Table"/>
+    <w:semiHidden/>
+    <w:unhideWhenUsed/>
+    <w:qFormat/>
+    <w:rsid w:val="004F42FD"/>
+    <w:pPr>
+      <w:jc w:val="center"/>
+    </w:pPr>
+    <w:rPr>
+      <w:rFonts w:ascii="Times New Roman" w:eastAsia="宋体" w:hAnsi="Times New Roman"/>
+      <w:sz w:val="20"/>
+      <w:szCs w:val="20"/>
+      <w:lang w:eastAsia="zh-CN"/>
+    </w:rPr>
+    <w:tblPr>
+      <w:jc w:val="center"/>
+      <w:tblInd w:type="dxa" w:w="0"/>
+      <w:tblBorders>
+        <w:top w:color="auto" w:space="0" w:sz="12" w:val="single"/>
+        <w:bottom w:color="auto" w:space="0" w:sz="12" w:val="single"/>
+      </w:tblBorders>
+      <w:tblCellMar>
+        <w:top w:type="dxa" w:w="0"/>
+        <w:left w:type="dxa" w:w="108"/>
+        <w:bottom w:type="dxa" w:w="0"/>
+        <w:right w:type="dxa" w:w="108"/>
+      </w:tblCellMar>
+    </w:tblPr>
+    <w:trPr>
+      <w:jc w:val="center"/>
+    </w:trPr>
+    <w:tcPr>
+      <w:vAlign w:val="center"/>
+    </w:tcPr>
     <w:tblStylePr w:type="firstRow">
+      <w:rPr>
+        <w:rFonts w:eastAsia="宋体"/>
+        <w:b/>
+        <w:i w:val="0"/>
+      </w:rPr>
+      <w:tblPr/>
       <w:tcPr>
         <w:tcBorders>
-          <w:bottom w:val="single"/>
+          <w:bottom w:color="auto" w:space="0" w:sz="4" w:val="single"/>
         </w:tcBorders>
-        <w:vAlign w:val="bottom"/>
       </w:tcPr>
     </w:tblStylePr>
   </w:style>
   <w:style w:customStyle="1" w:styleId="DefinitionTerm" w:type="paragraph">
     <w:name w:val="Definition Term"/>
-    <w:basedOn w:val="Normal"/>
+    <w:basedOn w:val="a"/>
     <w:next w:val="Definition"/>
     <w:pPr>
       <w:keepNext/>
       <w:keepLines/>
-      <w:spacing w:after="0"/>
     </w:pPr>
     <w:rPr>
       <w:b/>
@@ -6027,76 +7083,88 @@
   </w:style>
   <w:style w:customStyle="1" w:styleId="Definition" w:type="paragraph">
     <w:name w:val="Definition"/>
-    <w:basedOn w:val="Normal"/>
-  </w:style>
-  <w:style w:styleId="Caption" w:type="paragraph">
-    <w:name w:val="Caption"/>
-    <w:basedOn w:val="Normal"/>
-    <w:link w:val="BodyTextChar"/>
+    <w:basedOn w:val="a"/>
+  </w:style>
+  <w:style w:styleId="ab" w:type="paragraph">
+    <w:name w:val="caption"/>
+    <w:basedOn w:val="a"/>
+    <w:link w:val="ac"/>
+    <w:rsid w:val="005D0F42"/>
     <w:pPr>
-      <w:spacing w:after="120" w:before="0"/>
+      <w:spacing w:after="120"/>
+      <w:jc w:val="center"/>
     </w:pPr>
-    <w:rPr>
-      <w:i/>
-    </w:rPr>
   </w:style>
   <w:style w:customStyle="1" w:styleId="TableCaption" w:type="paragraph">
     <w:name w:val="Table Caption"/>
-    <w:basedOn w:val="Caption"/>
+    <w:basedOn w:val="ab"/>
     <w:pPr>
       <w:keepNext/>
     </w:pPr>
   </w:style>
   <w:style w:customStyle="1" w:styleId="ImageCaption" w:type="paragraph">
     <w:name w:val="Image Caption"/>
-    <w:basedOn w:val="Caption"/>
+    <w:basedOn w:val="ab"/>
   </w:style>
   <w:style w:customStyle="1" w:styleId="Figure" w:type="paragraph">
     <w:name w:val="Figure"/>
-    <w:basedOn w:val="Normal"/>
+    <w:basedOn w:val="a"/>
+    <w:rsid w:val="00D048A6"/>
+    <w:pPr>
+      <w:jc w:val="center"/>
+    </w:pPr>
   </w:style>
   <w:style w:customStyle="1" w:styleId="CaptionedFigure" w:type="paragraph">
     <w:name w:val="Captioned Figure"/>
     <w:basedOn w:val="Figure"/>
+    <w:rsid w:val="00B8037B"/>
     <w:pPr>
       <w:keepNext/>
     </w:pPr>
   </w:style>
-  <w:style w:customStyle="1" w:styleId="BodyTextChar" w:type="character">
-    <w:name w:val="Body Text Char"/>
-    <w:basedOn w:val="DefaultParagraphFont"/>
-    <w:link w:val="BodyText"/>
+  <w:style w:customStyle="1" w:styleId="ac" w:type="character">
+    <w:name w:val="题注 字符"/>
+    <w:basedOn w:val="a1"/>
+    <w:link w:val="ab"/>
+    <w:rsid w:val="005D0F42"/>
+    <w:rPr>
+      <w:rFonts w:ascii="Times New Roman" w:eastAsia="宋体" w:hAnsi="Times New Roman"/>
+    </w:rPr>
   </w:style>
   <w:style w:customStyle="1" w:styleId="VerbatimChar" w:type="character">
     <w:name w:val="Verbatim Char"/>
-    <w:basedOn w:val="BodyTextChar"/>
+    <w:basedOn w:val="ac"/>
+    <w:link w:val="SourceCode"/>
+    <w:rsid w:val="00BF2EFB"/>
     <w:rPr>
-      <w:rFonts w:ascii="Consolas" w:hAnsi="Consolas"/>
-      <w:sz w:val="22"/>
+      <w:rFonts w:ascii="Fira Code" w:cs="Times New Roman (正文 CS 字体)" w:eastAsia="宋体" w:hAnsi="Fira Code"/>
+      <w:color w:themeColor="text1" w:themeTint="BF" w:val="404040"/>
+      <w:sz w:val="21"/>
+      <w:shd w:color="F3F4F4" w:fill="FFFFFF" w:themeFill="background1" w:val="clear"/>
+      <w:lang w:eastAsia="zh-CN"/>
     </w:rPr>
   </w:style>
-  <w:style w:customStyle="1" w:styleId="SectionNumber" w:type="character">
-    <w:name w:val="Section Number"/>
-    <w:basedOn w:val="BodyTextChar"/>
-  </w:style>
-  <w:style w:styleId="FootnoteReference" w:type="character">
-    <w:name w:val="Footnote Reference"/>
-    <w:basedOn w:val="BodyTextChar"/>
+  <w:style w:styleId="ad" w:type="character">
+    <w:name w:val="footnote reference"/>
+    <w:basedOn w:val="ac"/>
     <w:rPr>
+      <w:rFonts w:ascii="Times New Roman" w:eastAsia="宋体" w:hAnsi="Times New Roman"/>
       <w:vertAlign w:val="superscript"/>
     </w:rPr>
   </w:style>
-  <w:style w:styleId="Hyperlink" w:type="character">
+  <w:style w:styleId="ae" w:type="character">
     <w:name w:val="Hyperlink"/>
-    <w:basedOn w:val="BodyTextChar"/>
+    <w:basedOn w:val="ac"/>
+    <w:rsid w:val="000C100F"/>
     <w:rPr>
-      <w:color w:themeColor="accent1" w:val="4F81BD"/>
+      <w:rFonts w:ascii="Times New Roman" w:eastAsia="宋体" w:hAnsi="Times New Roman"/>
+      <w:color w:val="0070C0"/>
     </w:rPr>
   </w:style>
-  <w:style w:styleId="TOCHeading" w:type="paragraph">
+  <w:style w:styleId="TOC" w:type="paragraph">
     <w:name w:val="TOC Heading"/>
-    <w:basedOn w:val="Heading1"/>
-    <w:next w:val="BodyText"/>
+    <w:basedOn w:val="10"/>
+    <w:next w:val="a0"/>
     <w:uiPriority w:val="39"/>
     <w:unhideWhenUsed/>
     <w:qFormat/>
@@ -6105,19 +7173,195 @@
       <w:outlineLvl w:val="9"/>
     </w:pPr>
     <w:rPr>
-      <w:rFonts w:asciiTheme="majorHAnsi" w:cstheme="majorBidi" w:eastAsiaTheme="majorEastAsia" w:hAnsiTheme="majorHAnsi"/>
       <w:b w:val="0"/>
       <w:bCs w:val="0"/>
       <w:color w:themeColor="accent1" w:themeShade="BF" w:val="365F91"/>
     </w:rPr>
   </w:style>
-  <w:style w:type="paragraph" w:customStyle="1" w:styleId="SourceCode">
+  <w:style w:customStyle="1" w:styleId="SourceCode" w:type="paragraph">
     <w:name w:val="Source Code"/>
-    <w:basedOn w:val="Normal"/>
+    <w:basedOn w:val="a"/>
     <w:link w:val="VerbatimChar"/>
+    <w:qFormat/>
+    <w:rsid w:val="00BF2EFB"/>
     <w:pPr>
-      <w:wordWrap w:val="off"/>
+      <w:pBdr>
+        <w:top w:color="BFBFBF" w:space="10" w:sz="8" w:themeColor="background1" w:themeShade="BF" w:val="single"/>
+        <w:left w:color="BFBFBF" w:space="10" w:sz="8" w:themeColor="background1" w:themeShade="BF" w:val="single"/>
+        <w:bottom w:color="BFBFBF" w:space="10" w:sz="8" w:themeColor="background1" w:themeShade="BF" w:val="single"/>
+        <w:right w:color="BFBFBF" w:space="10" w:sz="8" w:themeColor="background1" w:themeShade="BF" w:val="single"/>
+      </w:pBdr>
+      <w:shd w:color="F3F4F4" w:fill="FFFFFF" w:themeFill="background1" w:val="clear"/>
+      <w:wordWrap w:val="0"/>
+      <w:ind w:left="300" w:leftChars="300"/>
     </w:pPr>
+    <w:rPr>
+      <w:rFonts w:ascii="Fira Code" w:cs="Times New Roman (正文 CS 字体)" w:hAnsi="Fira Code"/>
+      <w:color w:themeColor="text1" w:themeTint="BF" w:val="404040"/>
+      <w:sz w:val="21"/>
+      <w:shd w:color="auto" w:fill="auto" w:val="pct5"/>
+      <w:lang w:eastAsia="zh-CN"/>
+    </w:rPr>
+  </w:style>
+  <w:style w:customStyle="1" w:styleId="a4" w:type="character">
+    <w:name w:val="正文文本 字符"/>
+    <w:basedOn w:val="a1"/>
+    <w:link w:val="a0"/>
+    <w:rsid w:val="00743667"/>
+    <w:rPr>
+      <w:rFonts w:ascii="Times New Roman" w:eastAsia="宋体" w:hAnsi="Times New Roman"/>
+      <w:lang w:eastAsia="zh-CN"/>
+    </w:rPr>
+  </w:style>
+  <w:style w:styleId="af" w:type="paragraph">
+    <w:name w:val="header"/>
+    <w:basedOn w:val="a"/>
+    <w:link w:val="af0"/>
+    <w:rsid w:val="00797A2D"/>
+    <w:pPr>
+      <w:tabs>
+        <w:tab w:pos="4153" w:val="center"/>
+        <w:tab w:pos="8306" w:val="right"/>
+      </w:tabs>
+      <w:snapToGrid w:val="0"/>
+      <w:jc w:val="center"/>
+    </w:pPr>
+    <w:rPr>
+      <w:sz w:val="18"/>
+      <w:szCs w:val="18"/>
+    </w:rPr>
+  </w:style>
+  <w:style w:customStyle="1" w:styleId="af0" w:type="character">
+    <w:name w:val="页眉 字符"/>
+    <w:basedOn w:val="a1"/>
+    <w:link w:val="af"/>
+    <w:rsid w:val="00797A2D"/>
+    <w:rPr>
+      <w:sz w:val="18"/>
+      <w:szCs w:val="18"/>
+    </w:rPr>
+  </w:style>
+  <w:style w:styleId="af1" w:type="paragraph">
+    <w:name w:val="footer"/>
+    <w:basedOn w:val="a"/>
+    <w:link w:val="af2"/>
+    <w:uiPriority w:val="99"/>
+    <w:rsid w:val="00797A2D"/>
+    <w:pPr>
+      <w:tabs>
+        <w:tab w:pos="4153" w:val="center"/>
+        <w:tab w:pos="8306" w:val="right"/>
+      </w:tabs>
+      <w:snapToGrid w:val="0"/>
+    </w:pPr>
+    <w:rPr>
+      <w:sz w:val="18"/>
+      <w:szCs w:val="18"/>
+    </w:rPr>
+  </w:style>
+  <w:style w:customStyle="1" w:styleId="af2" w:type="character">
+    <w:name w:val="页脚 字符"/>
+    <w:basedOn w:val="a1"/>
+    <w:link w:val="af1"/>
+    <w:uiPriority w:val="99"/>
+    <w:rsid w:val="00797A2D"/>
+    <w:rPr>
+      <w:sz w:val="18"/>
+      <w:szCs w:val="18"/>
+    </w:rPr>
+  </w:style>
+  <w:style w:customStyle="1" w:styleId="1" w:type="numbering">
+    <w:name w:val="列表1"/>
+    <w:uiPriority w:val="99"/>
+    <w:rsid w:val="00797A2D"/>
+    <w:pPr>
+      <w:numPr>
+        <w:numId w:val="1"/>
+      </w:numPr>
+    </w:pPr>
+  </w:style>
+  <w:style w:customStyle="1" w:styleId="2" w:type="numbering">
+    <w:name w:val="列表2"/>
+    <w:uiPriority w:val="99"/>
+    <w:rsid w:val="00D42F07"/>
+    <w:pPr>
+      <w:numPr>
+        <w:numId w:val="2"/>
+      </w:numPr>
+    </w:pPr>
+  </w:style>
+  <w:style w:customStyle="1" w:styleId="af3" w:type="paragraph">
+    <w:name w:val="图片"/>
+    <w:basedOn w:val="FirstParagraph"/>
+    <w:qFormat/>
+    <w:rsid w:val="005D0F42"/>
+    <w:pPr>
+      <w:keepNext/>
+      <w:jc w:val="center"/>
+    </w:pPr>
+    <w:rPr>
+      <w:noProof/>
+    </w:rPr>
+  </w:style>
+  <w:style w:customStyle="1" w:styleId="Compact10071" w:type="paragraph">
+    <w:name w:val="样式 Compact + 10 磅 首行缩进:  0.71 厘米"/>
+    <w:basedOn w:val="Compact"/>
+    <w:rsid w:val="00BF4643"/>
+    <w:rPr>
+      <w:rFonts w:cs="宋体"/>
+      <w:sz w:val="20"/>
+      <w:szCs w:val="20"/>
+    </w:rPr>
+  </w:style>
+  <w:style w:customStyle="1" w:styleId="Compact100710" w:type="paragraph">
+    <w:name w:val="样式 Compact + 10 磅 加粗 首行缩进:  0.71 厘米"/>
+    <w:basedOn w:val="Compact"/>
+    <w:rsid w:val="004F42FD"/>
+    <w:rPr>
+      <w:rFonts w:cs="宋体"/>
+      <w:bCs/>
+      <w:sz w:val="20"/>
+      <w:szCs w:val="20"/>
+    </w:rPr>
+  </w:style>
+  <w:style w:customStyle="1" w:styleId="img" w:type="paragraph">
+    <w:name w:val="img"/>
+    <w:basedOn w:val="a"/>
+    <w:qFormat/>
+    <w:rsid w:val="00C22998"/>
+    <w:pPr>
+      <w:jc w:val="center"/>
+    </w:pPr>
+    <w:rPr>
+      <w:lang w:eastAsia="zh-CN"/>
+    </w:rPr>
+  </w:style>
+  <w:style w:customStyle="1" w:styleId="40" w:type="character">
+    <w:name w:val="标题 4 字符"/>
+    <w:basedOn w:val="a1"/>
+    <w:link w:val="4"/>
+    <w:uiPriority w:val="9"/>
+    <w:rsid w:val="004A10CE"/>
+    <w:rPr>
+      <w:rFonts w:ascii="Times New Roman" w:cstheme="majorBidi" w:eastAsia="黑体" w:hAnsi="Times New Roman"/>
+      <w:b/>
+      <w:bCs/>
+    </w:rPr>
+  </w:style>
+  <w:style w:customStyle="1" w:styleId="InlineCode" w:type="character">
+    <w:name w:val="Inline Code"/>
+    <w:basedOn w:val="a1"/>
+    <w:uiPriority w:val="1"/>
+    <w:qFormat/>
+    <w:rsid w:val="00956EAC"/>
+    <w:rPr>
+      <w:rFonts w:ascii="Fira Code" w:cs="Times New Roman (正文 CS 字体)" w:eastAsia="宋体" w:hAnsi="Fira Code"/>
+      <w:color w:themeColor="text1" w:themeTint="BF" w:val="404040"/>
+      <w:sz w:val="21"/>
+      <w:bdr w:color="auto" w:space="0" w:sz="0" w:val="none"/>
+      <w:shd w:color="F3F4F4" w:fill="F2F2F2" w:themeFill="background1" w:themeFillShade="F2" w:val="clear"/>
+      <w:lang w:eastAsia="zh-CN"/>
+    </w:rPr>
   </w:style>
   <w:style w:type="character" w:customStyle="1" w:styleId="KeywordTok">
     <w:name w:val="KeywordTok"/>
@@ -6359,44 +7603,44 @@
         <a:sysClr val="window" lastClr="FFFFFF"/>
       </a:lt1>
       <a:dk2>
-        <a:srgbClr val="0E2841"/>
+        <a:srgbClr val="1F497D"/>
       </a:dk2>
       <a:lt2>
-        <a:srgbClr val="E8E8E8"/>
+        <a:srgbClr val="EEECE1"/>
       </a:lt2>
       <a:accent1>
-        <a:srgbClr val="156082"/>
+        <a:srgbClr val="4F81BD"/>
       </a:accent1>
       <a:accent2>
-        <a:srgbClr val="E97132"/>
+        <a:srgbClr val="C0504D"/>
       </a:accent2>
       <a:accent3>
-        <a:srgbClr val="196B24"/>
+        <a:srgbClr val="9BBB59"/>
       </a:accent3>
       <a:accent4>
-        <a:srgbClr val="0F9ED5"/>
+        <a:srgbClr val="8064A2"/>
       </a:accent4>
       <a:accent5>
-        <a:srgbClr val="A02B93"/>
+        <a:srgbClr val="4BACC6"/>
       </a:accent5>
       <a:accent6>
-        <a:srgbClr val="4EA72E"/>
+        <a:srgbClr val="F79646"/>
       </a:accent6>
       <a:hlink>
-        <a:srgbClr val="467886"/>
+        <a:srgbClr val="0000FF"/>
       </a:hlink>
       <a:folHlink>
-        <a:srgbClr val="96607D"/>
+        <a:srgbClr val="800080"/>
       </a:folHlink>
     </a:clrScheme>
     <a:fontScheme name="Office">
       <a:majorFont>
-        <a:latin typeface="Aptos Display" panose="02110004020202020204"/>
+        <a:latin typeface="Calibri"/>
         <a:ea typeface=""/>
         <a:cs typeface=""/>
-        <a:font script="Jpan" typeface="游ゴシック Light"/>
+        <a:font script="Jpan" typeface="ＭＳ ゴシック"/>
         <a:font script="Hang" typeface="맑은 고딕"/>
-        <a:font script="Hans" typeface="等线 Light"/>
+        <a:font script="Hans" typeface="宋体"/>
         <a:font script="Hant" typeface="新細明體"/>
         <a:font script="Arab" typeface="Times New Roman"/>
         <a:font script="Hebr" typeface="Times New Roman"/>
@@ -6423,32 +7667,14 @@
         <a:font script="Mong" typeface="Mongolian Baiti"/>
         <a:font script="Viet" typeface="Times New Roman"/>
         <a:font script="Uigh" typeface="Microsoft Uighur"/>
-        <a:font script="Geor" typeface="Sylfaen"/>
-        <a:font script="Armn" typeface="Arial"/>
-        <a:font script="Bugi" typeface="Leelawadee UI"/>
-        <a:font script="Bopo" typeface="Microsoft JhengHei"/>
-        <a:font script="Java" typeface="Javanese Text"/>
-        <a:font script="Lisu" typeface="Segoe UI"/>
-        <a:font script="Mymr" typeface="Myanmar Text"/>
-        <a:font script="Nkoo" typeface="Ebrima"/>
-        <a:font script="Olck" typeface="Nirmala UI"/>
-        <a:font script="Osma" typeface="Ebrima"/>
-        <a:font script="Phag" typeface="Phagspa"/>
-        <a:font script="Syrn" typeface="Estrangelo Edessa"/>
-        <a:font script="Syrj" typeface="Estrangelo Edessa"/>
-        <a:font script="Syre" typeface="Estrangelo Edessa"/>
-        <a:font script="Sora" typeface="Nirmala UI"/>
-        <a:font script="Tale" typeface="Microsoft Tai Le"/>
-        <a:font script="Talu" typeface="Microsoft New Tai Lue"/>
-        <a:font script="Tfng" typeface="Ebrima"/>
       </a:majorFont>
       <a:minorFont>
-        <a:latin typeface="Aptos" panose="02110004020202020204"/>
+        <a:latin typeface="Cambria"/>
         <a:ea typeface=""/>
         <a:cs typeface=""/>
-        <a:font script="Jpan" typeface="游明朝"/>
+        <a:font script="Jpan" typeface="ＭＳ 明朝"/>
         <a:font script="Hang" typeface="맑은 고딕"/>
-        <a:font script="Hans" typeface="等线"/>
+        <a:font script="Hans" typeface="宋体"/>
         <a:font script="Hant" typeface="新細明體"/>
         <a:font script="Arab" typeface="Arial"/>
         <a:font script="Hebr" typeface="Arial"/>
@@ -6475,24 +7701,6 @@
         <a:font script="Mong" typeface="Mongolian Baiti"/>
         <a:font script="Viet" typeface="Arial"/>
         <a:font script="Uigh" typeface="Microsoft Uighur"/>
-        <a:font script="Geor" typeface="Sylfaen"/>
-        <a:font script="Armn" typeface="Arial"/>
-        <a:font script="Bugi" typeface="Leelawadee UI"/>
-        <a:font script="Bopo" typeface="Microsoft JhengHei"/>
-        <a:font script="Java" typeface="Javanese Text"/>
-        <a:font script="Lisu" typeface="Segoe UI"/>
-        <a:font script="Mymr" typeface="Myanmar Text"/>
-        <a:font script="Nkoo" typeface="Ebrima"/>
-        <a:font script="Olck" typeface="Nirmala UI"/>
-        <a:font script="Osma" typeface="Ebrima"/>
-        <a:font script="Phag" typeface="Phagspa"/>
-        <a:font script="Syrn" typeface="Estrangelo Edessa"/>
-        <a:font script="Syrj" typeface="Estrangelo Edessa"/>
-        <a:font script="Syre" typeface="Estrangelo Edessa"/>
-        <a:font script="Sora" typeface="Nirmala UI"/>
-        <a:font script="Tale" typeface="Microsoft Tai Le"/>
-        <a:font script="Talu" typeface="Microsoft New Tai Lue"/>
-        <a:font script="Tfng" typeface="Ebrima"/>
       </a:minorFont>
     </a:fontScheme>
     <a:fmtScheme name="Office">
@@ -6504,141 +7712,200 @@
           <a:gsLst>
             <a:gs pos="0">
               <a:schemeClr val="phClr">
-                <a:lumMod val="110000"/>
-                <a:satMod val="105000"/>
-                <a:tint val="67000"/>
+                <a:tint val="50000"/>
+                <a:satMod val="300000"/>
               </a:schemeClr>
             </a:gs>
-            <a:gs pos="50000">
+            <a:gs pos="35000">
               <a:schemeClr val="phClr">
-                <a:lumMod val="105000"/>
-                <a:satMod val="103000"/>
-                <a:tint val="73000"/>
+                <a:tint val="37000"/>
+                <a:satMod val="300000"/>
               </a:schemeClr>
             </a:gs>
             <a:gs pos="100000">
               <a:schemeClr val="phClr">
-                <a:lumMod val="105000"/>
-                <a:satMod val="109000"/>
-                <a:tint val="81000"/>
+                <a:tint val="15000"/>
+                <a:satMod val="350000"/>
               </a:schemeClr>
             </a:gs>
           </a:gsLst>
-          <a:lin ang="5400000" scaled="0"/>
+          <a:lin ang="16200000" scaled="1"/>
         </a:gradFill>
         <a:gradFill rotWithShape="1">
           <a:gsLst>
             <a:gs pos="0">
               <a:schemeClr val="phClr">
-                <a:satMod val="103000"/>
-                <a:lumMod val="102000"/>
-                <a:tint val="94000"/>
-              </a:schemeClr>
-            </a:gs>
-            <a:gs pos="50000">
-              <a:schemeClr val="phClr">
-                <a:satMod val="110000"/>
-                <a:lumMod val="100000"/>
+                <a:tint val="100000"/>
                 <a:shade val="100000"/>
+                <a:satMod val="130000"/>
               </a:schemeClr>
             </a:gs>
             <a:gs pos="100000">
               <a:schemeClr val="phClr">
-                <a:lumMod val="99000"/>
-                <a:satMod val="120000"/>
-                <a:shade val="78000"/>
+                <a:tint val="50000"/>
+                <a:shade val="100000"/>
+                <a:satMod val="350000"/>
               </a:schemeClr>
             </a:gs>
           </a:gsLst>
-          <a:lin ang="5400000" scaled="0"/>
+          <a:lin ang="16200000" scaled="0"/>
         </a:gradFill>
       </a:fillStyleLst>
       <a:lnStyleLst>
-        <a:ln w="6350" cap="flat" cmpd="sng" algn="ctr">
+        <a:ln w="9525" cap="flat" cmpd="sng" algn="ctr">
+          <a:solidFill>
+            <a:schemeClr val="phClr">
+              <a:shade val="95000"/>
+              <a:satMod val="105000"/>
+            </a:schemeClr>
+          </a:solidFill>
+          <a:prstDash val="solid"/>
+        </a:ln>
+        <a:ln w="25400" cap="flat" cmpd="sng" algn="ctr">
           <a:solidFill>
             <a:schemeClr val="phClr"/>
           </a:solidFill>
           <a:prstDash val="solid"/>
-          <a:miter lim="800000"/>
         </a:ln>
-        <a:ln w="12700" cap="flat" cmpd="sng" algn="ctr">
+        <a:ln w="38100" cap="flat" cmpd="sng" algn="ctr">
           <a:solidFill>
             <a:schemeClr val="phClr"/>
           </a:solidFill>
           <a:prstDash val="solid"/>
-          <a:miter lim="800000"/>
-        </a:ln>
-        <a:ln w="19050" cap="flat" cmpd="sng" algn="ctr">
-          <a:solidFill>
-            <a:schemeClr val="phClr"/>
-          </a:solidFill>
-          <a:prstDash val="solid"/>
-          <a:miter lim="800000"/>
         </a:ln>
       </a:lnStyleLst>
       <a:effectStyleLst>
         <a:effectStyle>
-          <a:effectLst/>
-        </a:effectStyle>
-        <a:effectStyle>
-          <a:effectLst/>
+          <a:effectLst>
+            <a:outerShdw blurRad="40000" dist="20000" dir="5400000" rotWithShape="0">
+              <a:srgbClr val="000000">
+                <a:alpha val="38000"/>
+              </a:srgbClr>
+            </a:outerShdw>
+          </a:effectLst>
         </a:effectStyle>
         <a:effectStyle>
           <a:effectLst>
-            <a:outerShdw blurRad="57150" dist="19050" dir="5400000" algn="ctr" rotWithShape="0">
+            <a:outerShdw blurRad="40000" dist="23000" dir="5400000" rotWithShape="0">
               <a:srgbClr val="000000">
-                <a:alpha val="63000"/>
+                <a:alpha val="35000"/>
               </a:srgbClr>
             </a:outerShdw>
           </a:effectLst>
+        </a:effectStyle>
+        <a:effectStyle>
+          <a:effectLst>
+            <a:outerShdw blurRad="40000" dist="23000" dir="5400000" rotWithShape="0">
+              <a:srgbClr val="000000">
+                <a:alpha val="35000"/>
+              </a:srgbClr>
+            </a:outerShdw>
+          </a:effectLst>
+          <a:scene3d>
+            <a:camera prst="orthographicFront">
+              <a:rot lat="0" lon="0" rev="0"/>
+            </a:camera>
+            <a:lightRig rig="threePt" dir="t">
+              <a:rot lat="0" lon="0" rev="1200000"/>
+            </a:lightRig>
+          </a:scene3d>
+          <a:sp3d>
+            <a:bevelT w="63500" h="25400"/>
+          </a:sp3d>
         </a:effectStyle>
       </a:effectStyleLst>
       <a:bgFillStyleLst>
         <a:solidFill>
           <a:schemeClr val="phClr"/>
         </a:solidFill>
-        <a:solidFill>
-          <a:schemeClr val="phClr">
-            <a:tint val="95000"/>
-            <a:satMod val="170000"/>
-          </a:schemeClr>
-        </a:solidFill>
         <a:gradFill rotWithShape="1">
           <a:gsLst>
             <a:gs pos="0">
               <a:schemeClr val="phClr">
-                <a:tint val="93000"/>
-                <a:satMod val="150000"/>
-                <a:shade val="98000"/>
-                <a:lumMod val="102000"/>
+                <a:tint val="40000"/>
+                <a:satMod val="350000"/>
               </a:schemeClr>
             </a:gs>
-            <a:gs pos="50000">
+            <a:gs pos="40000">
               <a:schemeClr val="phClr">
-                <a:tint val="98000"/>
-                <a:satMod val="130000"/>
-                <a:shade val="90000"/>
-                <a:lumMod val="103000"/>
+                <a:tint val="45000"/>
+                <a:shade val="99000"/>
+                <a:satMod val="350000"/>
               </a:schemeClr>
             </a:gs>
             <a:gs pos="100000">
               <a:schemeClr val="phClr">
-                <a:shade val="63000"/>
-                <a:satMod val="120000"/>
+                <a:shade val="20000"/>
+                <a:satMod val="255000"/>
               </a:schemeClr>
             </a:gs>
           </a:gsLst>
-          <a:lin ang="5400000" scaled="0"/>
+          <a:path path="circle">
+            <a:fillToRect l="50000" t="-80000" r="50000" b="180000"/>
+          </a:path>
+        </a:gradFill>
+        <a:gradFill rotWithShape="1">
+          <a:gsLst>
+            <a:gs pos="0">
+              <a:schemeClr val="phClr">
+                <a:tint val="80000"/>
+                <a:satMod val="300000"/>
+              </a:schemeClr>
+            </a:gs>
+            <a:gs pos="100000">
+              <a:schemeClr val="phClr">
+                <a:shade val="30000"/>
+                <a:satMod val="200000"/>
+              </a:schemeClr>
+            </a:gs>
+          </a:gsLst>
+          <a:path path="circle">
+            <a:fillToRect l="50000" t="50000" r="50000" b="50000"/>
+          </a:path>
         </a:gradFill>
       </a:bgFillStyleLst>
     </a:fmtScheme>
   </a:themeElements>
-  <a:objectDefaults/>
+  <a:objectDefaults>
+    <a:spDef>
+      <a:spPr/>
+      <a:bodyPr/>
+      <a:lstStyle/>
+      <a:style>
+        <a:lnRef idx="1">
+          <a:schemeClr val="accent1"/>
+        </a:lnRef>
+        <a:fillRef idx="3">
+          <a:schemeClr val="accent1"/>
+        </a:fillRef>
+        <a:effectRef idx="2">
+          <a:schemeClr val="accent1"/>
+        </a:effectRef>
+        <a:fontRef idx="minor">
+          <a:schemeClr val="lt1"/>
+        </a:fontRef>
+      </a:style>
+    </a:spDef>
+    <a:lnDef>
+      <a:spPr/>
+      <a:bodyPr/>
+      <a:lstStyle/>
+      <a:style>
+        <a:lnRef idx="2">
+          <a:schemeClr val="accent1"/>
+        </a:lnRef>
+        <a:fillRef idx="0">
+          <a:schemeClr val="accent1"/>
+        </a:fillRef>
+        <a:effectRef idx="1">
+          <a:schemeClr val="accent1"/>
+        </a:effectRef>
+        <a:fontRef idx="minor">
+          <a:schemeClr val="tx1"/>
+        </a:fontRef>
+      </a:style>
+    </a:lnDef>
+  </a:objectDefaults>
   <a:extraClrSchemeLst/>
-  <a:extLst>
-    <a:ext uri="{05A4C25C-085E-4340-85A3-A5531E510DB2}">
-      <thm15:themeFamily xmlns:thm15="http://schemas.microsoft.com/office/thememl/2012/main" name="Office Theme" id="{2E142A2C-CD16-42D6-873A-C26D2A0506FA}" vid="{1BDDFF52-6CD6-40A5-AB3C-68EB2F1E4D0A}"/>
-    </a:ext>
-  </a:extLst>
 </a:theme>
 </file>
</xml_diff>

<commit_message>
try sci template (三线表)
</commit_message>
<xml_diff>
--- a/cleaning_report.docx
+++ b/cleaning_report.docx
@@ -5062,6 +5062,7 @@
       <w:footerReference r:id="rId14" w:type="default"/>
       <w:pgSz w:code="9" w:h="16838" w:w="11906"/>
       <w:pgMar w:bottom="1440" w:footer="720" w:gutter="0" w:header="720" w:left="1800" w:right="1800" w:top="1440"/>
+      <w:lnNumType w:countBy="1" w:restart="continuous"/>
       <w:cols w:space="720"/>
       <w:docGrid w:linePitch="326"/>
     </w:sectPr>
@@ -5219,14 +5220,14 @@
   <w:abstractNum w15:restartNumberingAfterBreak="0" w:abstractNumId="1">
     <w:nsid w:val="0000A991"/>
     <w:multiLevelType w:val="multilevel"/>
-    <w:tmpl w:val="AC362672"/>
+    <w:tmpl w:val="2C12F872"/>
     <w:lvl w:ilvl="0">
       <w:numFmt w:val="bullet"/>
       <w:suff w:val="space"/>
       <w:lvlText w:val="•"/>
       <w:lvlJc w:val="left"/>
       <w:pPr>
-        <w:ind w:firstLine="0" w:left="567"/>
+        <w:ind w:firstLine="567" w:left="0"/>
       </w:pPr>
       <w:rPr>
         <w:rFonts w:ascii="微软雅黑" w:eastAsia="微软雅黑" w:hAnsi="微软雅黑" w:hint="eastAsia"/>
@@ -5239,7 +5240,7 @@
       <w:lvlText w:val=""/>
       <w:lvlJc w:val="left"/>
       <w:pPr>
-        <w:ind w:firstLine="0" w:left="1134"/>
+        <w:ind w:firstLine="567" w:left="567"/>
       </w:pPr>
       <w:rPr>
         <w:rFonts w:ascii="Wingdings" w:hAnsi="Wingdings" w:hint="default"/>
@@ -5252,7 +5253,7 @@
       <w:lvlText w:val=""/>
       <w:lvlJc w:val="left"/>
       <w:pPr>
-        <w:ind w:firstLine="0" w:left="1701"/>
+        <w:ind w:firstLine="567" w:left="1134"/>
       </w:pPr>
       <w:rPr>
         <w:rFonts w:ascii="Wingdings" w:hAnsi="Wingdings" w:hint="default"/>
@@ -5265,7 +5266,7 @@
       <w:lvlText w:val="•"/>
       <w:lvlJc w:val="left"/>
       <w:pPr>
-        <w:ind w:firstLine="0" w:left="2268"/>
+        <w:ind w:firstLine="567" w:left="1701"/>
       </w:pPr>
       <w:rPr>
         <w:rFonts w:ascii="微软雅黑" w:eastAsia="微软雅黑" w:hAnsi="微软雅黑" w:hint="eastAsia"/>
@@ -5278,7 +5279,7 @@
       <w:lvlText w:val="•"/>
       <w:lvlJc w:val="left"/>
       <w:pPr>
-        <w:ind w:firstLine="0" w:left="2835"/>
+        <w:ind w:firstLine="567" w:left="2268"/>
       </w:pPr>
       <w:rPr>
         <w:rFonts w:ascii="微软雅黑" w:eastAsia="微软雅黑" w:hAnsi="微软雅黑" w:hint="eastAsia"/>
@@ -5291,7 +5292,7 @@
       <w:lvlText w:val="•"/>
       <w:lvlJc w:val="left"/>
       <w:pPr>
-        <w:ind w:firstLine="0" w:left="3402"/>
+        <w:ind w:firstLine="567" w:left="2835"/>
       </w:pPr>
       <w:rPr>
         <w:rFonts w:hint="eastAsia"/>
@@ -5304,7 +5305,7 @@
       <w:lvlText w:val="•"/>
       <w:lvlJc w:val="left"/>
       <w:pPr>
-        <w:ind w:firstLine="0" w:left="3969"/>
+        <w:ind w:firstLine="567" w:left="3402"/>
       </w:pPr>
       <w:rPr>
         <w:rFonts w:hint="eastAsia"/>
@@ -5317,7 +5318,7 @@
       <w:lvlText w:val="•"/>
       <w:lvlJc w:val="left"/>
       <w:pPr>
-        <w:ind w:firstLine="0" w:left="4536"/>
+        <w:ind w:firstLine="567" w:left="3969"/>
       </w:pPr>
       <w:rPr>
         <w:rFonts w:hint="eastAsia"/>
@@ -5330,7 +5331,7 @@
       <w:lvlText w:val="•"/>
       <w:lvlJc w:val="left"/>
       <w:pPr>
-        <w:ind w:firstLine="0" w:left="5103"/>
+        <w:ind w:firstLine="567" w:left="4536"/>
       </w:pPr>
       <w:rPr>
         <w:rFonts w:hint="eastAsia"/>
@@ -5341,7 +5342,7 @@
   <w:abstractNum w15:restartNumberingAfterBreak="0" w:abstractNumId="2">
     <w:nsid w:val="00A99201"/>
     <w:multiLevelType w:val="multilevel"/>
-    <w:tmpl w:val="2140DE3A"/>
+    <w:tmpl w:val="276A81A2"/>
     <w:lvl w:ilvl="0">
       <w:start w:val="1"/>
       <w:numFmt w:val="decimal"/>
@@ -5349,7 +5350,7 @@
       <w:lvlText w:val="%1."/>
       <w:lvlJc w:val="right"/>
       <w:pPr>
-        <w:ind w:firstLine="198" w:left="567"/>
+        <w:ind w:firstLine="851" w:left="0"/>
       </w:pPr>
       <w:rPr>
         <w:rFonts w:hint="eastAsia"/>
@@ -5362,7 +5363,7 @@
       <w:lvlText w:val="%2)"/>
       <w:lvlJc w:val="right"/>
       <w:pPr>
-        <w:ind w:firstLine="198" w:left="1134"/>
+        <w:ind w:firstLine="851" w:left="567"/>
       </w:pPr>
       <w:rPr>
         <w:rFonts w:hint="eastAsia"/>
@@ -5375,7 +5376,7 @@
       <w:lvlText w:val="%3."/>
       <w:lvlJc w:val="right"/>
       <w:pPr>
-        <w:ind w:firstLine="198" w:left="1701"/>
+        <w:ind w:firstLine="851" w:left="1134"/>
       </w:pPr>
       <w:rPr>
         <w:rFonts w:hint="eastAsia"/>
@@ -5388,7 +5389,7 @@
       <w:lvlText w:val="%4."/>
       <w:lvlJc w:val="right"/>
       <w:pPr>
-        <w:ind w:firstLine="198" w:left="2268"/>
+        <w:ind w:firstLine="851" w:left="1701"/>
       </w:pPr>
       <w:rPr>
         <w:rFonts w:hint="eastAsia"/>
@@ -5401,7 +5402,7 @@
       <w:lvlText w:val="%5."/>
       <w:lvlJc w:val="right"/>
       <w:pPr>
-        <w:ind w:firstLine="198" w:left="2835"/>
+        <w:ind w:firstLine="851" w:left="2268"/>
       </w:pPr>
       <w:rPr>
         <w:rFonts w:hint="eastAsia"/>
@@ -5414,7 +5415,7 @@
       <w:lvlText w:val="%6)"/>
       <w:lvlJc w:val="right"/>
       <w:pPr>
-        <w:ind w:firstLine="198" w:left="3402"/>
+        <w:ind w:firstLine="851" w:left="2835"/>
       </w:pPr>
       <w:rPr>
         <w:rFonts w:hint="eastAsia"/>
@@ -5427,7 +5428,7 @@
       <w:lvlText w:val="%7."/>
       <w:lvlJc w:val="right"/>
       <w:pPr>
-        <w:ind w:firstLine="198" w:left="3969"/>
+        <w:ind w:firstLine="851" w:left="3402"/>
       </w:pPr>
       <w:rPr>
         <w:rFonts w:hint="eastAsia"/>
@@ -5440,7 +5441,7 @@
       <w:lvlText w:val="%8."/>
       <w:lvlJc w:val="right"/>
       <w:pPr>
-        <w:ind w:firstLine="198" w:left="4536"/>
+        <w:ind w:firstLine="851" w:left="3969"/>
       </w:pPr>
       <w:rPr>
         <w:rFonts w:hint="eastAsia"/>
@@ -5453,7 +5454,7 @@
       <w:lvlText w:val="%9."/>
       <w:lvlJc w:val="right"/>
       <w:pPr>
-        <w:ind w:firstLine="198" w:left="5103"/>
+        <w:ind w:firstLine="851" w:left="4536"/>
       </w:pPr>
       <w:rPr>
         <w:rFonts w:hint="eastAsia"/>
@@ -6079,9 +6080,63 @@
   </w:num>
   <w:num w16cid:durableId="1822653246" w:numId="5">
     <w:abstractNumId w:val="2"/>
+    <w:lvlOverride w:ilvl="0">
+      <w:startOverride w:val="1"/>
+    </w:lvlOverride>
+    <w:lvlOverride w:ilvl="1">
+      <w:startOverride w:val="1"/>
+    </w:lvlOverride>
+    <w:lvlOverride w:ilvl="2">
+      <w:startOverride w:val="1"/>
+    </w:lvlOverride>
+    <w:lvlOverride w:ilvl="3">
+      <w:startOverride w:val="1"/>
+    </w:lvlOverride>
+    <w:lvlOverride w:ilvl="4">
+      <w:startOverride w:val="1"/>
+    </w:lvlOverride>
+    <w:lvlOverride w:ilvl="5">
+      <w:startOverride w:val="1"/>
+    </w:lvlOverride>
+    <w:lvlOverride w:ilvl="6">
+      <w:startOverride w:val="1"/>
+    </w:lvlOverride>
+    <w:lvlOverride w:ilvl="7">
+      <w:startOverride w:val="1"/>
+    </w:lvlOverride>
+    <w:lvlOverride w:ilvl="8">
+      <w:startOverride w:val="1"/>
+    </w:lvlOverride>
   </w:num>
   <w:num w16cid:durableId="2079478619" w:numId="6">
     <w:abstractNumId w:val="2"/>
+    <w:lvlOverride w:ilvl="0">
+      <w:startOverride w:val="1"/>
+    </w:lvlOverride>
+    <w:lvlOverride w:ilvl="1">
+      <w:startOverride w:val="1"/>
+    </w:lvlOverride>
+    <w:lvlOverride w:ilvl="2">
+      <w:startOverride w:val="1"/>
+    </w:lvlOverride>
+    <w:lvlOverride w:ilvl="3">
+      <w:startOverride w:val="1"/>
+    </w:lvlOverride>
+    <w:lvlOverride w:ilvl="4">
+      <w:startOverride w:val="1"/>
+    </w:lvlOverride>
+    <w:lvlOverride w:ilvl="5">
+      <w:startOverride w:val="1"/>
+    </w:lvlOverride>
+    <w:lvlOverride w:ilvl="6">
+      <w:startOverride w:val="1"/>
+    </w:lvlOverride>
+    <w:lvlOverride w:ilvl="7">
+      <w:startOverride w:val="1"/>
+    </w:lvlOverride>
+    <w:lvlOverride w:ilvl="8">
+      <w:startOverride w:val="1"/>
+    </w:lvlOverride>
   </w:num>
   <w:num w16cid:durableId="1567565266" w:numId="7">
     <w:abstractNumId w:val="2"/>
@@ -6666,7 +6721,7 @@
   <w:style w:default="1" w:styleId="a" w:type="paragraph">
     <w:name w:val="Normal"/>
     <w:qFormat/>
-    <w:rsid w:val="00BD3843"/>
+    <w:rsid w:val="00E44B39"/>
     <w:pPr>
       <w:spacing w:after="0" w:line="360" w:lineRule="auto"/>
     </w:pPr>
@@ -6727,7 +6782,7 @@
     <w:uiPriority w:val="9"/>
     <w:unhideWhenUsed/>
     <w:qFormat/>
-    <w:rsid w:val="004A10CE"/>
+    <w:rsid w:val="00294281"/>
     <w:pPr>
       <w:keepNext/>
       <w:keepLines/>
@@ -6746,11 +6801,10 @@
     <w:name w:val="heading 4"/>
     <w:basedOn w:val="a"/>
     <w:next w:val="a0"/>
-    <w:link w:val="40"/>
     <w:uiPriority w:val="9"/>
     <w:unhideWhenUsed/>
     <w:qFormat/>
-    <w:rsid w:val="004A10CE"/>
+    <w:rsid w:val="00294281"/>
     <w:pPr>
       <w:keepNext/>
       <w:keepLines/>
@@ -6770,7 +6824,7 @@
     <w:uiPriority w:val="9"/>
     <w:unhideWhenUsed/>
     <w:qFormat/>
-    <w:rsid w:val="00BA49AB"/>
+    <w:rsid w:val="00A73B1E"/>
     <w:pPr>
       <w:keepNext/>
       <w:keepLines/>
@@ -6778,7 +6832,7 @@
       <w:outlineLvl w:val="4"/>
     </w:pPr>
     <w:rPr>
-      <w:rFonts w:asciiTheme="majorHAnsi" w:cstheme="majorBidi" w:eastAsia="黑体" w:hAnsiTheme="majorHAnsi"/>
+      <w:rFonts w:cstheme="majorBidi" w:eastAsia="黑体"/>
       <w:b/>
       <w:iCs/>
     </w:rPr>
@@ -6790,7 +6844,7 @@
     <w:uiPriority w:val="9"/>
     <w:unhideWhenUsed/>
     <w:qFormat/>
-    <w:rsid w:val="004A10CE"/>
+    <w:rsid w:val="00A73B1E"/>
     <w:pPr>
       <w:keepNext/>
       <w:keepLines/>
@@ -6809,6 +6863,7 @@
     <w:uiPriority w:val="9"/>
     <w:unhideWhenUsed/>
     <w:qFormat/>
+    <w:rsid w:val="00B02BE2"/>
     <w:pPr>
       <w:keepNext/>
       <w:keepLines/>
@@ -6816,7 +6871,7 @@
       <w:outlineLvl w:val="6"/>
     </w:pPr>
     <w:rPr>
-      <w:rFonts w:asciiTheme="majorHAnsi" w:cstheme="majorBidi" w:eastAsiaTheme="majorEastAsia" w:hAnsiTheme="majorHAnsi"/>
+      <w:rFonts w:cstheme="majorBidi" w:eastAsiaTheme="majorEastAsia"/>
       <w:color w:themeColor="accent1" w:val="4F81BD"/>
     </w:rPr>
   </w:style>
@@ -6888,16 +6943,16 @@
     <w:basedOn w:val="FirstParagraph"/>
     <w:link w:val="a4"/>
     <w:qFormat/>
-    <w:rsid w:val="00743667"/>
+    <w:rsid w:val="00862EB6"/>
   </w:style>
   <w:style w:customStyle="1" w:styleId="FirstParagraph" w:type="paragraph">
     <w:name w:val="First Paragraph"/>
     <w:basedOn w:val="a"/>
     <w:next w:val="a0"/>
     <w:qFormat/>
-    <w:rsid w:val="006629BB"/>
+    <w:rsid w:val="00862EB6"/>
     <w:pPr>
-      <w:spacing w:before="180"/>
+      <w:spacing w:before="180" w:line="480" w:lineRule="auto"/>
       <w:ind w:firstLine="200" w:firstLineChars="200"/>
     </w:pPr>
     <w:rPr>
@@ -6986,7 +7041,7 @@
     <w:name w:val="Bibliography"/>
     <w:basedOn w:val="a"/>
     <w:qFormat/>
-    <w:rsid w:val="006629BB"/>
+    <w:rsid w:val="00862EB6"/>
     <w:pPr>
       <w:tabs>
         <w:tab w:pos="384" w:val="left"/>
@@ -7000,16 +7055,17 @@
     <w:uiPriority w:val="9"/>
     <w:unhideWhenUsed/>
     <w:qFormat/>
-    <w:rsid w:val="00113CC5"/>
+    <w:rsid w:val="003567C1"/>
     <w:pPr>
-      <w:pBdr>
-        <w:left w:color="BFBFBF" w:space="4" w:sz="48" w:themeColor="background1" w:themeShade="BF" w:val="single"/>
-      </w:pBdr>
-      <w:spacing w:before="100"/>
-      <w:ind w:left="200" w:leftChars="200" w:right="100" w:rightChars="100"/>
+      <w:widowControl w:val="0"/>
+      <w:spacing w:after="200" w:afterLines="200" w:line="288" w:lineRule="auto"/>
+      <w:contextualSpacing/>
     </w:pPr>
     <w:rPr>
-      <w:rFonts w:eastAsiaTheme="minorEastAsia"/>
+      <w:rFonts w:cs="Times New Roman"/>
+      <w:bCs/>
+      <w:kern w:val="2"/>
+      <w:sz w:val="21"/>
       <w:lang w:eastAsia="zh-CN"/>
     </w:rPr>
   </w:style>
@@ -7109,7 +7165,7 @@
   <w:style w:customStyle="1" w:styleId="Figure" w:type="paragraph">
     <w:name w:val="Figure"/>
     <w:basedOn w:val="a"/>
-    <w:rsid w:val="00D048A6"/>
+    <w:rsid w:val="005B24F9"/>
     <w:pPr>
       <w:jc w:val="center"/>
     </w:pPr>
@@ -7117,7 +7173,6 @@
   <w:style w:customStyle="1" w:styleId="CaptionedFigure" w:type="paragraph">
     <w:name w:val="Captioned Figure"/>
     <w:basedOn w:val="Figure"/>
-    <w:rsid w:val="00B8037B"/>
     <w:pPr>
       <w:keepNext/>
     </w:pPr>
@@ -7135,7 +7190,7 @@
     <w:name w:val="Verbatim Char"/>
     <w:basedOn w:val="ac"/>
     <w:link w:val="SourceCode"/>
-    <w:rsid w:val="00BF2EFB"/>
+    <w:rsid w:val="00100222"/>
     <w:rPr>
       <w:rFonts w:ascii="Fira Code" w:cs="Times New Roman (正文 CS 字体)" w:eastAsia="宋体" w:hAnsi="Fira Code"/>
       <w:color w:themeColor="text1" w:themeTint="BF" w:val="404040"/>
@@ -7183,7 +7238,7 @@
     <w:basedOn w:val="a"/>
     <w:link w:val="VerbatimChar"/>
     <w:qFormat/>
-    <w:rsid w:val="00BF2EFB"/>
+    <w:rsid w:val="00100222"/>
     <w:pPr>
       <w:pBdr>
         <w:top w:color="BFBFBF" w:space="10" w:sz="8" w:themeColor="background1" w:themeShade="BF" w:val="single"/>
@@ -7207,7 +7262,7 @@
     <w:name w:val="正文文本 字符"/>
     <w:basedOn w:val="a1"/>
     <w:link w:val="a0"/>
-    <w:rsid w:val="00743667"/>
+    <w:rsid w:val="00862EB6"/>
     <w:rPr>
       <w:rFonts w:ascii="Times New Roman" w:eastAsia="宋体" w:hAnsi="Times New Roman"/>
       <w:lang w:eastAsia="zh-CN"/>
@@ -7336,24 +7391,17 @@
       <w:lang w:eastAsia="zh-CN"/>
     </w:rPr>
   </w:style>
-  <w:style w:customStyle="1" w:styleId="40" w:type="character">
-    <w:name w:val="标题 4 字符"/>
+  <w:style w:styleId="af4" w:type="character">
+    <w:name w:val="line number"/>
     <w:basedOn w:val="a1"/>
-    <w:link w:val="4"/>
-    <w:uiPriority w:val="9"/>
-    <w:rsid w:val="004A10CE"/>
-    <w:rPr>
-      <w:rFonts w:ascii="Times New Roman" w:cstheme="majorBidi" w:eastAsia="黑体" w:hAnsi="Times New Roman"/>
-      <w:b/>
-      <w:bCs/>
-    </w:rPr>
+    <w:rsid w:val="00E40A2F"/>
   </w:style>
   <w:style w:customStyle="1" w:styleId="InlineCode" w:type="character">
     <w:name w:val="Inline Code"/>
     <w:basedOn w:val="a1"/>
     <w:uiPriority w:val="1"/>
     <w:qFormat/>
-    <w:rsid w:val="00956EAC"/>
+    <w:rsid w:val="00C80E1B"/>
     <w:rPr>
       <w:rFonts w:ascii="Fira Code" w:cs="Times New Roman (正文 CS 字体)" w:eastAsia="宋体" w:hAnsi="Fira Code"/>
       <w:color w:themeColor="text1" w:themeTint="BF" w:val="404040"/>

</xml_diff>

<commit_message>
use V2 report achuan template
</commit_message>
<xml_diff>
--- a/cleaning_report.docx
+++ b/cleaning_report.docx
@@ -16,7 +16,7 @@
         <w:t xml:space="preserve">清洗项目报告</w:t>
       </w:r>
     </w:p>
-    <w:bookmarkStart w:id="48" w:name="description-前置清洗方案"/>
+    <w:bookmarkStart w:id="108" w:name="description-前置清洗方案"/>
     <w:p>
       <w:pPr>
         <w:pStyle w:val="10"/>
@@ -51,7 +51,7 @@
         <w:t xml:space="preserve">团队</w:t>
       </w:r>
     </w:p>
-    <w:bookmarkStart w:id="23" w:name="动机"/>
+    <w:bookmarkStart w:id="83" w:name="动机"/>
     <w:p>
       <w:pPr>
         <w:pStyle w:val="20"/>
@@ -496,8 +496,8 @@
         <w:t xml:space="preserve">卖点。</w:t>
       </w:r>
     </w:p>
-    <w:bookmarkEnd w:id="23"/>
-    <w:bookmarkStart w:id="28" w:name="方案设计"/>
+    <w:bookmarkEnd w:id="83"/>
+    <w:bookmarkStart w:id="88" w:name="方案设计"/>
     <w:p>
       <w:pPr>
         <w:pStyle w:val="20"/>
@@ -512,7 +512,7 @@
         <w:t xml:space="preserve">方案设计</w:t>
       </w:r>
     </w:p>
-    <w:bookmarkStart w:id="24" w:name="设计原则"/>
+    <w:bookmarkStart w:id="84" w:name="设计原则"/>
     <w:p>
       <w:pPr>
         <w:pStyle w:val="3"/>
@@ -573,8 +573,8 @@
         <w:t xml:space="preserve">——含规格单位、型号、认证词、产地词的行，无论是否同时命中噪音关键词，强制保留</w:t>
       </w:r>
     </w:p>
-    <w:bookmarkEnd w:id="24"/>
-    <w:bookmarkStart w:id="25" w:name="两阶段管线"/>
+    <w:bookmarkEnd w:id="84"/>
+    <w:bookmarkStart w:id="85" w:name="两阶段管线"/>
     <w:p>
       <w:pPr>
         <w:pStyle w:val="3"/>
@@ -1117,8 +1117,8 @@
         <w:t xml:space="preserve">宁可留多</w:t>
       </w:r>
     </w:p>
-    <w:bookmarkEnd w:id="25"/>
-    <w:bookmarkStart w:id="26" w:name="行级过滤逻辑"/>
+    <w:bookmarkEnd w:id="85"/>
+    <w:bookmarkStart w:id="86" w:name="行级过滤逻辑"/>
     <w:p>
       <w:pPr>
         <w:pStyle w:val="3"/>
@@ -1353,8 +1353,8 @@
         <w:t xml:space="preserve">字符的行不删，防止误删产品事实。</w:t>
       </w:r>
     </w:p>
-    <w:bookmarkEnd w:id="26"/>
-    <w:bookmarkStart w:id="27" w:name="词库结构cleaning_keywords.json"/>
+    <w:bookmarkEnd w:id="86"/>
+    <w:bookmarkStart w:id="87" w:name="词库结构cleaning_keywords.json"/>
     <w:p>
       <w:pPr>
         <w:pStyle w:val="3"/>
@@ -2443,9 +2443,9 @@
         </w:tc>
       </w:tr>
     </w:tbl>
-    <w:bookmarkEnd w:id="27"/>
-    <w:bookmarkEnd w:id="28"/>
-    <w:bookmarkStart w:id="34" w:name="case-示例"/>
+    <w:bookmarkEnd w:id="87"/>
+    <w:bookmarkEnd w:id="88"/>
+    <w:bookmarkStart w:id="94" w:name="case-示例"/>
     <w:p>
       <w:pPr>
         <w:pStyle w:val="20"/>
@@ -2460,7 +2460,7 @@
         <w:t xml:space="preserve">示例</w:t>
       </w:r>
     </w:p>
-    <w:bookmarkStart w:id="29" w:name="物流删除-规格保护-id"/>
+    <w:bookmarkStart w:id="89" w:name="物流删除-规格保护-id"/>
     <w:p>
       <w:pPr>
         <w:pStyle w:val="3"/>
@@ -2524,8 +2524,8 @@
         <w:t xml:space="preserve">Berat bersih 500g</w:t>
       </w:r>
     </w:p>
-    <w:bookmarkEnd w:id="29"/>
-    <w:bookmarkStart w:id="30" w:name="客服-型号保护-sg"/>
+    <w:bookmarkEnd w:id="89"/>
+    <w:bookmarkStart w:id="90" w:name="客服-型号保护-sg"/>
     <w:p>
       <w:pPr>
         <w:pStyle w:val="3"/>
@@ -2595,8 +2595,8 @@
         <w:t xml:space="preserve">40mm Driver</w:t>
       </w:r>
     </w:p>
-    <w:bookmarkEnd w:id="30"/>
-    <w:bookmarkStart w:id="31" w:name="产地保护-id"/>
+    <w:bookmarkEnd w:id="90"/>
+    <w:bookmarkStart w:id="91" w:name="产地保护-id"/>
     <w:p>
       <w:pPr>
         <w:pStyle w:val="3"/>
@@ -2670,8 +2670,8 @@
         <w:t xml:space="preserve">Teh terbaik dari perkebunan Kerinci, Sumatera</w:t>
       </w:r>
     </w:p>
-    <w:bookmarkEnd w:id="31"/>
-    <w:bookmarkStart w:id="32" w:name="长度保护混合内容id"/>
+    <w:bookmarkEnd w:id="91"/>
+    <w:bookmarkStart w:id="92" w:name="长度保护混合内容id"/>
     <w:p>
       <w:pPr>
         <w:pStyle w:val="3"/>
@@ -2743,8 +2743,8 @@
         <w:t xml:space="preserve">字符，整行保留</w:t>
       </w:r>
     </w:p>
-    <w:bookmarkEnd w:id="32"/>
-    <w:bookmarkStart w:id="33" w:name="退换货-规格保护-tw"/>
+    <w:bookmarkEnd w:id="92"/>
+    <w:bookmarkStart w:id="93" w:name="退换货-规格保护-tw"/>
     <w:p>
       <w:pPr>
         <w:pStyle w:val="3"/>
@@ -2859,9 +2859,9 @@
         <w:t xml:space="preserve"> 25cm x 15cm</w:t>
       </w:r>
     </w:p>
-    <w:bookmarkEnd w:id="33"/>
-    <w:bookmarkEnd w:id="34"/>
-    <w:bookmarkStart w:id="39" w:name="验证结果"/>
+    <w:bookmarkEnd w:id="93"/>
+    <w:bookmarkEnd w:id="94"/>
+    <w:bookmarkStart w:id="99" w:name="验证结果"/>
     <w:p>
       <w:pPr>
         <w:pStyle w:val="20"/>
@@ -2876,7 +2876,7 @@
         <w:t xml:space="preserve">验证结果</w:t>
       </w:r>
     </w:p>
-    <w:bookmarkStart w:id="35" w:name="清洗质量8000-条-每地区-1000-条"/>
+    <w:bookmarkStart w:id="95" w:name="清洗质量8000-条-每地区-1000-条"/>
     <w:p>
       <w:pPr>
         <w:pStyle w:val="3"/>
@@ -3006,8 +3006,8 @@
         <w:t xml:space="preserve">总删除率</w:t>
       </w:r>
     </w:p>
-    <w:bookmarkEnd w:id="35"/>
-    <w:bookmarkStart w:id="36" w:name="各阶段删除占比"/>
+    <w:bookmarkEnd w:id="95"/>
+    <w:bookmarkStart w:id="96" w:name="各阶段删除占比"/>
     <w:p>
       <w:pPr>
         <w:pStyle w:val="3"/>
@@ -3193,8 +3193,8 @@
         </w:tc>
       </w:tr>
     </w:tbl>
-    <w:bookmarkEnd w:id="36"/>
-    <w:bookmarkStart w:id="37" w:name="地区差异"/>
+    <w:bookmarkEnd w:id="96"/>
+    <w:bookmarkStart w:id="97" w:name="地区差异"/>
     <w:p>
       <w:pPr>
         <w:pStyle w:val="3"/>
@@ -3566,8 +3566,8 @@
         </w:tc>
       </w:tr>
     </w:tbl>
-    <w:bookmarkEnd w:id="37"/>
-    <w:bookmarkStart w:id="38" w:name="token-长度分析qwen-tokenizer"/>
+    <w:bookmarkEnd w:id="97"/>
+    <w:bookmarkStart w:id="98" w:name="token-长度分析qwen-tokenizer"/>
     <w:p>
       <w:pPr>
         <w:pStyle w:val="3"/>
@@ -3859,9 +3859,9 @@
         </w:tc>
       </w:tr>
     </w:tbl>
-    <w:bookmarkEnd w:id="38"/>
-    <w:bookmarkEnd w:id="39"/>
-    <w:bookmarkStart w:id="42" w:name="ksp-ab-test"/>
+    <w:bookmarkEnd w:id="98"/>
+    <w:bookmarkEnd w:id="99"/>
+    <w:bookmarkStart w:id="102" w:name="ksp-ab-test"/>
     <w:p>
       <w:pPr>
         <w:pStyle w:val="20"/>
@@ -3870,7 +3870,7 @@
         <w:t xml:space="preserve">5. KSP AB Test</w:t>
       </w:r>
     </w:p>
-    <w:bookmarkStart w:id="40" w:name="实验设计"/>
+    <w:bookmarkStart w:id="100" w:name="实验设计"/>
     <w:p>
       <w:pPr>
         <w:pStyle w:val="3"/>
@@ -3965,8 +3965,8 @@
         <w:t xml:space="preserve">生成，模型：Qwen2.5-7B-Instruct。</w:t>
       </w:r>
     </w:p>
-    <w:bookmarkEnd w:id="40"/>
-    <w:bookmarkStart w:id="41" w:name="核心结果"/>
+    <w:bookmarkEnd w:id="100"/>
+    <w:bookmarkStart w:id="101" w:name="核心结果"/>
     <w:p>
       <w:pPr>
         <w:pStyle w:val="3"/>
@@ -4354,9 +4354,9 @@
         <w:t xml:space="preserve">基本持平。</w:t>
       </w:r>
     </w:p>
-    <w:bookmarkEnd w:id="41"/>
-    <w:bookmarkEnd w:id="42"/>
-    <w:bookmarkStart w:id="43" w:name="误删分析"/>
+    <w:bookmarkEnd w:id="101"/>
+    <w:bookmarkEnd w:id="102"/>
+    <w:bookmarkStart w:id="103" w:name="误删分析"/>
     <w:p>
       <w:pPr>
         <w:pStyle w:val="20"/>
@@ -4588,8 +4588,8 @@
         <w:t xml:space="preserve">词库未覆盖，保留（已知漏检）</w:t>
       </w:r>
     </w:p>
-    <w:bookmarkEnd w:id="43"/>
-    <w:bookmarkStart w:id="44" w:name="接入方式"/>
+    <w:bookmarkEnd w:id="103"/>
+    <w:bookmarkStart w:id="104" w:name="接入方式"/>
     <w:p>
       <w:pPr>
         <w:pStyle w:val="20"/>
@@ -4735,8 +4735,8 @@
         <w:t xml:space="preserve">)</w:t>
       </w:r>
     </w:p>
-    <w:bookmarkEnd w:id="44"/>
-    <w:bookmarkStart w:id="47" w:name="结论"/>
+    <w:bookmarkEnd w:id="104"/>
+    <w:bookmarkStart w:id="107" w:name="结论"/>
     <w:p>
       <w:pPr>
         <w:pStyle w:val="20"/>
@@ -4944,7 +4944,7 @@
         <w:t xml:space="preserve">上线</w:t>
       </w:r>
     </w:p>
-    <w:bookmarkStart w:id="46" w:name="后续计划"/>
+    <w:bookmarkStart w:id="106" w:name="后续计划"/>
     <w:p>
       <w:pPr>
         <w:pStyle w:val="3"/>
@@ -4979,7 +4979,7 @@
         </w:rPr>
         <w:t xml:space="preserve">条，</w:t>
       </w:r>
-      <w:hyperlink r:id="rId45">
+      <w:hyperlink r:id="rId105">
         <w:r>
           <w:rPr>
             <w:rStyle w:val="ae"/>
@@ -5055,14 +5055,13 @@
         <w:t xml:space="preserve">）</w:t>
       </w:r>
     </w:p>
-    <w:bookmarkEnd w:id="46"/>
-    <w:bookmarkEnd w:id="47"/>
-    <w:bookmarkEnd w:id="48"/>
+    <w:bookmarkEnd w:id="106"/>
+    <w:bookmarkEnd w:id="107"/>
+    <w:bookmarkEnd w:id="108"/>
     <w:sectPr>
       <w:footerReference r:id="rId14" w:type="default"/>
       <w:pgSz w:code="9" w:h="16838" w:w="11906"/>
-      <w:pgMar w:bottom="1440" w:footer="720" w:gutter="0" w:header="720" w:left="1800" w:right="1800" w:top="1440"/>
-      <w:lnNumType w:countBy="1" w:restart="continuous"/>
+      <w:pgMar w:bottom="1440" w:footer="720" w:gutter="0" w:header="720" w:left="1440" w:right="1440" w:top="1440"/>
       <w:cols w:space="720"/>
       <w:docGrid w:linePitch="326"/>
     </w:sectPr>
@@ -5220,14 +5219,14 @@
   <w:abstractNum w15:restartNumberingAfterBreak="0" w:abstractNumId="1">
     <w:nsid w:val="0000A991"/>
     <w:multiLevelType w:val="multilevel"/>
-    <w:tmpl w:val="2C12F872"/>
+    <w:tmpl w:val="AC362672"/>
     <w:lvl w:ilvl="0">
       <w:numFmt w:val="bullet"/>
       <w:suff w:val="space"/>
       <w:lvlText w:val="•"/>
       <w:lvlJc w:val="left"/>
       <w:pPr>
-        <w:ind w:firstLine="567" w:left="0"/>
+        <w:ind w:firstLine="0" w:left="567"/>
       </w:pPr>
       <w:rPr>
         <w:rFonts w:ascii="微软雅黑" w:eastAsia="微软雅黑" w:hAnsi="微软雅黑" w:hint="eastAsia"/>
@@ -5240,7 +5239,7 @@
       <w:lvlText w:val=""/>
       <w:lvlJc w:val="left"/>
       <w:pPr>
-        <w:ind w:firstLine="567" w:left="567"/>
+        <w:ind w:firstLine="0" w:left="1134"/>
       </w:pPr>
       <w:rPr>
         <w:rFonts w:ascii="Wingdings" w:hAnsi="Wingdings" w:hint="default"/>
@@ -5253,7 +5252,7 @@
       <w:lvlText w:val=""/>
       <w:lvlJc w:val="left"/>
       <w:pPr>
-        <w:ind w:firstLine="567" w:left="1134"/>
+        <w:ind w:firstLine="0" w:left="1701"/>
       </w:pPr>
       <w:rPr>
         <w:rFonts w:ascii="Wingdings" w:hAnsi="Wingdings" w:hint="default"/>
@@ -5266,7 +5265,7 @@
       <w:lvlText w:val="•"/>
       <w:lvlJc w:val="left"/>
       <w:pPr>
-        <w:ind w:firstLine="567" w:left="1701"/>
+        <w:ind w:firstLine="0" w:left="2268"/>
       </w:pPr>
       <w:rPr>
         <w:rFonts w:ascii="微软雅黑" w:eastAsia="微软雅黑" w:hAnsi="微软雅黑" w:hint="eastAsia"/>
@@ -5279,7 +5278,7 @@
       <w:lvlText w:val="•"/>
       <w:lvlJc w:val="left"/>
       <w:pPr>
-        <w:ind w:firstLine="567" w:left="2268"/>
+        <w:ind w:firstLine="0" w:left="2835"/>
       </w:pPr>
       <w:rPr>
         <w:rFonts w:ascii="微软雅黑" w:eastAsia="微软雅黑" w:hAnsi="微软雅黑" w:hint="eastAsia"/>
@@ -5292,7 +5291,7 @@
       <w:lvlText w:val="•"/>
       <w:lvlJc w:val="left"/>
       <w:pPr>
-        <w:ind w:firstLine="567" w:left="2835"/>
+        <w:ind w:firstLine="0" w:left="3402"/>
       </w:pPr>
       <w:rPr>
         <w:rFonts w:hint="eastAsia"/>
@@ -5305,7 +5304,7 @@
       <w:lvlText w:val="•"/>
       <w:lvlJc w:val="left"/>
       <w:pPr>
-        <w:ind w:firstLine="567" w:left="3402"/>
+        <w:ind w:firstLine="0" w:left="3969"/>
       </w:pPr>
       <w:rPr>
         <w:rFonts w:hint="eastAsia"/>
@@ -5318,7 +5317,7 @@
       <w:lvlText w:val="•"/>
       <w:lvlJc w:val="left"/>
       <w:pPr>
-        <w:ind w:firstLine="567" w:left="3969"/>
+        <w:ind w:firstLine="0" w:left="4536"/>
       </w:pPr>
       <w:rPr>
         <w:rFonts w:hint="eastAsia"/>
@@ -5331,7 +5330,7 @@
       <w:lvlText w:val="•"/>
       <w:lvlJc w:val="left"/>
       <w:pPr>
-        <w:ind w:firstLine="567" w:left="4536"/>
+        <w:ind w:firstLine="0" w:left="5103"/>
       </w:pPr>
       <w:rPr>
         <w:rFonts w:hint="eastAsia"/>
@@ -5342,7 +5341,7 @@
   <w:abstractNum w15:restartNumberingAfterBreak="0" w:abstractNumId="2">
     <w:nsid w:val="00A99201"/>
     <w:multiLevelType w:val="multilevel"/>
-    <w:tmpl w:val="276A81A2"/>
+    <w:tmpl w:val="2140DE3A"/>
     <w:lvl w:ilvl="0">
       <w:start w:val="1"/>
       <w:numFmt w:val="decimal"/>
@@ -5350,7 +5349,7 @@
       <w:lvlText w:val="%1."/>
       <w:lvlJc w:val="right"/>
       <w:pPr>
-        <w:ind w:firstLine="851" w:left="0"/>
+        <w:ind w:firstLine="198" w:left="567"/>
       </w:pPr>
       <w:rPr>
         <w:rFonts w:hint="eastAsia"/>
@@ -5363,7 +5362,7 @@
       <w:lvlText w:val="%2)"/>
       <w:lvlJc w:val="right"/>
       <w:pPr>
-        <w:ind w:firstLine="851" w:left="567"/>
+        <w:ind w:firstLine="198" w:left="1134"/>
       </w:pPr>
       <w:rPr>
         <w:rFonts w:hint="eastAsia"/>
@@ -5376,7 +5375,7 @@
       <w:lvlText w:val="%3."/>
       <w:lvlJc w:val="right"/>
       <w:pPr>
-        <w:ind w:firstLine="851" w:left="1134"/>
+        <w:ind w:firstLine="198" w:left="1701"/>
       </w:pPr>
       <w:rPr>
         <w:rFonts w:hint="eastAsia"/>
@@ -5389,7 +5388,7 @@
       <w:lvlText w:val="%4."/>
       <w:lvlJc w:val="right"/>
       <w:pPr>
-        <w:ind w:firstLine="851" w:left="1701"/>
+        <w:ind w:firstLine="198" w:left="2268"/>
       </w:pPr>
       <w:rPr>
         <w:rFonts w:hint="eastAsia"/>
@@ -5402,7 +5401,7 @@
       <w:lvlText w:val="%5."/>
       <w:lvlJc w:val="right"/>
       <w:pPr>
-        <w:ind w:firstLine="851" w:left="2268"/>
+        <w:ind w:firstLine="198" w:left="2835"/>
       </w:pPr>
       <w:rPr>
         <w:rFonts w:hint="eastAsia"/>
@@ -5415,7 +5414,7 @@
       <w:lvlText w:val="%6)"/>
       <w:lvlJc w:val="right"/>
       <w:pPr>
-        <w:ind w:firstLine="851" w:left="2835"/>
+        <w:ind w:firstLine="198" w:left="3402"/>
       </w:pPr>
       <w:rPr>
         <w:rFonts w:hint="eastAsia"/>
@@ -5428,7 +5427,7 @@
       <w:lvlText w:val="%7."/>
       <w:lvlJc w:val="right"/>
       <w:pPr>
-        <w:ind w:firstLine="851" w:left="3402"/>
+        <w:ind w:firstLine="198" w:left="3969"/>
       </w:pPr>
       <w:rPr>
         <w:rFonts w:hint="eastAsia"/>
@@ -5441,7 +5440,7 @@
       <w:lvlText w:val="%8."/>
       <w:lvlJc w:val="right"/>
       <w:pPr>
-        <w:ind w:firstLine="851" w:left="3969"/>
+        <w:ind w:firstLine="198" w:left="4536"/>
       </w:pPr>
       <w:rPr>
         <w:rFonts w:hint="eastAsia"/>
@@ -5454,7 +5453,7 @@
       <w:lvlText w:val="%9."/>
       <w:lvlJc w:val="right"/>
       <w:pPr>
-        <w:ind w:firstLine="851" w:left="4536"/>
+        <w:ind w:firstLine="198" w:left="5103"/>
       </w:pPr>
       <w:rPr>
         <w:rFonts w:hint="eastAsia"/>
@@ -6080,63 +6079,9 @@
   </w:num>
   <w:num w16cid:durableId="1822653246" w:numId="5">
     <w:abstractNumId w:val="2"/>
-    <w:lvlOverride w:ilvl="0">
-      <w:startOverride w:val="1"/>
-    </w:lvlOverride>
-    <w:lvlOverride w:ilvl="1">
-      <w:startOverride w:val="1"/>
-    </w:lvlOverride>
-    <w:lvlOverride w:ilvl="2">
-      <w:startOverride w:val="1"/>
-    </w:lvlOverride>
-    <w:lvlOverride w:ilvl="3">
-      <w:startOverride w:val="1"/>
-    </w:lvlOverride>
-    <w:lvlOverride w:ilvl="4">
-      <w:startOverride w:val="1"/>
-    </w:lvlOverride>
-    <w:lvlOverride w:ilvl="5">
-      <w:startOverride w:val="1"/>
-    </w:lvlOverride>
-    <w:lvlOverride w:ilvl="6">
-      <w:startOverride w:val="1"/>
-    </w:lvlOverride>
-    <w:lvlOverride w:ilvl="7">
-      <w:startOverride w:val="1"/>
-    </w:lvlOverride>
-    <w:lvlOverride w:ilvl="8">
-      <w:startOverride w:val="1"/>
-    </w:lvlOverride>
   </w:num>
   <w:num w16cid:durableId="2079478619" w:numId="6">
     <w:abstractNumId w:val="2"/>
-    <w:lvlOverride w:ilvl="0">
-      <w:startOverride w:val="1"/>
-    </w:lvlOverride>
-    <w:lvlOverride w:ilvl="1">
-      <w:startOverride w:val="1"/>
-    </w:lvlOverride>
-    <w:lvlOverride w:ilvl="2">
-      <w:startOverride w:val="1"/>
-    </w:lvlOverride>
-    <w:lvlOverride w:ilvl="3">
-      <w:startOverride w:val="1"/>
-    </w:lvlOverride>
-    <w:lvlOverride w:ilvl="4">
-      <w:startOverride w:val="1"/>
-    </w:lvlOverride>
-    <w:lvlOverride w:ilvl="5">
-      <w:startOverride w:val="1"/>
-    </w:lvlOverride>
-    <w:lvlOverride w:ilvl="6">
-      <w:startOverride w:val="1"/>
-    </w:lvlOverride>
-    <w:lvlOverride w:ilvl="7">
-      <w:startOverride w:val="1"/>
-    </w:lvlOverride>
-    <w:lvlOverride w:ilvl="8">
-      <w:startOverride w:val="1"/>
-    </w:lvlOverride>
   </w:num>
   <w:num w16cid:durableId="1567565266" w:numId="7">
     <w:abstractNumId w:val="2"/>
@@ -6721,7 +6666,7 @@
   <w:style w:default="1" w:styleId="a" w:type="paragraph">
     <w:name w:val="Normal"/>
     <w:qFormat/>
-    <w:rsid w:val="00E44B39"/>
+    <w:rsid w:val="00BD3843"/>
     <w:pPr>
       <w:spacing w:after="0" w:line="360" w:lineRule="auto"/>
     </w:pPr>
@@ -6782,7 +6727,7 @@
     <w:uiPriority w:val="9"/>
     <w:unhideWhenUsed/>
     <w:qFormat/>
-    <w:rsid w:val="00294281"/>
+    <w:rsid w:val="004A10CE"/>
     <w:pPr>
       <w:keepNext/>
       <w:keepLines/>
@@ -6801,10 +6746,11 @@
     <w:name w:val="heading 4"/>
     <w:basedOn w:val="a"/>
     <w:next w:val="a0"/>
+    <w:link w:val="40"/>
     <w:uiPriority w:val="9"/>
     <w:unhideWhenUsed/>
     <w:qFormat/>
-    <w:rsid w:val="00294281"/>
+    <w:rsid w:val="004A10CE"/>
     <w:pPr>
       <w:keepNext/>
       <w:keepLines/>
@@ -6824,7 +6770,7 @@
     <w:uiPriority w:val="9"/>
     <w:unhideWhenUsed/>
     <w:qFormat/>
-    <w:rsid w:val="00A73B1E"/>
+    <w:rsid w:val="00BA49AB"/>
     <w:pPr>
       <w:keepNext/>
       <w:keepLines/>
@@ -6832,7 +6778,7 @@
       <w:outlineLvl w:val="4"/>
     </w:pPr>
     <w:rPr>
-      <w:rFonts w:cstheme="majorBidi" w:eastAsia="黑体"/>
+      <w:rFonts w:asciiTheme="majorHAnsi" w:cstheme="majorBidi" w:eastAsia="黑体" w:hAnsiTheme="majorHAnsi"/>
       <w:b/>
       <w:iCs/>
     </w:rPr>
@@ -6844,7 +6790,7 @@
     <w:uiPriority w:val="9"/>
     <w:unhideWhenUsed/>
     <w:qFormat/>
-    <w:rsid w:val="00A73B1E"/>
+    <w:rsid w:val="004A10CE"/>
     <w:pPr>
       <w:keepNext/>
       <w:keepLines/>
@@ -6863,7 +6809,6 @@
     <w:uiPriority w:val="9"/>
     <w:unhideWhenUsed/>
     <w:qFormat/>
-    <w:rsid w:val="00B02BE2"/>
     <w:pPr>
       <w:keepNext/>
       <w:keepLines/>
@@ -6871,7 +6816,7 @@
       <w:outlineLvl w:val="6"/>
     </w:pPr>
     <w:rPr>
-      <w:rFonts w:cstheme="majorBidi" w:eastAsiaTheme="majorEastAsia"/>
+      <w:rFonts w:asciiTheme="majorHAnsi" w:cstheme="majorBidi" w:eastAsiaTheme="majorEastAsia" w:hAnsiTheme="majorHAnsi"/>
       <w:color w:themeColor="accent1" w:val="4F81BD"/>
     </w:rPr>
   </w:style>
@@ -6943,16 +6888,16 @@
     <w:basedOn w:val="FirstParagraph"/>
     <w:link w:val="a4"/>
     <w:qFormat/>
-    <w:rsid w:val="00862EB6"/>
+    <w:rsid w:val="00743667"/>
   </w:style>
   <w:style w:customStyle="1" w:styleId="FirstParagraph" w:type="paragraph">
     <w:name w:val="First Paragraph"/>
     <w:basedOn w:val="a"/>
     <w:next w:val="a0"/>
     <w:qFormat/>
-    <w:rsid w:val="00862EB6"/>
+    <w:rsid w:val="006629BB"/>
     <w:pPr>
-      <w:spacing w:before="180" w:line="480" w:lineRule="auto"/>
+      <w:spacing w:before="180"/>
       <w:ind w:firstLine="200" w:firstLineChars="200"/>
     </w:pPr>
     <w:rPr>
@@ -7041,7 +6986,7 @@
     <w:name w:val="Bibliography"/>
     <w:basedOn w:val="a"/>
     <w:qFormat/>
-    <w:rsid w:val="00862EB6"/>
+    <w:rsid w:val="006629BB"/>
     <w:pPr>
       <w:tabs>
         <w:tab w:pos="384" w:val="left"/>
@@ -7055,17 +7000,16 @@
     <w:uiPriority w:val="9"/>
     <w:unhideWhenUsed/>
     <w:qFormat/>
-    <w:rsid w:val="003567C1"/>
+    <w:rsid w:val="00113CC5"/>
     <w:pPr>
-      <w:widowControl w:val="0"/>
-      <w:spacing w:after="200" w:afterLines="200" w:line="288" w:lineRule="auto"/>
-      <w:contextualSpacing/>
+      <w:pBdr>
+        <w:left w:color="BFBFBF" w:space="4" w:sz="48" w:themeColor="background1" w:themeShade="BF" w:val="single"/>
+      </w:pBdr>
+      <w:spacing w:before="100"/>
+      <w:ind w:left="200" w:leftChars="200" w:right="100" w:rightChars="100"/>
     </w:pPr>
     <w:rPr>
-      <w:rFonts w:cs="Times New Roman"/>
-      <w:bCs/>
-      <w:kern w:val="2"/>
-      <w:sz w:val="21"/>
+      <w:rFonts w:eastAsiaTheme="minorEastAsia"/>
       <w:lang w:eastAsia="zh-CN"/>
     </w:rPr>
   </w:style>
@@ -7165,7 +7109,7 @@
   <w:style w:customStyle="1" w:styleId="Figure" w:type="paragraph">
     <w:name w:val="Figure"/>
     <w:basedOn w:val="a"/>
-    <w:rsid w:val="005B24F9"/>
+    <w:rsid w:val="00D048A6"/>
     <w:pPr>
       <w:jc w:val="center"/>
     </w:pPr>
@@ -7173,6 +7117,7 @@
   <w:style w:customStyle="1" w:styleId="CaptionedFigure" w:type="paragraph">
     <w:name w:val="Captioned Figure"/>
     <w:basedOn w:val="Figure"/>
+    <w:rsid w:val="00B8037B"/>
     <w:pPr>
       <w:keepNext/>
     </w:pPr>
@@ -7190,7 +7135,7 @@
     <w:name w:val="Verbatim Char"/>
     <w:basedOn w:val="ac"/>
     <w:link w:val="SourceCode"/>
-    <w:rsid w:val="00100222"/>
+    <w:rsid w:val="00BF2EFB"/>
     <w:rPr>
       <w:rFonts w:ascii="Fira Code" w:cs="Times New Roman (正文 CS 字体)" w:eastAsia="宋体" w:hAnsi="Fira Code"/>
       <w:color w:themeColor="text1" w:themeTint="BF" w:val="404040"/>
@@ -7238,7 +7183,7 @@
     <w:basedOn w:val="a"/>
     <w:link w:val="VerbatimChar"/>
     <w:qFormat/>
-    <w:rsid w:val="00100222"/>
+    <w:rsid w:val="00BF2EFB"/>
     <w:pPr>
       <w:pBdr>
         <w:top w:color="BFBFBF" w:space="10" w:sz="8" w:themeColor="background1" w:themeShade="BF" w:val="single"/>
@@ -7262,7 +7207,7 @@
     <w:name w:val="正文文本 字符"/>
     <w:basedOn w:val="a1"/>
     <w:link w:val="a0"/>
-    <w:rsid w:val="00862EB6"/>
+    <w:rsid w:val="00743667"/>
     <w:rPr>
       <w:rFonts w:ascii="Times New Roman" w:eastAsia="宋体" w:hAnsi="Times New Roman"/>
       <w:lang w:eastAsia="zh-CN"/>
@@ -7391,17 +7336,24 @@
       <w:lang w:eastAsia="zh-CN"/>
     </w:rPr>
   </w:style>
-  <w:style w:styleId="af4" w:type="character">
-    <w:name w:val="line number"/>
+  <w:style w:customStyle="1" w:styleId="40" w:type="character">
+    <w:name w:val="标题 4 字符"/>
     <w:basedOn w:val="a1"/>
-    <w:rsid w:val="00E40A2F"/>
+    <w:link w:val="4"/>
+    <w:uiPriority w:val="9"/>
+    <w:rsid w:val="004A10CE"/>
+    <w:rPr>
+      <w:rFonts w:ascii="Times New Roman" w:cstheme="majorBidi" w:eastAsia="黑体" w:hAnsi="Times New Roman"/>
+      <w:b/>
+      <w:bCs/>
+    </w:rPr>
   </w:style>
   <w:style w:customStyle="1" w:styleId="InlineCode" w:type="character">
     <w:name w:val="Inline Code"/>
     <w:basedOn w:val="a1"/>
     <w:uiPriority w:val="1"/>
     <w:qFormat/>
-    <w:rsid w:val="00C80E1B"/>
+    <w:rsid w:val="00956EAC"/>
     <w:rPr>
       <w:rFonts w:ascii="Fira Code" w:cs="Times New Roman (正文 CS 字体)" w:eastAsia="宋体" w:hAnsi="Fira Code"/>
       <w:color w:themeColor="text1" w:themeTint="BF" w:val="404040"/>
@@ -7411,7 +7363,7 @@
       <w:lang w:eastAsia="zh-CN"/>
     </w:rPr>
   </w:style>
-  <w:style w:type="character" w:customStyle="1" w:styleId="KeywordTok">
+  <w:style w:customStyle="1" w:styleId="KeywordTok" w:type="character">
     <w:name w:val="KeywordTok"/>
     <w:basedOn w:val="VerbatimChar"/>
     <w:rPr>
@@ -7419,77 +7371,77 @@
       <w:color w:val="007020"/>
     </w:rPr>
   </w:style>
-  <w:style w:type="character" w:customStyle="1" w:styleId="DataTypeTok">
+  <w:style w:customStyle="1" w:styleId="DataTypeTok" w:type="character">
     <w:name w:val="DataTypeTok"/>
     <w:basedOn w:val="VerbatimChar"/>
     <w:rPr>
       <w:color w:val="902000"/>
     </w:rPr>
   </w:style>
-  <w:style w:type="character" w:customStyle="1" w:styleId="DecValTok">
+  <w:style w:customStyle="1" w:styleId="DecValTok" w:type="character">
     <w:name w:val="DecValTok"/>
     <w:basedOn w:val="VerbatimChar"/>
     <w:rPr>
       <w:color w:val="40a070"/>
     </w:rPr>
   </w:style>
-  <w:style w:type="character" w:customStyle="1" w:styleId="BaseNTok">
+  <w:style w:customStyle="1" w:styleId="BaseNTok" w:type="character">
     <w:name w:val="BaseNTok"/>
     <w:basedOn w:val="VerbatimChar"/>
     <w:rPr>
       <w:color w:val="40a070"/>
     </w:rPr>
   </w:style>
-  <w:style w:type="character" w:customStyle="1" w:styleId="FloatTok">
+  <w:style w:customStyle="1" w:styleId="FloatTok" w:type="character">
     <w:name w:val="FloatTok"/>
     <w:basedOn w:val="VerbatimChar"/>
     <w:rPr>
       <w:color w:val="40a070"/>
     </w:rPr>
   </w:style>
-  <w:style w:type="character" w:customStyle="1" w:styleId="ConstantTok">
+  <w:style w:customStyle="1" w:styleId="ConstantTok" w:type="character">
     <w:name w:val="ConstantTok"/>
     <w:basedOn w:val="VerbatimChar"/>
     <w:rPr>
       <w:color w:val="880000"/>
     </w:rPr>
   </w:style>
-  <w:style w:type="character" w:customStyle="1" w:styleId="CharTok">
+  <w:style w:customStyle="1" w:styleId="CharTok" w:type="character">
     <w:name w:val="CharTok"/>
     <w:basedOn w:val="VerbatimChar"/>
     <w:rPr>
       <w:color w:val="4070a0"/>
     </w:rPr>
   </w:style>
-  <w:style w:type="character" w:customStyle="1" w:styleId="SpecialCharTok">
+  <w:style w:customStyle="1" w:styleId="SpecialCharTok" w:type="character">
     <w:name w:val="SpecialCharTok"/>
     <w:basedOn w:val="VerbatimChar"/>
     <w:rPr>
       <w:color w:val="4070a0"/>
     </w:rPr>
   </w:style>
-  <w:style w:type="character" w:customStyle="1" w:styleId="StringTok">
+  <w:style w:customStyle="1" w:styleId="StringTok" w:type="character">
     <w:name w:val="StringTok"/>
     <w:basedOn w:val="VerbatimChar"/>
     <w:rPr>
       <w:color w:val="4070a0"/>
     </w:rPr>
   </w:style>
-  <w:style w:type="character" w:customStyle="1" w:styleId="VerbatimStringTok">
+  <w:style w:customStyle="1" w:styleId="VerbatimStringTok" w:type="character">
     <w:name w:val="VerbatimStringTok"/>
     <w:basedOn w:val="VerbatimChar"/>
     <w:rPr>
       <w:color w:val="4070a0"/>
     </w:rPr>
   </w:style>
-  <w:style w:type="character" w:customStyle="1" w:styleId="SpecialStringTok">
+  <w:style w:customStyle="1" w:styleId="SpecialStringTok" w:type="character">
     <w:name w:val="SpecialStringTok"/>
     <w:basedOn w:val="VerbatimChar"/>
     <w:rPr>
       <w:color w:val="bb6688"/>
     </w:rPr>
   </w:style>
-  <w:style w:type="character" w:customStyle="1" w:styleId="ImportTok">
+  <w:style w:customStyle="1" w:styleId="ImportTok" w:type="character">
     <w:name w:val="ImportTok"/>
     <w:basedOn w:val="VerbatimChar"/>
     <w:rPr>
@@ -7497,7 +7449,7 @@
       <w:color w:val="008000"/>
     </w:rPr>
   </w:style>
-  <w:style w:type="character" w:customStyle="1" w:styleId="CommentTok">
+  <w:style w:customStyle="1" w:styleId="CommentTok" w:type="character">
     <w:name w:val="CommentTok"/>
     <w:basedOn w:val="VerbatimChar"/>
     <w:rPr>
@@ -7505,7 +7457,7 @@
       <w:color w:val="60a0b0"/>
     </w:rPr>
   </w:style>
-  <w:style w:type="character" w:customStyle="1" w:styleId="DocumentationTok">
+  <w:style w:customStyle="1" w:styleId="DocumentationTok" w:type="character">
     <w:name w:val="DocumentationTok"/>
     <w:basedOn w:val="VerbatimChar"/>
     <w:rPr>
@@ -7513,7 +7465,7 @@
       <w:color w:val="ba2121"/>
     </w:rPr>
   </w:style>
-  <w:style w:type="character" w:customStyle="1" w:styleId="AnnotationTok">
+  <w:style w:customStyle="1" w:styleId="AnnotationTok" w:type="character">
     <w:name w:val="AnnotationTok"/>
     <w:basedOn w:val="VerbatimChar"/>
     <w:rPr>
@@ -7522,7 +7474,7 @@
       <w:color w:val="60a0b0"/>
     </w:rPr>
   </w:style>
-  <w:style w:type="character" w:customStyle="1" w:styleId="CommentVarTok">
+  <w:style w:customStyle="1" w:styleId="CommentVarTok" w:type="character">
     <w:name w:val="CommentVarTok"/>
     <w:basedOn w:val="VerbatimChar"/>
     <w:rPr>
@@ -7531,28 +7483,28 @@
       <w:color w:val="60a0b0"/>
     </w:rPr>
   </w:style>
-  <w:style w:type="character" w:customStyle="1" w:styleId="OtherTok">
+  <w:style w:customStyle="1" w:styleId="OtherTok" w:type="character">
     <w:name w:val="OtherTok"/>
     <w:basedOn w:val="VerbatimChar"/>
     <w:rPr>
       <w:color w:val="007020"/>
     </w:rPr>
   </w:style>
-  <w:style w:type="character" w:customStyle="1" w:styleId="FunctionTok">
+  <w:style w:customStyle="1" w:styleId="FunctionTok" w:type="character">
     <w:name w:val="FunctionTok"/>
     <w:basedOn w:val="VerbatimChar"/>
     <w:rPr>
       <w:color w:val="06287e"/>
     </w:rPr>
   </w:style>
-  <w:style w:type="character" w:customStyle="1" w:styleId="VariableTok">
+  <w:style w:customStyle="1" w:styleId="VariableTok" w:type="character">
     <w:name w:val="VariableTok"/>
     <w:basedOn w:val="VerbatimChar"/>
     <w:rPr>
       <w:color w:val="19177c"/>
     </w:rPr>
   </w:style>
-  <w:style w:type="character" w:customStyle="1" w:styleId="ControlFlowTok">
+  <w:style w:customStyle="1" w:styleId="ControlFlowTok" w:type="character">
     <w:name w:val="ControlFlowTok"/>
     <w:basedOn w:val="VerbatimChar"/>
     <w:rPr>
@@ -7560,45 +7512,45 @@
       <w:color w:val="007020"/>
     </w:rPr>
   </w:style>
-  <w:style w:type="character" w:customStyle="1" w:styleId="OperatorTok">
+  <w:style w:customStyle="1" w:styleId="OperatorTok" w:type="character">
     <w:name w:val="OperatorTok"/>
     <w:basedOn w:val="VerbatimChar"/>
     <w:rPr>
       <w:color w:val="666666"/>
     </w:rPr>
   </w:style>
-  <w:style w:type="character" w:customStyle="1" w:styleId="BuiltInTok">
+  <w:style w:customStyle="1" w:styleId="BuiltInTok" w:type="character">
     <w:name w:val="BuiltInTok"/>
     <w:basedOn w:val="VerbatimChar"/>
     <w:rPr>
       <w:color w:val="008000"/>
     </w:rPr>
   </w:style>
-  <w:style w:type="character" w:customStyle="1" w:styleId="ExtensionTok">
+  <w:style w:customStyle="1" w:styleId="ExtensionTok" w:type="character">
     <w:name w:val="ExtensionTok"/>
     <w:basedOn w:val="VerbatimChar"/>
     <w:rPr/>
   </w:style>
-  <w:style w:type="character" w:customStyle="1" w:styleId="PreprocessorTok">
+  <w:style w:customStyle="1" w:styleId="PreprocessorTok" w:type="character">
     <w:name w:val="PreprocessorTok"/>
     <w:basedOn w:val="VerbatimChar"/>
     <w:rPr>
       <w:color w:val="bc7a00"/>
     </w:rPr>
   </w:style>
-  <w:style w:type="character" w:customStyle="1" w:styleId="AttributeTok">
+  <w:style w:customStyle="1" w:styleId="AttributeTok" w:type="character">
     <w:name w:val="AttributeTok"/>
     <w:basedOn w:val="VerbatimChar"/>
     <w:rPr>
       <w:color w:val="7d9029"/>
     </w:rPr>
   </w:style>
-  <w:style w:type="character" w:customStyle="1" w:styleId="RegionMarkerTok">
+  <w:style w:customStyle="1" w:styleId="RegionMarkerTok" w:type="character">
     <w:name w:val="RegionMarkerTok"/>
     <w:basedOn w:val="VerbatimChar"/>
     <w:rPr/>
   </w:style>
-  <w:style w:type="character" w:customStyle="1" w:styleId="InformationTok">
+  <w:style w:customStyle="1" w:styleId="InformationTok" w:type="character">
     <w:name w:val="InformationTok"/>
     <w:basedOn w:val="VerbatimChar"/>
     <w:rPr>
@@ -7607,7 +7559,7 @@
       <w:color w:val="60a0b0"/>
     </w:rPr>
   </w:style>
-  <w:style w:type="character" w:customStyle="1" w:styleId="WarningTok">
+  <w:style w:customStyle="1" w:styleId="WarningTok" w:type="character">
     <w:name w:val="WarningTok"/>
     <w:basedOn w:val="VerbatimChar"/>
     <w:rPr>
@@ -7616,7 +7568,7 @@
       <w:color w:val="60a0b0"/>
     </w:rPr>
   </w:style>
-  <w:style w:type="character" w:customStyle="1" w:styleId="AlertTok">
+  <w:style w:customStyle="1" w:styleId="AlertTok" w:type="character">
     <w:name w:val="AlertTok"/>
     <w:basedOn w:val="VerbatimChar"/>
     <w:rPr>
@@ -7624,7 +7576,7 @@
       <w:color w:val="ff0000"/>
     </w:rPr>
   </w:style>
-  <w:style w:type="character" w:customStyle="1" w:styleId="ErrorTok">
+  <w:style w:customStyle="1" w:styleId="ErrorTok" w:type="character">
     <w:name w:val="ErrorTok"/>
     <w:basedOn w:val="VerbatimChar"/>
     <w:rPr>
@@ -7632,7 +7584,7 @@
       <w:color w:val="ff0000"/>
     </w:rPr>
   </w:style>
-  <w:style w:type="character" w:customStyle="1" w:styleId="NormalTok">
+  <w:style w:customStyle="1" w:styleId="NormalTok" w:type="character">
     <w:name w:val="NormalTok"/>
     <w:basedOn w:val="VerbatimChar"/>
     <w:rPr/>

</xml_diff>